<commit_message>
safediv, group_cols in add_cea_results, some_over_week, sum_over_outbreaks_by_runid
</commit_message>
<xml_diff>
--- a/papers/Maintext_cholera_outbreak_modeling_31Oct2025.docx
+++ b/papers/Maintext_cholera_outbreak_modeling_31Oct2025.docx
@@ -2805,7 +2805,6 @@
     <w:p>
       <w:pPr>
         <w:rPr>
-          <w:rFonts w:hint="eastAsia"/>
           <w:lang w:val="en-US"/>
         </w:rPr>
       </w:pPr>
@@ -3049,37 +3048,13 @@
         <w:rPr>
           <w:rFonts w:hint="eastAsia"/>
         </w:rPr>
-        <w:t xml:space="preserve">an </w:t>
-      </w:r>
-      <w:r>
-        <w:t xml:space="preserve">expanded </w:t>
-      </w:r>
-      <w:r>
-        <w:rPr>
-          <w:rFonts w:hint="eastAsia"/>
-        </w:rPr>
-        <w:t xml:space="preserve">dataset derived </w:t>
-      </w:r>
-      <w:r>
-        <w:t>from the existing database</w:t>
-      </w:r>
-      <w:r>
-        <w:rPr>
-          <w:rFonts w:hint="eastAsia"/>
-        </w:rPr>
-        <w:t xml:space="preserve">. This </w:t>
-      </w:r>
-      <w:r>
-        <w:rPr>
-          <w:rFonts w:hint="eastAsia"/>
-        </w:rPr>
-        <w:t>data</w:t>
-      </w:r>
-      <w:r>
-        <w:rPr>
-          <w:rFonts w:hint="eastAsia"/>
-        </w:rPr>
-        <w:t xml:space="preserve"> encompasses </w:t>
+        <w:t>which includes</w:t>
+      </w:r>
+      <w:r>
+        <w:rPr>
+          <w:rFonts w:hint="eastAsia"/>
+        </w:rPr>
+        <w:t xml:space="preserve"> </w:t>
       </w:r>
       <w:r>
         <w:t xml:space="preserve">1,664 outbreaks </w:t>
@@ -3091,16 +3066,37 @@
         <w:rPr>
           <w:rFonts w:hint="eastAsia"/>
         </w:rPr>
-        <w:t xml:space="preserve">in </w:t>
+        <w:t>across</w:t>
+      </w:r>
+      <w:r>
+        <w:rPr>
+          <w:rFonts w:hint="eastAsia"/>
+        </w:rPr>
+        <w:t xml:space="preserve"> </w:t>
       </w:r>
       <w:r>
         <w:t xml:space="preserve">various </w:t>
       </w:r>
       <w:r>
-        <w:t xml:space="preserve">administrative units </w:t>
-      </w:r>
-      <w:r>
-        <w:t>across 30 countries in sub-Saharan Africa from January 2010 to July 2023</w:t>
+        <w:t xml:space="preserve">administrative </w:t>
+      </w:r>
+      <w:r>
+        <w:rPr>
+          <w:rFonts w:hint="eastAsia"/>
+        </w:rPr>
+        <w:t>levels</w:t>
+      </w:r>
+      <w:r>
+        <w:t xml:space="preserve"> </w:t>
+      </w:r>
+      <w:r>
+        <w:rPr>
+          <w:rFonts w:hint="eastAsia"/>
+        </w:rPr>
+        <w:t>in</w:t>
+      </w:r>
+      <w:r>
+        <w:t xml:space="preserve"> 30 countries in sub-Saharan Africa from January 2010 to July 2023</w:t>
       </w:r>
       <w:r>
         <w:t>.</w:t>
@@ -3128,13 +3124,13 @@
         <w:t xml:space="preserve"> Outbreaks were defined by location-specific average weekly incidence thresholds, spanning from the first to the last reported suspected case</w:t>
       </w:r>
       <w:r>
-        <w:t xml:space="preserve">, with </w:t>
-      </w:r>
-      <w:r>
-        <w:rPr>
-          <w:rFonts w:hint="eastAsia"/>
-        </w:rPr>
-        <w:t xml:space="preserve">any </w:t>
+        <w:t>, with</w:t>
+      </w:r>
+      <w:r>
+        <w:rPr>
+          <w:rFonts w:hint="eastAsia"/>
+        </w:rPr>
+        <w:t xml:space="preserve"> </w:t>
       </w:r>
       <w:r>
         <w:t xml:space="preserve">weeks </w:t>
@@ -3143,7 +3139,13 @@
         <w:rPr>
           <w:rFonts w:hint="eastAsia"/>
         </w:rPr>
-        <w:t>lacking data</w:t>
+        <w:t>without</w:t>
+      </w:r>
+      <w:r>
+        <w:rPr>
+          <w:rFonts w:hint="eastAsia"/>
+        </w:rPr>
+        <w:t xml:space="preserve"> data</w:t>
       </w:r>
       <w:r>
         <w:t xml:space="preserve"> assumed to have zero cases</w:t>
@@ -3174,127 +3176,22 @@
         <w:t xml:space="preserve"> </w:t>
       </w:r>
       <w:r>
-        <w:rPr>
-          <w:rFonts w:hint="eastAsia"/>
-        </w:rPr>
-        <w:t>Out of 1,664 outbreaks</w:t>
-      </w:r>
-      <w:r>
-        <w:rPr>
-          <w:rFonts w:hint="eastAsia"/>
-        </w:rPr>
-        <w:t>, w</w:t>
-      </w:r>
-      <w:r>
-        <w:rPr>
-          <w:rFonts w:hint="eastAsia"/>
-        </w:rPr>
-        <w:t xml:space="preserve">e excluded </w:t>
-      </w:r>
-      <w:r>
-        <w:rPr>
-          <w:rFonts w:hint="eastAsia"/>
-        </w:rPr>
-        <w:t>the ones</w:t>
-      </w:r>
-      <w:r>
-        <w:rPr>
-          <w:rFonts w:hint="eastAsia"/>
-        </w:rPr>
-        <w:t xml:space="preserve"> that</w:t>
-      </w:r>
-      <w:r>
-        <w:rPr>
-          <w:rFonts w:hint="eastAsia"/>
-        </w:rPr>
-        <w:t xml:space="preserve"> are not </w:t>
-      </w:r>
-      <w:r>
-        <w:rPr>
-          <w:rFonts w:hint="eastAsia"/>
-        </w:rPr>
-        <w:t>appropriate for modeling the impact of ORI</w:t>
-      </w:r>
-      <w:r>
-        <w:rPr>
-          <w:rFonts w:hint="eastAsia"/>
-        </w:rPr>
-        <w:t>s</w:t>
-      </w:r>
-      <w:r>
-        <w:rPr>
-          <w:rFonts w:hint="eastAsia"/>
-        </w:rPr>
-        <w:t xml:space="preserve">. First, </w:t>
-      </w:r>
-      <w:r>
-        <w:rPr>
-          <w:rFonts w:hint="eastAsia"/>
-        </w:rPr>
-        <w:t xml:space="preserve">to include </w:t>
-      </w:r>
-      <w:r>
-        <w:t xml:space="preserve">outbreaks that </w:t>
-      </w:r>
-      <w:r>
-        <w:rPr>
-          <w:rFonts w:hint="eastAsia"/>
-        </w:rPr>
-        <w:t xml:space="preserve">match </w:t>
-      </w:r>
-      <w:r>
-        <w:t>with historical OCV deployment scales</w:t>
-      </w:r>
-      <w:r>
-        <w:rPr>
-          <w:rFonts w:hint="eastAsia"/>
-        </w:rPr>
-        <w:t xml:space="preserve">, </w:t>
-      </w:r>
-      <w:r>
-        <w:rPr>
-          <w:rFonts w:hint="eastAsia"/>
-        </w:rPr>
-        <w:t xml:space="preserve">we excluded outbreaks reported at the administrative units </w:t>
-      </w:r>
-      <w:r>
-        <w:rPr>
-          <w:rFonts w:hint="eastAsia"/>
-        </w:rPr>
-        <w:t xml:space="preserve">with </w:t>
-      </w:r>
-      <w:r>
-        <w:rPr>
-          <w:rFonts w:hint="eastAsia"/>
-        </w:rPr>
-        <w:t>population size</w:t>
-      </w:r>
-      <w:r>
-        <w:rPr>
-          <w:rFonts w:hint="eastAsia"/>
-        </w:rPr>
-        <w:t xml:space="preserve"> that is</w:t>
-      </w:r>
-      <w:r>
-        <w:t xml:space="preserve"> bigger than the reported maximum doses (5 million doses) </w:t>
-      </w:r>
-      <w:r>
-        <w:rPr>
-          <w:rFonts w:hint="eastAsia"/>
-        </w:rPr>
-        <w:t>or</w:t>
-      </w:r>
-      <w:r>
-        <w:t xml:space="preserve"> smaller th</w:t>
-      </w:r>
-      <w:r>
-        <w:rPr>
-          <w:rFonts w:hint="eastAsia"/>
-        </w:rPr>
-        <w:t>a</w:t>
-      </w:r>
-      <w:r>
-        <w:t>n the minimum doses (16,500 doses) of historic OCV deployment.</w:t>
+        <w:t>To ensure consistency with real-world outbreak response conditions,</w:t>
+      </w:r>
+      <w:r>
+        <w:rPr>
+          <w:rFonts w:hint="eastAsia"/>
+        </w:rPr>
+        <w:t xml:space="preserve"> some outbreaks were excluded. </w:t>
+      </w:r>
+      <w:r>
+        <w:t>We excluded outbreaks reported from administrative units with populations outside the range of historical OCV deployments—specifically, those corresponding to fewer than 16,500 or more than 5 million doses</w:t>
+      </w:r>
+      <w:r>
+        <w:rPr>
+          <w:rFonts w:hint="eastAsia"/>
+        </w:rPr>
+        <w:t>.</w:t>
       </w:r>
       <w:r>
         <w:fldChar w:fldCharType="begin"/>
@@ -3325,121 +3222,89 @@
         <w:rPr>
           <w:rFonts w:hint="eastAsia"/>
         </w:rPr>
-        <w:t xml:space="preserve">Second, when outbreaks were reported across multiple administrative unit levels, we excluded smaller </w:t>
-      </w:r>
-      <w:r>
-        <w:rPr>
-          <w:rFonts w:hint="eastAsia"/>
-        </w:rPr>
-        <w:t xml:space="preserve">nested </w:t>
-      </w:r>
-      <w:r>
-        <w:rPr>
-          <w:rFonts w:hint="eastAsia"/>
-        </w:rPr>
-        <w:t>outbreaks</w:t>
-      </w:r>
-      <w:r>
-        <w:rPr>
-          <w:rFonts w:hint="eastAsia"/>
-        </w:rPr>
-        <w:t xml:space="preserve"> within the largest outbreak</w:t>
-      </w:r>
-      <w:r>
-        <w:rPr>
-          <w:rFonts w:hint="eastAsia"/>
-        </w:rPr>
-        <w:t xml:space="preserve"> while keeping only the largest outbreak</w:t>
-      </w:r>
-      <w:r>
-        <w:rPr>
-          <w:rFonts w:hint="eastAsia"/>
-        </w:rPr>
-        <w:t xml:space="preserve">. Nested outbreaks were </w:t>
-      </w:r>
-      <w:r>
-        <w:rPr>
-          <w:rFonts w:hint="eastAsia"/>
-        </w:rPr>
-        <w:t>defined as those of which start date, end date, case count, and locations are encapsulated by the largest outbreak.</w:t>
-      </w:r>
-      <w:r>
-        <w:rPr>
-          <w:rFonts w:hint="eastAsia"/>
-        </w:rPr>
-        <w:t xml:space="preserve"> For some outbreaks, </w:t>
-      </w:r>
-      <w:r>
-        <w:rPr>
-          <w:rFonts w:hint="eastAsia"/>
-        </w:rPr>
-        <w:t xml:space="preserve">the same or even </w:t>
-      </w:r>
-      <w:r>
-        <w:t>larger</w:t>
-      </w:r>
-      <w:r>
-        <w:rPr>
-          <w:rFonts w:hint="eastAsia"/>
-        </w:rPr>
-        <w:t xml:space="preserve"> number of cases were reported at smaller administrative units,</w:t>
-      </w:r>
-      <w:r>
-        <w:rPr>
-          <w:rFonts w:hint="eastAsia"/>
-        </w:rPr>
-        <w:t xml:space="preserve"> and in these cases,</w:t>
-      </w:r>
-      <w:r>
-        <w:rPr>
-          <w:rFonts w:hint="eastAsia"/>
-        </w:rPr>
-        <w:t xml:space="preserve"> smaller outbreaks were retained while larger outbreaks were excluded. </w:t>
-      </w:r>
-      <w:r>
-        <w:t>Third, we excluded outbreaks that may have already been influenced by OCVs, defined as those where vaccination campaigns occurred within the three years prior to or during the outbreak.</w:t>
-      </w:r>
-      <w:r>
-        <w:rPr>
-          <w:rFonts w:hint="eastAsia"/>
-        </w:rPr>
-        <w:t xml:space="preserve"> </w:t>
-      </w:r>
-      <w:r>
-        <w:rPr>
-          <w:rFonts w:hint="eastAsia"/>
-        </w:rPr>
-        <w:t xml:space="preserve">Finally, we also excluded outbreaks that were reported after 1 </w:t>
-      </w:r>
-      <w:r>
-        <w:t>January</w:t>
-      </w:r>
-      <w:r>
-        <w:rPr>
-          <w:rFonts w:hint="eastAsia"/>
-        </w:rPr>
-        <w:t xml:space="preserve"> 202</w:t>
-      </w:r>
-      <w:r>
-        <w:rPr>
-          <w:rFonts w:hint="eastAsia"/>
-        </w:rPr>
-        <w:t>2</w:t>
-      </w:r>
-      <w:r>
-        <w:rPr>
-          <w:rFonts w:hint="eastAsia"/>
-        </w:rPr>
-        <w:t xml:space="preserve"> for </w:t>
-      </w:r>
-      <w:r>
-        <w:t>which</w:t>
-      </w:r>
-      <w:r>
-        <w:rPr>
-          <w:rFonts w:hint="eastAsia"/>
-        </w:rPr>
-        <w:t xml:space="preserve"> OCV campaign information is not available.</w:t>
+        <w:t xml:space="preserve"> </w:t>
+      </w:r>
+      <w:r>
+        <w:rPr>
+          <w:rFonts w:hint="eastAsia"/>
+        </w:rPr>
+        <w:t>Also, w</w:t>
+      </w:r>
+      <w:r>
+        <w:t>hen outbreaks overlapped across multiple administrative levels, smaller nested outbreaks entirely contained within a larger one were excluded. If a smaller administrative unit reported an equal or greater number of cases, the smaller outbreak was retained and the larger one excluded.</w:t>
+      </w:r>
+      <w:r>
+        <w:rPr>
+          <w:rFonts w:hint="eastAsia"/>
+        </w:rPr>
+        <w:t xml:space="preserve"> In addition, o</w:t>
+      </w:r>
+      <w:r>
+        <w:t xml:space="preserve">utbreaks occurring within three years after an OCV campaign were removed to avoid vaccine-influenced </w:t>
+      </w:r>
+      <w:r>
+        <w:rPr>
+          <w:highlight w:val="yellow"/>
+        </w:rPr>
+        <w:t>estimates</w:t>
+      </w:r>
+      <w:r>
+        <w:rPr>
+          <w:rFonts w:hint="eastAsia"/>
+          <w:highlight w:val="yellow"/>
+        </w:rPr>
+        <w:t xml:space="preserve">, assuming that these outbreaks </w:t>
+      </w:r>
+      <w:r>
+        <w:rPr>
+          <w:highlight w:val="yellow"/>
+        </w:rPr>
+        <w:t>may have already been influenced by OCVs</w:t>
+      </w:r>
+      <w:r>
+        <w:rPr>
+          <w:rFonts w:hint="eastAsia"/>
+          <w:highlight w:val="yellow"/>
+        </w:rPr>
+        <w:t xml:space="preserve"> and therefore do not serve as good controls for counterfactual analyses.</w:t>
+      </w:r>
+      <w:r>
+        <w:rPr>
+          <w:rFonts w:hint="eastAsia"/>
+          <w:highlight w:val="yellow"/>
+        </w:rPr>
+        <w:t xml:space="preserve"> </w:t>
+      </w:r>
+      <w:r>
+        <w:rPr>
+          <w:rFonts w:hint="eastAsia"/>
+          <w:highlight w:val="yellow"/>
+        </w:rPr>
+        <w:t>Finally</w:t>
+      </w:r>
+      <w:r>
+        <w:rPr>
+          <w:rFonts w:hint="eastAsia"/>
+        </w:rPr>
+        <w:t xml:space="preserve">, </w:t>
+      </w:r>
+      <w:r>
+        <w:rPr>
+          <w:rFonts w:hint="eastAsia"/>
+        </w:rPr>
+        <w:t>o</w:t>
+      </w:r>
+      <w:r>
+        <w:t>utbreaks reported after 1 January 202</w:t>
+      </w:r>
+      <w:r>
+        <w:rPr>
+          <w:rFonts w:hint="eastAsia"/>
+        </w:rPr>
+        <w:t>0</w:t>
+      </w:r>
+      <w:r>
+        <w:t xml:space="preserve"> were excluded due to unavailable OCV campaign data.</w:t>
       </w:r>
       <w:r>
         <w:rPr>
@@ -3469,24 +3334,6 @@
         <w:rPr>
           <w:rFonts w:hint="eastAsia"/>
         </w:rPr>
-        <w:t>we</w:t>
-      </w:r>
-      <w:r>
-        <w:rPr>
-          <w:rFonts w:hint="eastAsia"/>
-        </w:rPr>
-        <w:t xml:space="preserve"> evaluated the impact of </w:t>
-      </w:r>
-      <w:r>
-        <w:rPr>
-          <w:rFonts w:hint="eastAsia"/>
-        </w:rPr>
-        <w:t xml:space="preserve">ORIs in </w:t>
-      </w:r>
-      <w:r>
-        <w:rPr>
-          <w:rFonts w:hint="eastAsia"/>
-        </w:rPr>
         <w:t>1,192</w:t>
       </w:r>
       <w:r>
@@ -3499,6 +3346,12 @@
         <w:rPr>
           <w:rFonts w:hint="eastAsia"/>
         </w:rPr>
+        <w:t xml:space="preserve"> were retained for modeling</w:t>
+      </w:r>
+      <w:r>
+        <w:rPr>
+          <w:rFonts w:hint="eastAsia"/>
+        </w:rPr>
         <w:t>.</w:t>
       </w:r>
       <w:r>
@@ -3506,91 +3359,6 @@
           <w:rFonts w:hint="eastAsia"/>
         </w:rPr>
         <w:t xml:space="preserve"> </w:t>
-      </w:r>
-      <w:r>
-        <w:rPr>
-          <w:rFonts w:hint="eastAsia"/>
-        </w:rPr>
-        <w:t>The outcomes were reported as</w:t>
-      </w:r>
-      <w:r>
-        <w:t xml:space="preserve"> cases, deaths, and disability-adjusted life years (DALY</w:t>
-      </w:r>
-      <w:r>
-        <w:rPr>
-          <w:rFonts w:hint="eastAsia"/>
-        </w:rPr>
-        <w:t>s</w:t>
-      </w:r>
-      <w:r>
-        <w:t>)</w:t>
-      </w:r>
-      <w:r>
-        <w:rPr>
-          <w:rFonts w:hint="eastAsia"/>
-        </w:rPr>
-        <w:t xml:space="preserve"> averted, which were</w:t>
-      </w:r>
-      <w:r>
-        <w:rPr>
-          <w:rFonts w:hint="eastAsia"/>
-        </w:rPr>
-        <w:t xml:space="preserve"> also</w:t>
-      </w:r>
-      <w:r>
-        <w:rPr>
-          <w:rFonts w:hint="eastAsia"/>
-        </w:rPr>
-        <w:t xml:space="preserve"> converted to </w:t>
-      </w:r>
-      <w:r>
-        <w:t>vaccination campaign efficiency</w:t>
-      </w:r>
-      <w:r>
-        <w:rPr>
-          <w:rFonts w:hint="eastAsia"/>
-        </w:rPr>
-        <w:t xml:space="preserve"> metrics (e.g., cases,</w:t>
-      </w:r>
-      <w:r>
-        <w:t xml:space="preserve"> </w:t>
-      </w:r>
-      <w:r>
-        <w:lastRenderedPageBreak/>
-        <w:t xml:space="preserve">deaths, </w:t>
-      </w:r>
-      <w:r>
-        <w:rPr>
-          <w:rFonts w:hint="eastAsia"/>
-        </w:rPr>
-        <w:t>and</w:t>
-      </w:r>
-      <w:r>
-        <w:t xml:space="preserve"> DALYs averted per 1,000 OCVs</w:t>
-      </w:r>
-      <w:r>
-        <w:rPr>
-          <w:rFonts w:hint="eastAsia"/>
-        </w:rPr>
-        <w:t>)</w:t>
-      </w:r>
-      <w:r>
-        <w:t xml:space="preserve"> and cost-effectiveness</w:t>
-      </w:r>
-      <w:r>
-        <w:rPr>
-          <w:rFonts w:hint="eastAsia"/>
-        </w:rPr>
-        <w:t xml:space="preserve"> metrics (e.g., </w:t>
-      </w:r>
-      <w:r>
-        <w:t>cost per case, death, or DALY averted</w:t>
-      </w:r>
-      <w:r>
-        <w:rPr>
-          <w:rFonts w:hint="eastAsia"/>
-        </w:rPr>
-        <w:t xml:space="preserve">) </w:t>
       </w:r>
       <w:r>
         <w:rPr>
@@ -3615,6 +3383,121 @@
       <w:r>
         <w:t>.</w:t>
       </w:r>
+    </w:p>
+    <w:p/>
+    <w:p>
+      <w:r>
+        <w:rPr>
+          <w:rFonts w:hint="eastAsia"/>
+          <w:highlight w:val="yellow"/>
+        </w:rPr>
+        <w:t>The outcomes were reported as</w:t>
+      </w:r>
+      <w:r>
+        <w:rPr>
+          <w:highlight w:val="yellow"/>
+        </w:rPr>
+        <w:t xml:space="preserve"> cases, deaths, and disability-adjusted life years (DALY</w:t>
+      </w:r>
+      <w:r>
+        <w:rPr>
+          <w:rFonts w:hint="eastAsia"/>
+          <w:highlight w:val="yellow"/>
+        </w:rPr>
+        <w:t>s</w:t>
+      </w:r>
+      <w:r>
+        <w:rPr>
+          <w:highlight w:val="yellow"/>
+        </w:rPr>
+        <w:t>)</w:t>
+      </w:r>
+      <w:r>
+        <w:rPr>
+          <w:rFonts w:hint="eastAsia"/>
+          <w:highlight w:val="yellow"/>
+        </w:rPr>
+        <w:t xml:space="preserve"> averted, which were</w:t>
+      </w:r>
+      <w:r>
+        <w:rPr>
+          <w:rFonts w:hint="eastAsia"/>
+          <w:highlight w:val="yellow"/>
+        </w:rPr>
+        <w:t xml:space="preserve"> also</w:t>
+      </w:r>
+      <w:r>
+        <w:rPr>
+          <w:rFonts w:hint="eastAsia"/>
+          <w:highlight w:val="yellow"/>
+        </w:rPr>
+        <w:t xml:space="preserve"> converted to </w:t>
+      </w:r>
+      <w:r>
+        <w:rPr>
+          <w:highlight w:val="yellow"/>
+        </w:rPr>
+        <w:t>vaccination campaign efficiency</w:t>
+      </w:r>
+      <w:r>
+        <w:rPr>
+          <w:rFonts w:hint="eastAsia"/>
+          <w:highlight w:val="yellow"/>
+        </w:rPr>
+        <w:t xml:space="preserve"> metrics (e.g., cases,</w:t>
+      </w:r>
+      <w:r>
+        <w:rPr>
+          <w:highlight w:val="yellow"/>
+        </w:rPr>
+        <w:t xml:space="preserve"> deaths, </w:t>
+      </w:r>
+      <w:r>
+        <w:rPr>
+          <w:rFonts w:hint="eastAsia"/>
+          <w:highlight w:val="yellow"/>
+        </w:rPr>
+        <w:t>and</w:t>
+      </w:r>
+      <w:r>
+        <w:rPr>
+          <w:highlight w:val="yellow"/>
+        </w:rPr>
+        <w:t xml:space="preserve"> DALYs averted per 1,000 OCVs</w:t>
+      </w:r>
+      <w:r>
+        <w:rPr>
+          <w:rFonts w:hint="eastAsia"/>
+          <w:highlight w:val="yellow"/>
+        </w:rPr>
+        <w:t>)</w:t>
+      </w:r>
+      <w:r>
+        <w:rPr>
+          <w:highlight w:val="yellow"/>
+        </w:rPr>
+        <w:t xml:space="preserve"> and cost-effectiveness</w:t>
+      </w:r>
+      <w:r>
+        <w:rPr>
+          <w:rFonts w:hint="eastAsia"/>
+          <w:highlight w:val="yellow"/>
+        </w:rPr>
+        <w:t xml:space="preserve"> metrics (e.g., </w:t>
+      </w:r>
+      <w:r>
+        <w:rPr>
+          <w:highlight w:val="yellow"/>
+        </w:rPr>
+        <w:t>cost per case, death, or DALY averted</w:t>
+      </w:r>
+      <w:r>
+        <w:rPr>
+          <w:rFonts w:hint="eastAsia"/>
+          <w:highlight w:val="yellow"/>
+        </w:rPr>
+        <w:t>)</w:t>
+      </w:r>
       <w:r>
         <w:rPr>
           <w:rFonts w:hint="eastAsia"/>
@@ -3628,6 +3511,7 @@
       </w:pPr>
       <w:bookmarkStart w:id="16" w:name="_Toc184909201"/>
       <w:r>
+        <w:lastRenderedPageBreak/>
         <w:t xml:space="preserve">Modeling the </w:t>
       </w:r>
       <w:r>
@@ -3643,7 +3527,13 @@
         <w:rPr>
           <w:rFonts w:hint="eastAsia"/>
         </w:rPr>
-        <w:t>Our model simulated</w:t>
+        <w:t>We si</w:t>
+      </w:r>
+      <w:r>
+        <w:rPr>
+          <w:rFonts w:hint="eastAsia"/>
+        </w:rPr>
+        <w:t>mulated</w:t>
       </w:r>
       <w:r>
         <w:rPr>
@@ -3661,28 +3551,49 @@
         <w:t>ase counts under counterfactual vaccination scenarios</w:t>
       </w:r>
       <w:r>
-        <w:rPr>
-          <w:rFonts w:hint="eastAsia"/>
-        </w:rPr>
-        <w:t xml:space="preserve"> in which all conditions are the same except for the presence of vaccination</w:t>
-      </w:r>
-      <w:r>
-        <w:rPr>
-          <w:rFonts w:hint="eastAsia"/>
-        </w:rPr>
-        <w:t xml:space="preserve"> campaigns</w:t>
-      </w:r>
-      <w:r>
-        <w:rPr>
-          <w:rFonts w:hint="eastAsia"/>
-        </w:rPr>
-        <w:t xml:space="preserve">. The impact of ORIs </w:t>
-      </w:r>
-      <w:r>
-        <w:rPr>
-          <w:rFonts w:hint="eastAsia"/>
-        </w:rPr>
-        <w:t xml:space="preserve">is based on </w:t>
+        <w:t>—</w:t>
+      </w:r>
+      <w:r>
+        <w:rPr>
+          <w:rFonts w:hint="eastAsia"/>
+        </w:rPr>
+        <w:t>identical in all respects</w:t>
+      </w:r>
+      <w:r>
+        <w:rPr>
+          <w:rFonts w:hint="eastAsia"/>
+        </w:rPr>
+        <w:t xml:space="preserve"> except for the </w:t>
+      </w:r>
+      <w:r>
+        <w:rPr>
+          <w:rFonts w:hint="eastAsia"/>
+        </w:rPr>
+        <w:t>implementation of ORIs.</w:t>
+      </w:r>
+      <w:r>
+        <w:rPr>
+          <w:rFonts w:hint="eastAsia"/>
+        </w:rPr>
+        <w:t xml:space="preserve"> The impact of ORIs </w:t>
+      </w:r>
+      <w:r>
+        <w:rPr>
+          <w:rFonts w:hint="eastAsia"/>
+        </w:rPr>
+        <w:t>was</w:t>
+      </w:r>
+      <w:r>
+        <w:rPr>
+          <w:rFonts w:hint="eastAsia"/>
+        </w:rPr>
+        <w:t xml:space="preserve"> based on </w:t>
+      </w:r>
+      <w:r>
+        <w:rPr>
+          <w:rFonts w:hint="eastAsia"/>
+        </w:rPr>
+        <w:t xml:space="preserve">the number of </w:t>
       </w:r>
       <w:r>
         <w:t>cases averted</w:t>
@@ -3704,12 +3615,6 @@
           <w:rFonts w:hint="eastAsia"/>
         </w:rPr>
         <w:t>(</w:t>
-      </w:r>
-      <w:r>
-        <w:rPr>
-          <w:rFonts w:hint="eastAsia"/>
-        </w:rPr>
-        <w:t>Top panel in</w:t>
       </w:r>
       <w:r>
         <w:rPr>
@@ -3717,6 +3622,12 @@
           <w:b/>
           <w:bCs/>
         </w:rPr>
+        <w:t>Figure</w:t>
+      </w:r>
+      <w:r>
+        <w:rPr>
+          <w:rFonts w:hint="eastAsia"/>
+        </w:rPr>
         <w:t xml:space="preserve"> </w:t>
       </w:r>
       <w:r>
@@ -3725,13 +3636,134 @@
           <w:b/>
           <w:bCs/>
         </w:rPr>
-        <w:t>Figure</w:t>
-      </w:r>
-      <w:r>
-        <w:rPr>
-          <w:rFonts w:hint="eastAsia"/>
-        </w:rPr>
-        <w:t xml:space="preserve"> </w:t>
+        <w:t>1B</w:t>
+      </w:r>
+      <w:r>
+        <w:rPr>
+          <w:rFonts w:hint="eastAsia"/>
+        </w:rPr>
+        <w:t>, top panel</w:t>
+      </w:r>
+      <w:r>
+        <w:rPr>
+          <w:rFonts w:hint="eastAsia"/>
+        </w:rPr>
+        <w:t>)</w:t>
+      </w:r>
+      <w:r>
+        <w:t>.</w:t>
+      </w:r>
+      <w:r>
+        <w:rPr>
+          <w:rFonts w:hint="eastAsia"/>
+        </w:rPr>
+        <w:t xml:space="preserve"> </w:t>
+      </w:r>
+      <w:r>
+        <w:t>Because ORIs can only occur if outbreaks are still ongoing, we assumed no campaign would be initiated if two or more weeks had passed since the outbreak ended, consistent with the outbreak definition</w:t>
+      </w:r>
+      <w:r>
+        <w:fldChar w:fldCharType="begin"/>
+      </w:r>
+      <w:r>
+        <w:instrText xml:space="preserve"> ADDIN ZOTERO_ITEM CSL_CITATION {"citationID":"l3TCsMVu","properties":{"formattedCitation":"\\super 35\\nosupersub{}","plainCitation":"35","noteIndex":0},"citationItems":[{"id":15756,"uris":["http://zotero.org/users/7663102/items/Q9CPQPJC"],"itemData":{"id":15756,"type":"webpage","title":"Cholera surveillance time series in Africa between 2010 ... | VeriXiv","URL":"https://verixiv.org/articles/2-116","accessed":{"date-parts":[["2025",7,9]]},"citation-key":"zotero-item-15756"}}],"schema":"https://github.com/citation-style-language/schema/raw/master/csl-citation.json"} </w:instrText>
+      </w:r>
+      <w:r>
+        <w:fldChar w:fldCharType="separate"/>
+      </w:r>
+      <w:r>
+        <w:rPr>
+          <w:rFonts w:cs="Times New Roman"/>
+          <w:vertAlign w:val="superscript"/>
+        </w:rPr>
+        <w:t>35</w:t>
+      </w:r>
+      <w:r>
+        <w:fldChar w:fldCharType="end"/>
+      </w:r>
+      <w:r>
+        <w:rPr>
+          <w:rFonts w:hint="eastAsia"/>
+        </w:rPr>
+        <w:t xml:space="preserve"> and </w:t>
+      </w:r>
+      <w:r>
+        <w:t>validated in sensitivity analyses</w:t>
+      </w:r>
+      <w:r>
+        <w:rPr>
+          <w:rFonts w:hint="eastAsia"/>
+        </w:rPr>
+        <w:t>. O</w:t>
+      </w:r>
+      <w:r>
+        <w:rPr>
+          <w:rFonts w:hint="eastAsia"/>
+        </w:rPr>
+        <w:t>RIs</w:t>
+      </w:r>
+      <w:r>
+        <w:rPr>
+          <w:rFonts w:hint="eastAsia"/>
+        </w:rPr>
+        <w:t xml:space="preserve"> </w:t>
+      </w:r>
+      <w:r>
+        <w:t>begin</w:t>
+      </w:r>
+      <w:r>
+        <w:t>ning</w:t>
+      </w:r>
+      <w:r>
+        <w:rPr>
+          <w:rFonts w:hint="eastAsia"/>
+        </w:rPr>
+        <w:t xml:space="preserve"> before outbreak </w:t>
+      </w:r>
+      <w:r>
+        <w:rPr>
+          <w:rFonts w:hint="eastAsia"/>
+        </w:rPr>
+        <w:t xml:space="preserve">resolution may still </w:t>
+      </w:r>
+      <w:r>
+        <w:rPr>
+          <w:rFonts w:hint="eastAsia"/>
+        </w:rPr>
+        <w:t>produce no</w:t>
+      </w:r>
+      <w:r>
+        <w:rPr>
+          <w:rFonts w:hint="eastAsia"/>
+        </w:rPr>
+        <w:t xml:space="preserve"> impact </w:t>
+      </w:r>
+      <w:r>
+        <w:rPr>
+          <w:rFonts w:hint="eastAsia"/>
+        </w:rPr>
+        <w:t xml:space="preserve">due to the time </w:t>
+      </w:r>
+      <w:r>
+        <w:t xml:space="preserve">required for implementation and vaccine-derived immunity to </w:t>
+      </w:r>
+      <w:r>
+        <w:rPr>
+          <w:rFonts w:hint="eastAsia"/>
+        </w:rPr>
+        <w:t>develop</w:t>
+      </w:r>
+      <w:r>
+        <w:rPr>
+          <w:rFonts w:hint="eastAsia"/>
+        </w:rPr>
+        <w:t xml:space="preserve"> </w:t>
+      </w:r>
+      <w:r>
+        <w:rPr>
+          <w:rFonts w:hint="eastAsia"/>
+        </w:rPr>
+        <w:t>(</w:t>
       </w:r>
       <w:r>
         <w:rPr>
@@ -3739,140 +3771,13 @@
           <w:b/>
           <w:bCs/>
         </w:rPr>
-        <w:t>1B</w:t>
-      </w:r>
-      <w:r>
-        <w:rPr>
-          <w:rFonts w:hint="eastAsia"/>
-        </w:rPr>
-        <w:t>)</w:t>
-      </w:r>
-      <w:r>
-        <w:t>.</w:t>
-      </w:r>
-      <w:r>
-        <w:rPr>
-          <w:rFonts w:hint="eastAsia"/>
-        </w:rPr>
-        <w:t xml:space="preserve"> </w:t>
-      </w:r>
-      <w:r>
-        <w:t>Outbreak response immunizations (ORIs) may not occur if an outbreak ends before vaccination can be initiated. In this analysis, we assumed that ORIs would not be implemented if two or more weeks had elapsed since the outbreak ended, an assumption partially derived from the outbreak definition itself.</w:t>
-      </w:r>
-      <w:r>
-        <w:fldChar w:fldCharType="begin"/>
-      </w:r>
-      <w:r>
-        <w:instrText xml:space="preserve"> ADDIN ZOTERO_ITEM CSL_CITATION {"citationID":"l3TCsMVu","properties":{"formattedCitation":"\\super 35\\nosupersub{}","plainCitation":"35","noteIndex":0},"citationItems":[{"id":15756,"uris":["http://zotero.org/users/7663102/items/Q9CPQPJC"],"itemData":{"id":15756,"type":"webpage","title":"Cholera surveillance time series in Africa between 2010 ... | VeriXiv","URL":"https://verixiv.org/articles/2-116","accessed":{"date-parts":[["2025",7,9]]},"citation-key":"zotero-item-15756"}}],"schema":"https://github.com/citation-style-language/schema/raw/master/csl-citation.json"} </w:instrText>
-      </w:r>
-      <w:r>
-        <w:fldChar w:fldCharType="separate"/>
-      </w:r>
-      <w:r>
-        <w:rPr>
-          <w:rFonts w:cs="Times New Roman"/>
-          <w:vertAlign w:val="superscript"/>
-        </w:rPr>
-        <w:t>35</w:t>
-      </w:r>
-      <w:r>
-        <w:fldChar w:fldCharType="end"/>
-      </w:r>
-      <w:r>
-        <w:t xml:space="preserve"> The sensitivity of this assumption was subsequently assessed.</w:t>
-      </w:r>
-      <w:r>
-        <w:rPr>
-          <w:rFonts w:hint="eastAsia"/>
-        </w:rPr>
-        <w:t xml:space="preserve"> </w:t>
-      </w:r>
-      <w:r>
-        <w:rPr>
-          <w:rFonts w:hint="eastAsia"/>
-        </w:rPr>
-        <w:t xml:space="preserve">ORIs </w:t>
-      </w:r>
-      <w:r>
-        <w:rPr>
-          <w:rFonts w:hint="eastAsia"/>
-        </w:rPr>
-        <w:t>m</w:t>
-      </w:r>
-      <w:r>
-        <w:rPr>
-          <w:rFonts w:hint="eastAsia"/>
-        </w:rPr>
-        <w:t>ay</w:t>
-      </w:r>
-      <w:r>
-        <w:rPr>
-          <w:rFonts w:hint="eastAsia"/>
-        </w:rPr>
-        <w:t xml:space="preserve"> </w:t>
-      </w:r>
-      <w:r>
-        <w:rPr>
-          <w:rFonts w:hint="eastAsia"/>
-        </w:rPr>
-        <w:t>begin</w:t>
-      </w:r>
-      <w:r>
-        <w:rPr>
-          <w:rFonts w:hint="eastAsia"/>
-        </w:rPr>
-        <w:t xml:space="preserve"> before the outbreak ended</w:t>
-      </w:r>
-      <w:r>
-        <w:rPr>
-          <w:rFonts w:hint="eastAsia"/>
-        </w:rPr>
-        <w:t>, ye</w:t>
-      </w:r>
-      <w:r>
-        <w:rPr>
-          <w:rFonts w:hint="eastAsia"/>
-        </w:rPr>
-        <w:t>t</w:t>
-      </w:r>
-      <w:r>
-        <w:rPr>
-          <w:rFonts w:hint="eastAsia"/>
-        </w:rPr>
-        <w:t xml:space="preserve"> </w:t>
-      </w:r>
-      <w:r>
-        <w:rPr>
-          <w:rFonts w:hint="eastAsia"/>
-        </w:rPr>
-        <w:t>produce no</w:t>
-      </w:r>
-      <w:r>
-        <w:rPr>
-          <w:rFonts w:hint="eastAsia"/>
-        </w:rPr>
-        <w:t xml:space="preserve"> impact </w:t>
-      </w:r>
-      <w:r>
-        <w:rPr>
-          <w:rFonts w:hint="eastAsia"/>
-        </w:rPr>
-        <w:t xml:space="preserve">due to the time </w:t>
-      </w:r>
-      <w:r>
-        <w:t>required for implementation and the delay in conferring vaccine-derived immunity to recipients</w:t>
-      </w:r>
-      <w:r>
-        <w:rPr>
-          <w:rFonts w:hint="eastAsia"/>
-        </w:rPr>
-        <w:t xml:space="preserve"> </w:t>
-      </w:r>
-      <w:r>
-        <w:rPr>
-          <w:rFonts w:hint="eastAsia"/>
-        </w:rPr>
-        <w:t>(Second panel in</w:t>
+        <w:t>Figure</w:t>
+      </w:r>
+      <w:r>
+        <w:rPr>
+          <w:rFonts w:hint="eastAsia"/>
+        </w:rPr>
+        <w:t xml:space="preserve"> </w:t>
       </w:r>
       <w:r>
         <w:rPr>
@@ -3880,13 +3785,49 @@
           <w:b/>
           <w:bCs/>
         </w:rPr>
-        <w:t xml:space="preserve"> Figure</w:t>
-      </w:r>
-      <w:r>
-        <w:rPr>
-          <w:rFonts w:hint="eastAsia"/>
-        </w:rPr>
-        <w:t xml:space="preserve"> </w:t>
+        <w:t>1B</w:t>
+      </w:r>
+      <w:r>
+        <w:rPr>
+          <w:rFonts w:hint="eastAsia"/>
+        </w:rPr>
+        <w:t>, s</w:t>
+      </w:r>
+      <w:r>
+        <w:rPr>
+          <w:rFonts w:hint="eastAsia"/>
+        </w:rPr>
+        <w:t>econd panel)</w:t>
+      </w:r>
+      <w:r>
+        <w:rPr>
+          <w:rFonts w:hint="eastAsia"/>
+        </w:rPr>
+        <w:t xml:space="preserve">. </w:t>
+      </w:r>
+      <w:r>
+        <w:rPr>
+          <w:rFonts w:hint="eastAsia"/>
+        </w:rPr>
+        <w:t>T</w:t>
+      </w:r>
+      <w:r>
+        <w:rPr>
+          <w:rFonts w:hint="eastAsia"/>
+        </w:rPr>
+        <w:t>he impact of ORIs tends to be larger for a larger outbreak (</w:t>
+      </w:r>
+      <w:r>
+        <w:rPr>
+          <w:rFonts w:hint="eastAsia"/>
+        </w:rPr>
+        <w:t>third</w:t>
+      </w:r>
+      <w:r>
+        <w:rPr>
+          <w:rFonts w:hint="eastAsia"/>
+        </w:rPr>
+        <w:t xml:space="preserve"> panel of </w:t>
       </w:r>
       <w:r>
         <w:rPr>
@@ -3894,73 +3835,7 @@
           <w:b/>
           <w:bCs/>
         </w:rPr>
-        <w:t>1B</w:t>
-      </w:r>
-      <w:r>
-        <w:rPr>
-          <w:rFonts w:hint="eastAsia"/>
-        </w:rPr>
-        <w:t>)</w:t>
-      </w:r>
-      <w:r>
-        <w:rPr>
-          <w:rFonts w:hint="eastAsia"/>
-        </w:rPr>
-        <w:t xml:space="preserve">. </w:t>
-      </w:r>
-      <w:r>
-        <w:rPr>
-          <w:rFonts w:hint="eastAsia"/>
-        </w:rPr>
-        <w:t xml:space="preserve">The impact of ORI </w:t>
-      </w:r>
-      <w:r>
-        <w:rPr>
-          <w:rFonts w:hint="eastAsia"/>
-        </w:rPr>
-        <w:t>can</w:t>
-      </w:r>
-      <w:r>
-        <w:rPr>
-          <w:rFonts w:hint="eastAsia"/>
-        </w:rPr>
-        <w:t xml:space="preserve"> be </w:t>
-      </w:r>
-      <w:r>
-        <w:rPr>
-          <w:rFonts w:hint="eastAsia"/>
-        </w:rPr>
-        <w:t xml:space="preserve">evaluated </w:t>
-      </w:r>
-      <w:r>
-        <w:rPr>
-          <w:rFonts w:hint="eastAsia"/>
-        </w:rPr>
-        <w:t xml:space="preserve">at the individual outbreak level and collectively across multiple outbreaks. </w:t>
-      </w:r>
-      <w:r>
-        <w:rPr>
-          <w:rFonts w:hint="eastAsia"/>
-        </w:rPr>
-        <w:t>T</w:t>
-      </w:r>
-      <w:r>
-        <w:rPr>
-          <w:rFonts w:hint="eastAsia"/>
-        </w:rPr>
-        <w:t>he impact of ORIs tends to be larger for a larger outbreak (</w:t>
-      </w:r>
-      <w:r>
-        <w:rPr>
-          <w:rFonts w:hint="eastAsia"/>
-        </w:rPr>
-        <w:t>third</w:t>
-      </w:r>
-      <w:r>
-        <w:rPr>
-          <w:rFonts w:hint="eastAsia"/>
-        </w:rPr>
-        <w:t xml:space="preserve"> panel of </w:t>
+        <w:t>Figure 1B</w:t>
       </w:r>
       <w:r>
         <w:rPr>
@@ -3968,7 +3843,49 @@
           <w:b/>
           <w:bCs/>
         </w:rPr>
-        <w:t>Figure 1B</w:t>
+        <w:t>)</w:t>
+      </w:r>
+      <w:r>
+        <w:rPr>
+          <w:rFonts w:hint="eastAsia"/>
+        </w:rPr>
+        <w:t xml:space="preserve"> and th</w:t>
+      </w:r>
+      <w:r>
+        <w:rPr>
+          <w:rFonts w:hint="eastAsia"/>
+        </w:rPr>
+        <w:t>e overall impact across multiple heterogeneous outbreaks tends to be larger</w:t>
+      </w:r>
+      <w:r>
+        <w:rPr>
+          <w:rFonts w:hint="eastAsia"/>
+        </w:rPr>
+        <w:t xml:space="preserve"> than the simple average,</w:t>
+      </w:r>
+      <w:r>
+        <w:rPr>
+          <w:rFonts w:hint="eastAsia"/>
+        </w:rPr>
+        <w:t xml:space="preserve"> </w:t>
+      </w:r>
+      <w:r>
+        <w:rPr>
+          <w:rFonts w:hint="eastAsia"/>
+        </w:rPr>
+        <w:t xml:space="preserve">as larger outbreaks contribute disproportionately to the overall impact </w:t>
+      </w:r>
+      <w:r>
+        <w:rPr>
+          <w:rFonts w:hint="eastAsia"/>
+        </w:rPr>
+        <w:t>(</w:t>
+      </w:r>
+      <w:r>
+        <w:rPr>
+          <w:rFonts w:hint="eastAsia"/>
+        </w:rPr>
+        <w:t xml:space="preserve">fourth panel in </w:t>
       </w:r>
       <w:r>
         <w:rPr>
@@ -3976,60 +3893,13 @@
           <w:b/>
           <w:bCs/>
         </w:rPr>
-        <w:t>)</w:t>
-      </w:r>
-      <w:r>
-        <w:rPr>
-          <w:rFonts w:hint="eastAsia"/>
-        </w:rPr>
-        <w:t xml:space="preserve"> and therefore th</w:t>
-      </w:r>
-      <w:r>
-        <w:rPr>
-          <w:rFonts w:hint="eastAsia"/>
-        </w:rPr>
-        <w:t xml:space="preserve">e overall impact across multiple heterogeneous outbreaks tends to be larger when it </w:t>
-      </w:r>
-      <w:r>
-        <w:t>is</w:t>
-      </w:r>
-      <w:r>
-        <w:rPr>
-          <w:rFonts w:hint="eastAsia"/>
-        </w:rPr>
-        <w:t xml:space="preserve"> weighted by the number of cases compared to the unweighted average </w:t>
-      </w:r>
-      <w:r>
-        <w:rPr>
-          <w:rFonts w:hint="eastAsia"/>
-        </w:rPr>
-        <w:t>across</w:t>
-      </w:r>
-      <w:r>
-        <w:rPr>
-          <w:rFonts w:hint="eastAsia"/>
-        </w:rPr>
-        <w:t xml:space="preserve"> individual-level impacts (</w:t>
-      </w:r>
-      <w:r>
-        <w:rPr>
-          <w:rFonts w:hint="eastAsia"/>
-        </w:rPr>
-        <w:t xml:space="preserve">fourth panels in </w:t>
-      </w:r>
-      <w:r>
-        <w:rPr>
-          <w:rFonts w:hint="eastAsia"/>
-          <w:b/>
-          <w:bCs/>
-        </w:rPr>
         <w:t>Figure 1B</w:t>
       </w:r>
       <w:r>
         <w:rPr>
           <w:rFonts w:hint="eastAsia"/>
         </w:rPr>
-        <w:t xml:space="preserve">). </w:t>
+        <w:t>).</w:t>
       </w:r>
     </w:p>
     <w:p/>
@@ -4038,16 +3908,25 @@
         <w:rPr>
           <w:rFonts w:hint="eastAsia"/>
         </w:rPr>
-        <w:t xml:space="preserve">To make the predicted impact more realistic, our model accounts for direct and indirect effects of OCV </w:t>
-      </w:r>
-      <w:r>
-        <w:t>(</w:t>
-      </w:r>
-      <w:r>
-        <w:rPr>
-          <w:rFonts w:hint="eastAsia"/>
-        </w:rPr>
-        <w:t>overall effectiveness</w:t>
+        <w:t>The</w:t>
+      </w:r>
+      <w:r>
+        <w:rPr>
+          <w:rFonts w:hint="eastAsia"/>
+        </w:rPr>
+        <w:t xml:space="preserve"> model </w:t>
+      </w:r>
+      <w:r>
+        <w:rPr>
+          <w:rFonts w:hint="eastAsia"/>
+        </w:rPr>
+        <w:t xml:space="preserve">captures both </w:t>
+      </w:r>
+      <w:r>
+        <w:rPr>
+          <w:rFonts w:hint="eastAsia"/>
+        </w:rPr>
+        <w:t>direct and indirect effects of OCV</w:t>
       </w:r>
       <w:r>
         <w:fldChar w:fldCharType="begin"/>
@@ -4072,10 +3951,10 @@
         <w:rPr>
           <w:rFonts w:hint="eastAsia"/>
         </w:rPr>
-        <w:t>; s</w:t>
-      </w:r>
-      <w:r>
-        <w:t xml:space="preserve">ee Supplementary Information </w:t>
+        <w:t xml:space="preserve"> (</w:t>
+      </w:r>
+      <w:r>
+        <w:t xml:space="preserve">Supplementary Information </w:t>
       </w:r>
       <w:r>
         <w:rPr>
@@ -4091,7 +3970,40 @@
         <w:rPr>
           <w:rFonts w:hint="eastAsia"/>
         </w:rPr>
-        <w:t xml:space="preserve"> in the target population</w:t>
+        <w:t xml:space="preserve"> and incorporates</w:t>
+      </w:r>
+      <w:r>
+        <w:rPr>
+          <w:rFonts w:hint="eastAsia"/>
+        </w:rPr>
+        <w:t xml:space="preserve"> </w:t>
+      </w:r>
+      <w:r>
+        <w:t xml:space="preserve">age-specific vaccine </w:t>
+      </w:r>
+      <w:r>
+        <w:rPr>
+          <w:rFonts w:hint="eastAsia"/>
+        </w:rPr>
+        <w:t>efficacy</w:t>
+      </w:r>
+      <w:r>
+        <w:rPr>
+          <w:rFonts w:hint="eastAsia"/>
+        </w:rPr>
+        <w:t xml:space="preserve"> (&lt; 5 and 5+ yo), delays in</w:t>
+      </w:r>
+      <w:r>
+        <w:t xml:space="preserve"> </w:t>
+      </w:r>
+      <w:r>
+        <w:rPr>
+          <w:rFonts w:hint="eastAsia"/>
+        </w:rPr>
+        <w:t xml:space="preserve">ORI </w:t>
+      </w:r>
+      <w:r>
+        <w:t>implementation</w:t>
       </w:r>
       <w:r>
         <w:rPr>
@@ -4100,31 +4012,22 @@
         <w:t xml:space="preserve">, </w:t>
       </w:r>
       <w:r>
-        <w:t xml:space="preserve">age-specific vaccine </w:t>
-      </w:r>
-      <w:r>
-        <w:rPr>
-          <w:rFonts w:hint="eastAsia"/>
-        </w:rPr>
-        <w:t>effectiveness (&lt; 5 and 5+ yo), delays in</w:t>
-      </w:r>
-      <w:r>
-        <w:t xml:space="preserve"> vaccine deployment</w:t>
-      </w:r>
-      <w:r>
-        <w:rPr>
-          <w:rFonts w:hint="eastAsia"/>
-        </w:rPr>
-        <w:t xml:space="preserve"> and administration</w:t>
-      </w:r>
-      <w:r>
-        <w:t>,</w:t>
-      </w:r>
-      <w:r>
-        <w:rPr>
-          <w:rFonts w:hint="eastAsia"/>
-        </w:rPr>
-        <w:t xml:space="preserve"> and the delays in the vaccine-induced immunity </w:t>
+        <w:rPr>
+          <w:rFonts w:hint="eastAsia"/>
+        </w:rPr>
+        <w:t>and the delays in the vaccine-</w:t>
+      </w:r>
+      <w:r>
+        <w:rPr>
+          <w:rFonts w:hint="eastAsia"/>
+        </w:rPr>
+        <w:t>derived</w:t>
+      </w:r>
+      <w:r>
+        <w:rPr>
+          <w:rFonts w:hint="eastAsia"/>
+        </w:rPr>
+        <w:t xml:space="preserve"> immunity </w:t>
       </w:r>
       <w:r>
         <w:t>(</w:t>
@@ -4219,12 +4122,6 @@
       </w:r>
       <w:r>
         <w:t xml:space="preserve">ven vaccine coverage </w:t>
-      </w:r>
-      <w:r>
-        <w:rPr>
-          <w:rFonts w:hint="eastAsia"/>
-        </w:rPr>
-        <w:t xml:space="preserve">proportion </w:t>
       </w:r>
       <m:oMath>
         <m:r>
@@ -4238,13 +4135,16 @@
         <w:t xml:space="preserve"> </w:t>
       </w:r>
       <w:r>
-        <w:t xml:space="preserve">was calculated </w:t>
-      </w:r>
-      <w:r>
         <w:t xml:space="preserve">for </w:t>
       </w:r>
       <w:r>
-        <w:t>two age groups</w:t>
+        <w:rPr>
+          <w:rFonts w:hint="eastAsia"/>
+        </w:rPr>
+        <w:t>each</w:t>
+      </w:r>
+      <w:r>
+        <w:t xml:space="preserve"> age group</w:t>
       </w:r>
       <w:r>
         <w:t>—</w:t>
@@ -4287,7 +4187,16 @@
         <w:t xml:space="preserve">individuals </w:t>
       </w:r>
       <w:r>
-        <w:t>aged five and older</w:t>
+        <w:t xml:space="preserve">aged five </w:t>
+      </w:r>
+      <w:r>
+        <w:rPr>
+          <w:rFonts w:hint="eastAsia"/>
+        </w:rPr>
+        <w:t>or</w:t>
+      </w:r>
+      <w:r>
+        <w:t xml:space="preserve"> older</w:t>
       </w:r>
       <w:r>
         <w:t xml:space="preserve"> (</w:t>
@@ -4316,13 +4225,10 @@
         <w:t>—</w:t>
       </w:r>
       <w:r>
-        <w:t>using</w:t>
-      </w:r>
-      <w:r>
-        <w:rPr>
-          <w:rFonts w:hint="eastAsia"/>
-        </w:rPr>
-        <w:t xml:space="preserve"> the following equation</w:t>
+        <w:rPr>
+          <w:rFonts w:hint="eastAsia"/>
+        </w:rPr>
+        <w:t>was computed as</w:t>
       </w:r>
       <w:r>
         <w:t>:</w:t>
@@ -4646,7 +4552,10 @@
         <w:t xml:space="preserve">vaccine </w:t>
       </w:r>
       <w:r>
-        <w:t>effectiveness</w:t>
+        <w:rPr>
+          <w:rFonts w:hint="eastAsia"/>
+        </w:rPr>
+        <w:t>efficacy</w:t>
       </w:r>
       <w:r>
         <w:t xml:space="preserve"> </w:t>
@@ -4717,7 +4626,13 @@
         <w:t>indirect</w:t>
       </w:r>
       <w:r>
-        <w:t xml:space="preserve"> vaccine effectiveness</w:t>
+        <w:t xml:space="preserve"> vaccine </w:t>
+      </w:r>
+      <w:r>
+        <w:rPr>
+          <w:rFonts w:hint="eastAsia"/>
+        </w:rPr>
+        <w:t>efficacy</w:t>
       </w:r>
       <w:r>
         <w:t xml:space="preserve"> at </w:t>
@@ -5116,7 +5031,13 @@
         <w:t xml:space="preserve"> </w:t>
       </w:r>
       <w:r>
-        <w:t xml:space="preserve">under </w:t>
+        <w:rPr>
+          <w:rFonts w:hint="eastAsia"/>
+        </w:rPr>
+        <w:t>for</w:t>
+      </w:r>
+      <w:r>
+        <w:t xml:space="preserve"> </w:t>
       </w:r>
       <w:r>
         <w:t>a</w:t>
@@ -5599,42 +5520,13 @@
         <w:t xml:space="preserve">ndicator function </w:t>
       </w:r>
       <w:r>
-        <w:t xml:space="preserve">that </w:t>
-      </w:r>
-      <w:r>
-        <w:t xml:space="preserve">equals 1 if </w:t>
-      </w:r>
-      <m:oMath>
-        <m:r>
-          <w:rPr>
-            <w:rFonts w:ascii="Cambria Math" w:hAnsi="Cambria Math"/>
-          </w:rPr>
-          <m:t>x</m:t>
-        </m:r>
-      </m:oMath>
-      <w:r>
-        <w:t xml:space="preserve"> is true and </w:t>
-      </w:r>
-      <w:r>
-        <w:t>0</w:t>
-      </w:r>
-      <w:r>
-        <w:t xml:space="preserve"> otherwise.</w:t>
-      </w:r>
-      <w:r>
-        <w:t xml:space="preserve"> </w:t>
-      </w:r>
-      <w:r>
-        <w:t xml:space="preserve">The </w:t>
-      </w:r>
-      <w:r>
-        <w:rPr>
-          <w:rFonts w:hint="eastAsia"/>
-        </w:rPr>
-        <w:t>term</w:t>
-      </w:r>
-      <w:r>
-        <w:t xml:space="preserve"> </w:t>
+        <w:t>(1 if x is true, 0 otherwise</w:t>
+      </w:r>
+      <w:r>
+        <w:rPr>
+          <w:rFonts w:hint="eastAsia"/>
+        </w:rPr>
+        <w:t xml:space="preserve">), </w:t>
       </w:r>
       <m:oMath>
         <m:r>
@@ -5663,19 +5555,19 @@
         <w:rPr>
           <w:rFonts w:hint="eastAsia"/>
         </w:rPr>
-        <w:t xml:space="preserve"> for c</w:t>
-      </w:r>
-      <w:r>
-        <w:rPr>
-          <w:rFonts w:hint="eastAsia"/>
-        </w:rPr>
-        <w:t>a</w:t>
-      </w:r>
-      <w:r>
-        <w:rPr>
-          <w:rFonts w:hint="eastAsia"/>
-        </w:rPr>
-        <w:t xml:space="preserve">mpaign implementation and the development of vaccine-derived immunity, and </w:t>
+        <w:t xml:space="preserve"> for </w:t>
+      </w:r>
+      <w:r>
+        <w:rPr>
+          <w:rFonts w:hint="eastAsia"/>
+        </w:rPr>
+        <w:t>ORI</w:t>
+      </w:r>
+      <w:r>
+        <w:rPr>
+          <w:rFonts w:hint="eastAsia"/>
+        </w:rPr>
+        <w:t xml:space="preserve"> implementation and the vaccine-derived immunity, and </w:t>
       </w:r>
       <m:oMath>
         <m:r>
@@ -5686,7 +5578,25 @@
         </m:r>
       </m:oMath>
       <w:r>
-        <w:t xml:space="preserve"> denotes the outbreak's end date. </w:t>
+        <w:t xml:space="preserve"> </w:t>
+      </w:r>
+      <w:r>
+        <w:rPr>
+          <w:rFonts w:hint="eastAsia"/>
+        </w:rPr>
+        <w:t>marks</w:t>
+      </w:r>
+      <w:r>
+        <w:t xml:space="preserve"> the </w:t>
+      </w:r>
+      <w:r>
+        <w:rPr>
+          <w:rFonts w:hint="eastAsia"/>
+        </w:rPr>
+        <w:t xml:space="preserve">end of the </w:t>
+      </w:r>
+      <w:r>
+        <w:t xml:space="preserve">outbreak. </w:t>
       </w:r>
       <w:r>
         <w:rPr>
@@ -5762,20 +5672,7 @@
           <w:rFonts w:hint="eastAsia"/>
           <w:lang w:val="en-US"/>
         </w:rPr>
-        <w:t xml:space="preserve">, exploring </w:t>
-      </w:r>
-      <w:r>
-        <w:rPr>
-          <w:lang w:val="en-US"/>
-        </w:rPr>
-        <w:t>various</w:t>
-      </w:r>
-      <w:r>
-        <w:rPr>
-          <w:rFonts w:hint="eastAsia"/>
-          <w:lang w:val="en-US"/>
-        </w:rPr>
-        <w:t xml:space="preserve"> </w:t>
+        <w:t xml:space="preserve"> under combinations of </w:t>
       </w:r>
       <w:r>
         <w:rPr>
@@ -5785,19 +5682,6 @@
       </w:r>
       <w:r>
         <w:rPr>
-          <w:rFonts w:hint="eastAsia"/>
-          <w:lang w:val="en-US"/>
-        </w:rPr>
-        <w:t xml:space="preserve"> level</w:t>
-      </w:r>
-      <w:r>
-        <w:rPr>
-          <w:lang w:val="en-US"/>
-        </w:rPr>
-        <w:t>s</w:t>
-      </w:r>
-      <w:r>
-        <w:rPr>
           <w:lang w:val="en-US"/>
         </w:rPr>
         <w:t xml:space="preserve">, </w:t>
@@ -5825,7 +5709,20 @@
         <w:rPr>
           <w:lang w:val="en-US"/>
         </w:rPr>
-        <w:t>iggers (</w:t>
+        <w:t>igger</w:t>
+      </w:r>
+      <w:r>
+        <w:rPr>
+          <w:rFonts w:hint="eastAsia"/>
+          <w:lang w:val="en-US"/>
+        </w:rPr>
+        <w:t xml:space="preserve"> criteria</w:t>
+      </w:r>
+      <w:r>
+        <w:rPr>
+          <w:lang w:val="en-US"/>
+        </w:rPr>
+        <w:t xml:space="preserve"> (</w:t>
       </w:r>
       <w:r>
         <w:rPr>
@@ -5871,20 +5768,34 @@
           <w:rFonts w:hint="eastAsia"/>
           <w:lang w:val="en-US"/>
         </w:rPr>
-        <w:t>. We sampled</w:t>
-      </w:r>
-      <w:r>
-        <w:rPr>
-          <w:lang w:val="en-US"/>
-        </w:rPr>
-        <w:t xml:space="preserve"> 200 parameter sets </w:t>
-      </w:r>
-      <w:r>
-        <w:rPr>
-          <w:rFonts w:hint="eastAsia"/>
-          <w:lang w:val="en-US"/>
-        </w:rPr>
-        <w:t>via a</w:t>
+        <w:t>.</w:t>
+      </w:r>
+      <w:r>
+        <w:rPr>
+          <w:rFonts w:hint="eastAsia"/>
+          <w:lang w:val="en-US"/>
+        </w:rPr>
+        <w:t xml:space="preserve"> Two hundred </w:t>
+      </w:r>
+      <w:r>
+        <w:rPr>
+          <w:lang w:val="en-US"/>
+        </w:rPr>
+        <w:t xml:space="preserve">parameter sets </w:t>
+      </w:r>
+      <w:r>
+        <w:rPr>
+          <w:rFonts w:hint="eastAsia"/>
+          <w:lang w:val="en-US"/>
+        </w:rPr>
+        <w:t>were drawn using</w:t>
+      </w:r>
+      <w:r>
+        <w:rPr>
+          <w:rFonts w:hint="eastAsia"/>
+          <w:lang w:val="en-US"/>
+        </w:rPr>
+        <w:t xml:space="preserve"> a</w:t>
       </w:r>
       <w:r>
         <w:rPr>
@@ -5947,13 +5858,13 @@
           <w:rFonts w:hint="eastAsia"/>
           <w:lang w:val="en-US"/>
         </w:rPr>
-        <w:t xml:space="preserve">, yielding varying estimates of ORI impact. </w:t>
-      </w:r>
-      <w:r>
-        <w:rPr>
-          <w:lang w:val="en-US"/>
-        </w:rPr>
-        <w:t>Results</w:t>
+        <w:t xml:space="preserve"> and re</w:t>
+      </w:r>
+      <w:r>
+        <w:rPr>
+          <w:lang w:val="en-US"/>
+        </w:rPr>
+        <w:t>sults</w:t>
       </w:r>
       <w:r>
         <w:rPr>
@@ -5973,7 +5884,7 @@
           <w:rFonts w:hint="eastAsia"/>
           <w:lang w:val="en-US"/>
         </w:rPr>
-        <w:t xml:space="preserve">reported </w:t>
+        <w:t xml:space="preserve">summarized </w:t>
       </w:r>
       <w:r>
         <w:rPr>
@@ -6004,20 +5915,149 @@
           <w:rFonts w:hint="eastAsia"/>
           <w:lang w:val="en-US"/>
         </w:rPr>
-        <w:t>interquartile range (IQR)</w:t>
-      </w:r>
-      <w:r>
-        <w:rPr>
-          <w:lang w:val="en-US"/>
-        </w:rPr>
-        <w:t xml:space="preserve">. </w:t>
-      </w:r>
-      <w:r>
-        <w:rPr>
-          <w:rFonts w:hint="eastAsia"/>
-          <w:lang w:val="en-US"/>
-        </w:rPr>
-        <w:t xml:space="preserve"> </w:t>
+        <w:t>interquartile range</w:t>
+      </w:r>
+      <w:r>
+        <w:rPr>
+          <w:rFonts w:hint="eastAsia"/>
+          <w:lang w:val="en-US"/>
+        </w:rPr>
+        <w:t>s</w:t>
+      </w:r>
+      <w:r>
+        <w:rPr>
+          <w:rFonts w:hint="eastAsia"/>
+          <w:lang w:val="en-US"/>
+        </w:rPr>
+        <w:t xml:space="preserve"> (IQR</w:t>
+      </w:r>
+      <w:r>
+        <w:rPr>
+          <w:rFonts w:hint="eastAsia"/>
+          <w:lang w:val="en-US"/>
+        </w:rPr>
+        <w:t>s</w:t>
+      </w:r>
+      <w:r>
+        <w:rPr>
+          <w:rFonts w:hint="eastAsia"/>
+          <w:lang w:val="en-US"/>
+        </w:rPr>
+        <w:t>)</w:t>
+      </w:r>
+      <w:r>
+        <w:rPr>
+          <w:lang w:val="en-US"/>
+        </w:rPr>
+        <w:t>.</w:t>
+      </w:r>
+    </w:p>
+    <w:p>
+      <w:pPr>
+        <w:rPr>
+          <w:lang w:val="en-US"/>
+        </w:rPr>
+      </w:pPr>
+    </w:p>
+    <w:p>
+      <w:r>
+        <w:t xml:space="preserve">To estimate the global impact of reactive vaccination, we aggregated results across outbreaks assuming a constrained OCV supply of approximately 100,000 to 200 million doses, </w:t>
+      </w:r>
+      <w:r>
+        <w:rPr>
+          <w:rFonts w:hint="eastAsia"/>
+        </w:rPr>
+        <w:t xml:space="preserve">roughly </w:t>
+      </w:r>
+      <w:r>
+        <w:t>reflecting the scale of global stockpile deployments</w:t>
+      </w:r>
+      <w:r>
+        <w:rPr>
+          <w:rFonts w:hint="eastAsia"/>
+          <w:highlight w:val="yellow"/>
+        </w:rPr>
+        <w:t>.</w:t>
+      </w:r>
+      <w:r>
+        <w:rPr>
+          <w:highlight w:val="yellow"/>
+        </w:rPr>
+        <w:fldChar w:fldCharType="begin"/>
+      </w:r>
+      <w:r>
+        <w:rPr>
+          <w:highlight w:val="yellow"/>
+        </w:rPr>
+        <w:instrText xml:space="preserve"> ADDIN ZOTERO_ITEM CSL_CITATION {"citationID":"sRbe03pR","properties":{"formattedCitation":"\\super 34\\nosupersub{}","plainCitation":"34","noteIndex":0},"citationItems":[{"id":15101,"uris":["http://zotero.org/users/7663102/items/TX7JU4AF"],"itemData":{"id":15101,"type":"webpage","title":"GTFCC OCV Dashboard","URL":"https://apps.epicentre-msf.org/public/app/gtfcc","accessed":{"date-parts":[["2024",11,7]]},"citation-key":"GTFCCOCVDashboard"}}],"schema":"https://github.com/citation-style-language/schema/raw/master/csl-citation.json"} </w:instrText>
+      </w:r>
+      <w:r>
+        <w:rPr>
+          <w:highlight w:val="yellow"/>
+        </w:rPr>
+        <w:fldChar w:fldCharType="separate"/>
+      </w:r>
+      <w:r>
+        <w:rPr>
+          <w:rFonts w:cs="Times New Roman"/>
+          <w:highlight w:val="yellow"/>
+          <w:vertAlign w:val="superscript"/>
+        </w:rPr>
+        <w:t>34</w:t>
+      </w:r>
+      <w:r>
+        <w:rPr>
+          <w:highlight w:val="yellow"/>
+        </w:rPr>
+        <w:fldChar w:fldCharType="end"/>
+      </w:r>
+      <w:r>
+        <w:t xml:space="preserve"> </w:t>
+      </w:r>
+      <w:r>
+        <w:t>Because this supply was insufficient to vaccinate all outbreak populations, we modeled allocation strategies across all or selected outbreaks prioritized by characteristics such as attack rate, duration, size, or case-fatality ratio.</w:t>
+      </w:r>
+      <w:r>
+        <w:t xml:space="preserve"> </w:t>
+      </w:r>
+      <w:r>
+        <w:t>Outbreaks were sampled without replacement and assigned enough vaccine to reach their target coverage. Sampling continued until the cumulative number of doses matched the supply.</w:t>
+      </w:r>
+      <w:r>
+        <w:rPr>
+          <w:rFonts w:hint="eastAsia"/>
+        </w:rPr>
+        <w:t xml:space="preserve"> </w:t>
+      </w:r>
+      <w:r>
+        <w:t>This allocation was repeated 200 iterations, and results were aggregated to estimate</w:t>
+      </w:r>
+      <w:r>
+        <w:rPr>
+          <w:rFonts w:hint="eastAsia"/>
+        </w:rPr>
+        <w:t xml:space="preserve"> the impact (</w:t>
+      </w:r>
+      <w:r>
+        <w:t>total cases, deaths, and DALYs averted</w:t>
+      </w:r>
+      <w:r>
+        <w:rPr>
+          <w:rFonts w:hint="eastAsia"/>
+        </w:rPr>
+        <w:t>)</w:t>
+      </w:r>
+      <w:r>
+        <w:t xml:space="preserve"> as well as efficiency (impact per 1,000 doses) and cost-effectiveness (cost per </w:t>
+      </w:r>
+      <w:r>
+        <w:rPr>
+          <w:rFonts w:hint="eastAsia"/>
+        </w:rPr>
+        <w:t>unit of impact</w:t>
+      </w:r>
+      <w:r>
+        <w:t>).</w:t>
       </w:r>
     </w:p>
     <w:p/>
@@ -6025,146 +6065,144 @@
       <w:r>
         <w:rPr>
           <w:rFonts w:hint="eastAsia"/>
-        </w:rPr>
-        <w:t xml:space="preserve">In addition to </w:t>
-      </w:r>
-      <w:r>
-        <w:t>evaluating the impact of ORIs at the level</w:t>
-      </w:r>
-      <w:r>
-        <w:t xml:space="preserve"> </w:t>
-      </w:r>
-      <w:r>
-        <w:rPr>
-          <w:rFonts w:hint="eastAsia"/>
-        </w:rPr>
-        <w:t xml:space="preserve">of </w:t>
-      </w:r>
-      <w:r>
-        <w:t>individual outbreak</w:t>
-      </w:r>
-      <w:r>
-        <w:rPr>
-          <w:rFonts w:hint="eastAsia"/>
-        </w:rPr>
-        <w:t>s</w:t>
-      </w:r>
-      <w:r>
+          <w:highlight w:val="yellow"/>
+        </w:rPr>
+        <w:t xml:space="preserve">The model </w:t>
+      </w:r>
+      <w:r>
+        <w:rPr>
+          <w:rFonts w:hint="eastAsia"/>
+          <w:highlight w:val="yellow"/>
+          <w:lang w:val="en-US"/>
+        </w:rPr>
+        <w:t xml:space="preserve">captures </w:t>
+      </w:r>
+      <w:r>
+        <w:rPr>
+          <w:rFonts w:hint="eastAsia"/>
+          <w:highlight w:val="yellow"/>
+        </w:rPr>
+        <w:t xml:space="preserve">on the immediate </w:t>
+      </w:r>
+      <w:r>
+        <w:rPr>
+          <w:rFonts w:hint="eastAsia"/>
+          <w:highlight w:val="yellow"/>
+        </w:rPr>
+        <w:t xml:space="preserve">, within-outbreak </w:t>
+      </w:r>
+      <w:r>
+        <w:rPr>
+          <w:rFonts w:hint="eastAsia"/>
+          <w:highlight w:val="yellow"/>
+        </w:rPr>
+        <w:t xml:space="preserve">impact of </w:t>
+      </w:r>
+      <w:r>
+        <w:rPr>
+          <w:highlight w:val="yellow"/>
+        </w:rPr>
+        <w:t>ORI</w:t>
+      </w:r>
+      <w:r>
+        <w:rPr>
+          <w:rFonts w:hint="eastAsia"/>
+          <w:highlight w:val="yellow"/>
+        </w:rPr>
+        <w:t xml:space="preserve"> and </w:t>
+      </w:r>
+      <w:r>
+        <w:rPr>
+          <w:rFonts w:hint="eastAsia"/>
+          <w:highlight w:val="yellow"/>
+        </w:rPr>
+        <w:t xml:space="preserve">does not account for </w:t>
+      </w:r>
+      <w:r>
+        <w:rPr>
+          <w:rFonts w:hint="eastAsia"/>
+          <w:highlight w:val="yellow"/>
+        </w:rPr>
+        <w:t xml:space="preserve">potential </w:t>
+      </w:r>
+      <w:r>
+        <w:rPr>
+          <w:rFonts w:hint="eastAsia"/>
+          <w:highlight w:val="yellow"/>
+        </w:rPr>
+        <w:t xml:space="preserve">long-term </w:t>
+      </w:r>
+      <w:r>
+        <w:rPr>
+          <w:rFonts w:hint="eastAsia"/>
+          <w:highlight w:val="yellow"/>
+        </w:rPr>
+        <w:t>benefits</w:t>
+      </w:r>
+      <w:r>
+        <w:rPr>
+          <w:rFonts w:hint="eastAsia"/>
+          <w:highlight w:val="yellow"/>
+        </w:rPr>
         <w:t>,</w:t>
       </w:r>
       <w:r>
         <w:rPr>
-          <w:rFonts w:hint="eastAsia"/>
-        </w:rPr>
-        <w:t xml:space="preserve"> </w:t>
-      </w:r>
-      <w:r>
-        <w:t xml:space="preserve">we also estimated their </w:t>
-      </w:r>
-      <w:r>
-        <w:rPr>
-          <w:rFonts w:hint="eastAsia"/>
-        </w:rPr>
-        <w:t xml:space="preserve">overall global </w:t>
-      </w:r>
-      <w:r>
-        <w:rPr>
-          <w:rFonts w:hint="eastAsia"/>
-        </w:rPr>
-        <w:t>i</w:t>
-      </w:r>
-      <w:r>
-        <w:t>mpact</w:t>
-      </w:r>
-      <w:r>
-        <w:rPr>
-          <w:rFonts w:hint="eastAsia"/>
-        </w:rPr>
-        <w:t xml:space="preserve"> </w:t>
-      </w:r>
-      <w:r>
-        <w:rPr>
-          <w:rFonts w:hint="eastAsia"/>
-        </w:rPr>
-        <w:t xml:space="preserve">by aggregating the effects </w:t>
-      </w:r>
-      <w:r>
-        <w:rPr>
-          <w:rFonts w:hint="eastAsia"/>
-        </w:rPr>
-        <w:t xml:space="preserve">across multiple outbreaks </w:t>
-      </w:r>
-      <w:r>
-        <w:rPr>
-          <w:rFonts w:hint="eastAsia"/>
-        </w:rPr>
-        <w:t xml:space="preserve">under a constrained </w:t>
-      </w:r>
-      <w:r>
-        <w:rPr>
-          <w:rFonts w:hint="eastAsia"/>
-        </w:rPr>
-        <w:t>OCV supply</w:t>
-      </w:r>
-      <w:r>
+          <w:highlight w:val="yellow"/>
+        </w:rPr>
+        <w:t xml:space="preserve"> </w:t>
+      </w:r>
+      <w:r>
+        <w:t>such as preventing or mitigating future outbreaks</w:t>
+      </w:r>
+      <w:r>
+        <w:rPr>
+          <w:rFonts w:hint="eastAsia"/>
+          <w:highlight w:val="yellow"/>
+        </w:rPr>
         <w:t>.</w:t>
       </w:r>
       <w:r>
-        <w:rPr>
-          <w:rFonts w:hint="eastAsia"/>
-        </w:rPr>
-        <w:t xml:space="preserve"> Specifically, we</w:t>
-      </w:r>
-      <w:r>
-        <w:t xml:space="preserve"> modeled the deployment of approximately 38 million </w:t>
-      </w:r>
-      <w:r>
-        <w:rPr>
-          <w:rFonts w:hint="eastAsia"/>
-        </w:rPr>
-        <w:t xml:space="preserve">doses of OCVs </w:t>
-      </w:r>
-      <w:r>
-        <w:t xml:space="preserve">administered </w:t>
-      </w:r>
-      <w:r>
-        <w:rPr>
-          <w:rFonts w:hint="eastAsia"/>
-        </w:rPr>
-        <w:t xml:space="preserve">in </w:t>
-      </w:r>
-      <w:r>
-        <w:rPr>
-          <w:rFonts w:hint="eastAsia"/>
-        </w:rPr>
-        <w:t>reactive c</w:t>
-      </w:r>
-      <w:r>
-        <w:rPr>
-          <w:rFonts w:hint="eastAsia"/>
-        </w:rPr>
-        <w:t xml:space="preserve">ampaigns </w:t>
-      </w:r>
-      <w:r>
-        <w:t xml:space="preserve">globally from the creation of the stockpile through 2020, based on the </w:t>
-      </w:r>
-      <w:r>
-        <w:rPr>
-          <w:rFonts w:hint="eastAsia"/>
-        </w:rPr>
-        <w:t>Global Task Force on Cholera Control (</w:t>
-      </w:r>
-      <w:r>
-        <w:t>GTFCC</w:t>
-      </w:r>
-      <w:r>
-        <w:rPr>
-          <w:rFonts w:hint="eastAsia"/>
-        </w:rPr>
-        <w:t>)</w:t>
-      </w:r>
-      <w:r>
-        <w:t xml:space="preserve"> dashboard</w:t>
+        <w:t xml:space="preserve"> </w:t>
+      </w:r>
+      <w:r>
+        <w:rPr>
+          <w:rFonts w:hint="eastAsia"/>
+        </w:rPr>
+        <w:t xml:space="preserve">This assumption reflects the </w:t>
+      </w:r>
+      <w:r>
+        <w:rPr>
+          <w:rFonts w:hint="eastAsia"/>
+        </w:rPr>
+        <w:t>temporary</w:t>
+      </w:r>
+      <w:r>
+        <w:t xml:space="preserve"> population-level protection expected from single-dose campaigns</w:t>
+      </w:r>
+      <w:r>
+        <w:rPr>
+          <w:rFonts w:hint="eastAsia"/>
+        </w:rPr>
+        <w:t xml:space="preserve">, </w:t>
+      </w:r>
+      <w:r>
+        <w:rPr>
+          <w:rFonts w:hint="eastAsia"/>
+        </w:rPr>
+        <w:t>given waning immunity</w:t>
+      </w:r>
+      <w:r>
+        <w:rPr>
+          <w:rFonts w:hint="eastAsia"/>
+        </w:rPr>
+        <w:t xml:space="preserve"> and</w:t>
+      </w:r>
+      <w:r>
+        <w:rPr>
+          <w:rFonts w:hint="eastAsia"/>
+        </w:rPr>
+        <w:t xml:space="preserve"> population mobility</w:t>
       </w:r>
       <w:r>
         <w:rPr>
@@ -6176,7 +6214,7 @@
         <w:fldChar w:fldCharType="begin"/>
       </w:r>
       <w:r>
-        <w:instrText xml:space="preserve"> ADDIN ZOTERO_ITEM CSL_CITATION {"citationID":"sRbe03pR","properties":{"formattedCitation":"\\super 34\\nosupersub{}","plainCitation":"34","noteIndex":0},"citationItems":[{"id":15101,"uris":["http://zotero.org/users/7663102/items/TX7JU4AF"],"itemData":{"id":15101,"type":"webpage","title":"GTFCC OCV Dashboard","URL":"https://apps.epicentre-msf.org/public/app/gtfcc","accessed":{"date-parts":[["2024",11,7]]},"citation-key":"GTFCCOCVDashboard"}}],"schema":"https://github.com/citation-style-language/schema/raw/master/csl-citation.json"} </w:instrText>
+        <w:instrText xml:space="preserve"> ADDIN ZOTERO_ITEM CSL_CITATION {"citationID":"zg76TUrS","properties":{"formattedCitation":"\\super 38\\nosupersub{}","plainCitation":"38","noteIndex":0},"citationItems":[{"id":9927,"uris":["http://zotero.org/users/7663102/items/VME6ZAW8"],"itemData":{"id":9927,"type":"article-journal","abstract":"Background Oral cholera vaccination is an approach to preventing outbreaks in at-risk settings and controlling cholera in endemic settings. However, vaccine-derived herd immunity may be short-lived due to interactions between human mobility and imperfect or waning vaccine efficacy. As the supply and utilization of oral cholera vaccines grows, critical questions related to herd immunity are emerging, including: who should be targeted; when should revaccination be performed; and why have cholera outbreaks occurred in recently vaccinated populations? Methods and findings We use mathematical models to simulate routine and mass oral cholera vaccination in populations with varying degrees of migration, transmission intensity, and vaccine coverage. We show that migration and waning vaccine efficacy strongly influence the duration of herd immunity while birth and death rates have relatively minimal impacts. As compared to either periodic mass vaccination or routine vaccination alone, a community could be protected longer by a blended “Mass and Maintain” strategy. We show that vaccination may be best targeted at populations with intermediate degrees of mobility as compared to communities with very high or very low population turnover. Using a case study of an internally displaced person camp in South Sudan which underwent high-coverage mass vaccination in 2014 and 2015, we show that waning vaccine direct effects and high population turnover rendered the camp over 80% susceptible at the time of the cholera outbreak beginning in October 2016. Conclusions Oral cholera vaccines can be powerful tools for quickly protecting a population for a period of time that depends critically on vaccine coverage, vaccine efficacy over time, and the rate of population turnover through human mobility. Due to waning herd immunity, epidemics in vaccinated communities are possible but become less likely through complementary interventions or data-driven revaccination strategies.","container-title":"PLOS Neglected Tropical Diseases","DOI":"10.1371/journal.pntd.0006257","ISSN":"1935-2735","issue":"2","journalAbbreviation":"PLOS Neglected Tropical Diseases","language":"en","note":"publisher: Public Library of Science","page":"e0006257","source":"PLoS Journals","title":"Prolonging herd immunity to cholera via vaccination: Accounting for human mobility and waning vaccine effects","title-short":"Prolonging herd immunity to cholera via vaccination","volume":"12","author":[{"family":"Peak","given":"Corey M."},{"family":"Reilly","given":"Amanda L."},{"family":"Azman","given":"Andrew S."},{"family":"Buckee","given":"Caroline O."}],"issued":{"date-parts":[["2018",2,28]]},"citation-key":"peakProlongingHerdImmunity2018a"}}],"schema":"https://github.com/citation-style-language/schema/raw/master/csl-citation.json"} </w:instrText>
       </w:r>
       <w:r>
         <w:fldChar w:fldCharType="separate"/>
@@ -6186,7 +6224,7 @@
           <w:rFonts w:cs="Times New Roman"/>
           <w:vertAlign w:val="superscript"/>
         </w:rPr>
-        <w:t>34</w:t>
+        <w:t>38</w:t>
       </w:r>
       <w:r>
         <w:fldChar w:fldCharType="end"/>
@@ -6194,30 +6232,60 @@
       <w:r>
         <w:rPr>
           <w:rFonts w:hint="eastAsia"/>
-        </w:rPr>
-        <w:t xml:space="preserve"> </w:t>
-      </w:r>
-      <w:r>
-        <w:t xml:space="preserve">Because this supply was insufficient to cover all outbreaks in the dataset, we simulated historical vaccine allocation by year. Specifically, for each year, we randomly sampled outbreaks (without replacement) that began in that year and assigned each enough vaccine to cover its target population, continuing this process until </w:t>
-      </w:r>
-      <w:r>
-        <w:lastRenderedPageBreak/>
-        <w:t xml:space="preserve">the annual number of doses deployed was matched. This sampling procedure was repeated for all years, and the entire process was iterated 200 times. For each iteration, we calculated the overall health impact by aggregating the effect across sampled outbreaks. These results were then summarized to estimate the </w:t>
-      </w:r>
-      <w:r>
-        <w:rPr>
-          <w:rFonts w:hint="eastAsia"/>
-        </w:rPr>
-        <w:t>overall</w:t>
-      </w:r>
-      <w:r>
-        <w:t xml:space="preserve"> impact of global OCV use through 2020</w:t>
-      </w:r>
-      <w:r>
-        <w:rPr>
-          <w:rFonts w:hint="eastAsia"/>
-        </w:rPr>
-        <w:t>.</w:t>
+          <w:lang w:val="en-US"/>
+        </w:rPr>
+        <w:t xml:space="preserve"> </w:t>
+      </w:r>
+      <w:r>
+        <w:rPr>
+          <w:rFonts w:hint="eastAsia"/>
+          <w:lang w:val="en-US"/>
+        </w:rPr>
+        <w:t>Moreover,</w:t>
+      </w:r>
+      <w:r>
+        <w:rPr>
+          <w:rFonts w:hint="eastAsia"/>
+          <w:lang w:val="en-US"/>
+        </w:rPr>
+        <w:t xml:space="preserve"> </w:t>
+      </w:r>
+      <w:r>
+        <w:rPr>
+          <w:rFonts w:hint="eastAsia"/>
+          <w:lang w:val="en-US"/>
+        </w:rPr>
+        <w:t>we modeled</w:t>
+      </w:r>
+      <w:r>
+        <w:rPr>
+          <w:rFonts w:hint="eastAsia"/>
+        </w:rPr>
+        <w:t xml:space="preserve"> each population independently</w:t>
+      </w:r>
+      <w:r>
+        <w:rPr>
+          <w:rFonts w:hint="eastAsia"/>
+        </w:rPr>
+        <w:t xml:space="preserve">, without </w:t>
+      </w:r>
+      <w:r>
+        <w:rPr>
+          <w:rFonts w:hint="eastAsia"/>
+        </w:rPr>
+        <w:t xml:space="preserve"> cross-population </w:t>
+      </w:r>
+      <w:r>
+        <w:rPr>
+          <w:rFonts w:hint="eastAsia"/>
+        </w:rPr>
+        <w:t>transmission or vaccination spillover</w:t>
+      </w:r>
+      <w:r>
+        <w:rPr>
+          <w:rFonts w:hint="eastAsia"/>
+        </w:rPr>
+        <w:t xml:space="preserve">. </w:t>
       </w:r>
     </w:p>
     <w:p/>
@@ -6228,205 +6296,16 @@
         </w:rPr>
       </w:pPr>
       <w:r>
-        <w:rPr>
-          <w:rFonts w:hint="eastAsia"/>
-        </w:rPr>
-        <w:t>O</w:t>
-      </w:r>
-      <w:r>
-        <w:rPr>
-          <w:rFonts w:hint="eastAsia"/>
-        </w:rPr>
-        <w:t>ur</w:t>
-      </w:r>
-      <w:r>
-        <w:rPr>
-          <w:rFonts w:hint="eastAsia"/>
-          <w:lang w:val="en-US"/>
-        </w:rPr>
-        <w:t xml:space="preserve"> </w:t>
-      </w:r>
-      <w:r>
-        <w:rPr>
-          <w:lang w:val="en-US"/>
-        </w:rPr>
-        <w:t xml:space="preserve">modeling </w:t>
-      </w:r>
-      <w:r>
-        <w:rPr>
-          <w:lang w:val="en-US"/>
-        </w:rPr>
-        <w:t>approach</w:t>
-      </w:r>
-      <w:r>
-        <w:rPr>
-          <w:lang w:val="en-US"/>
-        </w:rPr>
-        <w:t xml:space="preserve"> </w:t>
-      </w:r>
-      <w:r>
-        <w:rPr>
-          <w:rFonts w:hint="eastAsia"/>
-        </w:rPr>
-        <w:t xml:space="preserve">focuses on the immediate impact of </w:t>
-      </w:r>
-      <w:r>
-        <w:t>ORI</w:t>
-      </w:r>
-      <w:r>
-        <w:rPr>
-          <w:rFonts w:hint="eastAsia"/>
-        </w:rPr>
-        <w:t xml:space="preserve"> during ongoing outbreaks and </w:t>
-      </w:r>
-      <w:r>
-        <w:rPr>
-          <w:rFonts w:hint="eastAsia"/>
-        </w:rPr>
-        <w:t xml:space="preserve">does not account for </w:t>
-      </w:r>
-      <w:r>
-        <w:rPr>
-          <w:rFonts w:hint="eastAsia"/>
-        </w:rPr>
-        <w:t>potential additional benefits</w:t>
-      </w:r>
-      <w:r>
-        <w:rPr>
-          <w:rFonts w:hint="eastAsia"/>
-        </w:rPr>
-        <w:t>,</w:t>
-      </w:r>
-      <w:r>
-        <w:t xml:space="preserve"> such as the prevention of future outbreaks in the same population. </w:t>
-      </w:r>
-      <w:r>
-        <w:rPr>
-          <w:rFonts w:hint="eastAsia"/>
-        </w:rPr>
-        <w:t xml:space="preserve">This assumption reflects the </w:t>
-      </w:r>
-      <w:r>
-        <w:rPr>
-          <w:rFonts w:hint="eastAsia"/>
-        </w:rPr>
-        <w:t>l</w:t>
-      </w:r>
-      <w:r>
-        <w:t>imited duration of population-level protection expected from single-dose campaigns</w:t>
-      </w:r>
-      <w:r>
-        <w:rPr>
-          <w:rFonts w:hint="eastAsia"/>
-        </w:rPr>
-        <w:t xml:space="preserve">, </w:t>
-      </w:r>
-      <w:r>
-        <w:rPr>
-          <w:rFonts w:hint="eastAsia"/>
-        </w:rPr>
-        <w:t>given the waning of immunity conferred by single-dose regimens</w:t>
-      </w:r>
-      <w:r>
-        <w:rPr>
-          <w:rFonts w:hint="eastAsia"/>
-        </w:rPr>
-        <w:t xml:space="preserve"> and</w:t>
-      </w:r>
-      <w:r>
-        <w:rPr>
-          <w:rFonts w:hint="eastAsia"/>
-        </w:rPr>
-        <w:t xml:space="preserve"> population mobility</w:t>
-      </w:r>
-      <w:r>
-        <w:rPr>
-          <w:rFonts w:hint="eastAsia"/>
-        </w:rPr>
-        <w:t>.</w:t>
-      </w:r>
-      <w:r>
-        <w:fldChar w:fldCharType="begin"/>
-      </w:r>
-      <w:r>
-        <w:instrText xml:space="preserve"> ADDIN ZOTERO_ITEM CSL_CITATION {"citationID":"zg76TUrS","properties":{"formattedCitation":"\\super 38\\nosupersub{}","plainCitation":"38","noteIndex":0},"citationItems":[{"id":9927,"uris":["http://zotero.org/users/7663102/items/VME6ZAW8"],"itemData":{"id":9927,"type":"article-journal","abstract":"Background Oral cholera vaccination is an approach to preventing outbreaks in at-risk settings and controlling cholera in endemic settings. However, vaccine-derived herd immunity may be short-lived due to interactions between human mobility and imperfect or waning vaccine efficacy. As the supply and utilization of oral cholera vaccines grows, critical questions related to herd immunity are emerging, including: who should be targeted; when should revaccination be performed; and why have cholera outbreaks occurred in recently vaccinated populations? Methods and findings We use mathematical models to simulate routine and mass oral cholera vaccination in populations with varying degrees of migration, transmission intensity, and vaccine coverage. We show that migration and waning vaccine efficacy strongly influence the duration of herd immunity while birth and death rates have relatively minimal impacts. As compared to either periodic mass vaccination or routine vaccination alone, a community could be protected longer by a blended “Mass and Maintain” strategy. We show that vaccination may be best targeted at populations with intermediate degrees of mobility as compared to communities with very high or very low population turnover. Using a case study of an internally displaced person camp in South Sudan which underwent high-coverage mass vaccination in 2014 and 2015, we show that waning vaccine direct effects and high population turnover rendered the camp over 80% susceptible at the time of the cholera outbreak beginning in October 2016. Conclusions Oral cholera vaccines can be powerful tools for quickly protecting a population for a period of time that depends critically on vaccine coverage, vaccine efficacy over time, and the rate of population turnover through human mobility. Due to waning herd immunity, epidemics in vaccinated communities are possible but become less likely through complementary interventions or data-driven revaccination strategies.","container-title":"PLOS Neglected Tropical Diseases","DOI":"10.1371/journal.pntd.0006257","ISSN":"1935-2735","issue":"2","journalAbbreviation":"PLOS Neglected Tropical Diseases","language":"en","note":"publisher: Public Library of Science","page":"e0006257","source":"PLoS Journals","title":"Prolonging herd immunity to cholera via vaccination: Accounting for human mobility and waning vaccine effects","title-short":"Prolonging herd immunity to cholera via vaccination","volume":"12","author":[{"family":"Peak","given":"Corey M."},{"family":"Reilly","given":"Amanda L."},{"family":"Azman","given":"Andrew S."},{"family":"Buckee","given":"Caroline O."}],"issued":{"date-parts":[["2018",2,28]]},"citation-key":"peakProlongingHerdImmunity2018a"}}],"schema":"https://github.com/citation-style-language/schema/raw/master/csl-citation.json"} </w:instrText>
-      </w:r>
-      <w:r>
-        <w:fldChar w:fldCharType="separate"/>
-      </w:r>
-      <w:r>
-        <w:rPr>
-          <w:rFonts w:cs="Times New Roman"/>
-          <w:vertAlign w:val="superscript"/>
-        </w:rPr>
-        <w:t>38</w:t>
-      </w:r>
-      <w:r>
-        <w:fldChar w:fldCharType="end"/>
-      </w:r>
-      <w:r>
-        <w:rPr>
-          <w:rFonts w:hint="eastAsia"/>
-          <w:lang w:val="en-US"/>
-        </w:rPr>
-        <w:t xml:space="preserve"> </w:t>
-      </w:r>
-      <w:r>
-        <w:rPr>
-          <w:rFonts w:hint="eastAsia"/>
-          <w:lang w:val="en-US"/>
-        </w:rPr>
-        <w:t>Moreover,</w:t>
-      </w:r>
-      <w:r>
-        <w:rPr>
-          <w:rFonts w:hint="eastAsia"/>
-          <w:lang w:val="en-US"/>
-        </w:rPr>
-        <w:t xml:space="preserve"> </w:t>
-      </w:r>
-      <w:r>
-        <w:rPr>
-          <w:rFonts w:hint="eastAsia"/>
-          <w:lang w:val="en-US"/>
-        </w:rPr>
-        <w:t>we modeled</w:t>
-      </w:r>
-      <w:r>
-        <w:rPr>
-          <w:rFonts w:hint="eastAsia"/>
-        </w:rPr>
-        <w:t xml:space="preserve"> each population independently</w:t>
-      </w:r>
-      <w:r>
-        <w:rPr>
-          <w:rFonts w:hint="eastAsia"/>
-        </w:rPr>
-        <w:t xml:space="preserve">, without considering </w:t>
-      </w:r>
-      <w:r>
-        <w:rPr>
-          <w:rFonts w:hint="eastAsia"/>
-        </w:rPr>
-        <w:t xml:space="preserve">potential cross-population effects </w:t>
-      </w:r>
-      <w:r>
-        <w:t>from outbreaks or vaccination campaigns</w:t>
-      </w:r>
-      <w:r>
-        <w:rPr>
-          <w:rFonts w:hint="eastAsia"/>
-        </w:rPr>
-        <w:t xml:space="preserve">. </w:t>
-      </w:r>
-      <w:r>
-        <w:t>All code and datasets used in the analysis</w:t>
-      </w:r>
-      <w:r>
-        <w:rPr>
-          <w:lang w:val="en-US"/>
-        </w:rPr>
-        <w:t xml:space="preserve"> </w:t>
+        <w:t xml:space="preserve">All code and </w:t>
+      </w:r>
+      <w:r>
+        <w:rPr>
+          <w:rFonts w:hint="eastAsia"/>
+        </w:rPr>
+        <w:t xml:space="preserve">processed </w:t>
+      </w:r>
+      <w:r>
+        <w:t xml:space="preserve">datasets </w:t>
       </w:r>
       <w:r>
         <w:rPr>
@@ -6684,13 +6563,13 @@
               <w:rPr>
                 <w:rFonts w:eastAsia="Aptos"/>
               </w:rPr>
-              <w:t>accine eff</w:t>
+              <w:t xml:space="preserve">accine </w:t>
             </w:r>
             <w:r>
               <w:rPr>
                 <w:rFonts w:hint="eastAsia"/>
               </w:rPr>
-              <w:t>ectiveness</w:t>
+              <w:t>efficacy</w:t>
             </w:r>
             <w:r>
               <w:t xml:space="preserve"> by one dose of OCV for the &lt; 5 yo and 5+ yo,</w:t>
@@ -6939,12 +6818,18 @@
             <w:pPr>
               <w:snapToGrid w:val="0"/>
               <w:spacing w:line="240" w:lineRule="auto"/>
+              <w:rPr>
+                <w:rFonts w:hint="eastAsia"/>
+              </w:rPr>
             </w:pPr>
             <w:r>
               <w:t xml:space="preserve">Indirect vaccine </w:t>
             </w:r>
             <w:r>
-              <w:t>effectiveness</w:t>
+              <w:rPr>
+                <w:rFonts w:hint="eastAsia"/>
+              </w:rPr>
+              <w:t>efficacy</w:t>
             </w:r>
           </w:p>
         </w:tc>
@@ -7126,9 +7011,18 @@
           <w:p>
             <w:pPr>
               <w:spacing w:line="240" w:lineRule="auto"/>
+              <w:rPr>
+                <w:rFonts w:hint="eastAsia"/>
+              </w:rPr>
             </w:pPr>
             <w:r>
-              <w:t>Delay in vaccine-derived protection</w:t>
+              <w:t xml:space="preserve">Delay in vaccine-derived </w:t>
+            </w:r>
+            <w:r>
+              <w:rPr>
+                <w:rFonts w:hint="eastAsia"/>
+              </w:rPr>
+              <w:t>immunity</w:t>
             </w:r>
           </w:p>
         </w:tc>
@@ -7376,7 +7270,6 @@
               </w:rPr>
             </w:pPr>
             <w:r>
-              <w:lastRenderedPageBreak/>
               <w:t>Vaccine coverage</w:t>
             </w:r>
           </w:p>
@@ -8671,6 +8564,7 @@
               <w:spacing w:line="240" w:lineRule="auto"/>
             </w:pPr>
             <w:r>
+              <w:lastRenderedPageBreak/>
               <w:t>Mean age of infection</w:t>
             </w:r>
           </w:p>
@@ -8962,7 +8856,34 @@
               <w:rPr>
                 <w:rFonts w:hint="eastAsia"/>
               </w:rPr>
-              <w:t>42.2, IQR: 42.2</w:t>
+              <w:t>42.2</w:t>
+            </w:r>
+            <w:r>
+              <w:rPr>
+                <w:rFonts w:hint="eastAsia"/>
+              </w:rPr>
+              <w:t xml:space="preserve"> </w:t>
+            </w:r>
+            <w:r>
+              <w:t>–</w:t>
+            </w:r>
+            <w:r>
+              <w:rPr>
+                <w:rFonts w:hint="eastAsia"/>
+              </w:rPr>
+              <w:t xml:space="preserve"> 4</w:t>
+            </w:r>
+            <w:r>
+              <w:rPr>
+                <w:rFonts w:hint="eastAsia"/>
+              </w:rPr>
+              <w:t>3</w:t>
+            </w:r>
+            <w:r>
+              <w:rPr>
+                <w:rFonts w:hint="eastAsia"/>
+              </w:rPr>
+              <w:t>.2</w:t>
             </w:r>
             <w:r>
               <w:rPr>
@@ -9319,7 +9240,20 @@
                 <w:rFonts w:hint="eastAsia"/>
                 <w:lang w:val="en-US"/>
               </w:rPr>
-              <w:t xml:space="preserve">, </w:t>
+              <w:t xml:space="preserve"> </w:t>
+            </w:r>
+            <w:r>
+              <w:rPr>
+                <w:lang w:val="en-US"/>
+              </w:rPr>
+              <w:t>–</w:t>
+            </w:r>
+            <w:r>
+              <w:rPr>
+                <w:rFonts w:hint="eastAsia"/>
+                <w:lang w:val="en-US"/>
+              </w:rPr>
+              <w:t xml:space="preserve"> </w:t>
             </w:r>
             <w:r>
               <w:rPr>
@@ -9496,7 +9430,19 @@
               <w:rPr>
                 <w:rFonts w:hint="eastAsia"/>
               </w:rPr>
-              <w:t>IQR: 67.9, 68.4</w:t>
+              <w:t>IQR: 67.9</w:t>
+            </w:r>
+            <w:r>
+              <w:rPr>
+                <w:rFonts w:hint="eastAsia"/>
+              </w:rPr>
+              <w:t xml:space="preserve"> - </w:t>
+            </w:r>
+            <w:r>
+              <w:rPr>
+                <w:rFonts w:hint="eastAsia"/>
+              </w:rPr>
+              <w:t>68.4</w:t>
             </w:r>
             <w:r>
               <w:rPr>
@@ -9568,7 +9514,6 @@
       </w:pPr>
       <w:bookmarkStart w:id="21" w:name="_Toc184909202"/>
       <w:r>
-        <w:lastRenderedPageBreak/>
         <w:t>Campaign triggers and assumptions</w:t>
       </w:r>
       <w:bookmarkEnd w:id="21"/>
@@ -9578,13 +9523,13 @@
         <w:rPr>
           <w:rFonts w:hint="eastAsia"/>
         </w:rPr>
-        <w:t xml:space="preserve">ORIs were triggered </w:t>
-      </w:r>
-      <w:r>
-        <w:rPr>
-          <w:rFonts w:hint="eastAsia"/>
-        </w:rPr>
-        <w:t>either at</w:t>
+        <w:t>ORIs were triggered</w:t>
+      </w:r>
+      <w:r>
+        <w:rPr>
+          <w:rFonts w:hint="eastAsia"/>
+        </w:rPr>
+        <w:t xml:space="preserve"> at</w:t>
       </w:r>
       <w:r>
         <w:rPr>
@@ -9617,16 +9562,22 @@
         <w:t>or when</w:t>
       </w:r>
       <w:r>
-        <w:t xml:space="preserve"> the cumulative number of reported symptomatic cases</w:t>
-      </w:r>
-      <w:r>
-        <w:rPr>
-          <w:rFonts w:hint="eastAsia"/>
-        </w:rPr>
-        <w:t xml:space="preserve"> reached certain thresholds</w:t>
-      </w:r>
-      <w:r>
-        <w:t xml:space="preserve"> (case-triggered)</w:t>
+        <w:t xml:space="preserve"> the cumulative number of reported cases</w:t>
+      </w:r>
+      <w:r>
+        <w:rPr>
+          <w:rFonts w:hint="eastAsia"/>
+        </w:rPr>
+        <w:t xml:space="preserve"> </w:t>
+      </w:r>
+      <w:r>
+        <w:t>exceeded a predefined threshold</w:t>
+      </w:r>
+      <w:r>
+        <w:t xml:space="preserve"> </w:t>
+      </w:r>
+      <w:r>
+        <w:t>(case-triggered)</w:t>
       </w:r>
       <w:r>
         <w:t xml:space="preserve"> (</w:t>
@@ -9666,322 +9617,94 @@
         <w:t xml:space="preserve">approach </w:t>
       </w:r>
       <w:r>
-        <w:rPr>
-          <w:rFonts w:hint="eastAsia"/>
-        </w:rPr>
-        <w:t>highlight</w:t>
-      </w:r>
-      <w:r>
-        <w:rPr>
-          <w:rFonts w:hint="eastAsia"/>
-        </w:rPr>
-        <w:t>s</w:t>
-      </w:r>
-      <w:r>
-        <w:t xml:space="preserve"> how </w:t>
-      </w:r>
-      <w:r>
-        <w:rPr>
-          <w:rFonts w:hint="eastAsia"/>
-        </w:rPr>
-        <w:t xml:space="preserve">campaign </w:t>
-      </w:r>
-      <w:r>
-        <w:t xml:space="preserve">delays influence </w:t>
-      </w:r>
-      <w:r>
-        <w:rPr>
-          <w:rFonts w:hint="eastAsia"/>
-        </w:rPr>
-        <w:t>the impact of ORI</w:t>
-      </w:r>
-      <w:r>
-        <w:t xml:space="preserve">, </w:t>
-      </w:r>
-      <w:r>
-        <w:rPr>
-          <w:rFonts w:hint="eastAsia"/>
-        </w:rPr>
-        <w:t xml:space="preserve">offering </w:t>
-      </w:r>
-      <w:r>
-        <w:t xml:space="preserve">insights into the </w:t>
-      </w:r>
-      <w:r>
-        <w:rPr>
-          <w:rFonts w:hint="eastAsia"/>
-        </w:rPr>
-        <w:t>interplay</w:t>
-      </w:r>
-      <w:r>
-        <w:t xml:space="preserve"> between </w:t>
-      </w:r>
-      <w:r>
-        <w:t>the</w:t>
-      </w:r>
-      <w:r>
-        <w:rPr>
-          <w:rFonts w:hint="eastAsia"/>
-        </w:rPr>
-        <w:t xml:space="preserve"> </w:t>
-      </w:r>
-      <w:r>
-        <w:rPr>
-          <w:rFonts w:hint="eastAsia"/>
-        </w:rPr>
-        <w:t xml:space="preserve">timing and </w:t>
-      </w:r>
-      <w:r>
-        <w:rPr>
-          <w:rFonts w:hint="eastAsia"/>
-        </w:rPr>
-        <w:t xml:space="preserve">the </w:t>
-      </w:r>
-      <w:r>
-        <w:rPr>
-          <w:rFonts w:hint="eastAsia"/>
-        </w:rPr>
-        <w:t>impact</w:t>
-      </w:r>
-      <w:r>
-        <w:rPr>
-          <w:rFonts w:hint="eastAsia"/>
-        </w:rPr>
-        <w:t xml:space="preserve"> of ORI</w:t>
-      </w:r>
-      <w:r>
+        <w:t>isolates the effect of response delay, clarifying how timing influences ORI impact.</w:t>
+      </w:r>
+      <w:r>
+        <w:t xml:space="preserve"> </w:t>
+      </w:r>
+      <w:r>
+        <w:rPr>
+          <w:rFonts w:hint="eastAsia"/>
+        </w:rPr>
+        <w:t>T</w:t>
+      </w:r>
+      <w:r>
+        <w:rPr>
+          <w:rFonts w:hint="eastAsia"/>
+        </w:rPr>
+        <w:t xml:space="preserve">he </w:t>
+      </w:r>
+      <w:r>
+        <w:rPr>
+          <w:rFonts w:hint="eastAsia"/>
+        </w:rPr>
+        <w:t>c</w:t>
+      </w:r>
+      <w:r>
+        <w:t>ase-</w:t>
+      </w:r>
+      <w:r>
+        <w:t>t</w:t>
+      </w:r>
+      <w:r>
+        <w:t xml:space="preserve">riggered </w:t>
+      </w:r>
+      <w:r>
+        <w:rPr>
+          <w:rFonts w:hint="eastAsia"/>
+        </w:rPr>
+        <w:t>approach</w:t>
+      </w:r>
+      <w:r>
+        <w:t xml:space="preserve"> </w:t>
+      </w:r>
+      <w:r>
+        <w:rPr>
+          <w:rFonts w:hint="eastAsia"/>
+        </w:rPr>
+        <w:t>reflects</w:t>
+      </w:r>
+      <w:r>
+        <w:rPr>
+          <w:rFonts w:hint="eastAsia"/>
+        </w:rPr>
+        <w:t xml:space="preserve"> </w:t>
+      </w:r>
+      <w:r>
+        <w:rPr>
+          <w:rFonts w:hint="eastAsia"/>
+        </w:rPr>
+        <w:t>potentially</w:t>
+      </w:r>
+      <w:r>
+        <w:rPr>
+          <w:rFonts w:hint="eastAsia"/>
+        </w:rPr>
+        <w:t xml:space="preserve"> more</w:t>
+      </w:r>
+      <w:r>
+        <w:rPr>
+          <w:rFonts w:hint="eastAsia"/>
+        </w:rPr>
+        <w:t xml:space="preserve"> realistic</w:t>
+      </w:r>
+      <w:r>
+        <w:t xml:space="preserve"> </w:t>
+      </w:r>
+      <w:r>
+        <w:t>conditions in which uncertainty in surveillance or confirmation delays may postpone the start of campaigns</w:t>
+      </w:r>
+      <w:r>
+        <w:rPr>
+          <w:rFonts w:hint="eastAsia"/>
+        </w:rPr>
         <w:t xml:space="preserve">. </w:t>
       </w:r>
       <w:r>
-        <w:rPr>
-          <w:rFonts w:hint="eastAsia"/>
-        </w:rPr>
-        <w:t>T</w:t>
-      </w:r>
-      <w:r>
-        <w:rPr>
-          <w:rFonts w:hint="eastAsia"/>
-        </w:rPr>
-        <w:t xml:space="preserve">he </w:t>
-      </w:r>
-      <w:r>
-        <w:rPr>
-          <w:rFonts w:hint="eastAsia"/>
-        </w:rPr>
-        <w:t>c</w:t>
-      </w:r>
-      <w:r>
-        <w:t>ase-</w:t>
-      </w:r>
-      <w:r>
-        <w:t>t</w:t>
-      </w:r>
-      <w:r>
-        <w:t xml:space="preserve">riggered </w:t>
-      </w:r>
-      <w:r>
-        <w:rPr>
-          <w:rFonts w:hint="eastAsia"/>
-        </w:rPr>
-        <w:t>approach</w:t>
-      </w:r>
-      <w:r>
-        <w:t xml:space="preserve"> </w:t>
-      </w:r>
-      <w:r>
-        <w:rPr>
-          <w:rFonts w:hint="eastAsia"/>
-        </w:rPr>
-        <w:t xml:space="preserve">adds additional </w:t>
-      </w:r>
-      <w:r>
-        <w:t xml:space="preserve">real-world </w:t>
-      </w:r>
-      <w:r>
-        <w:t>delays</w:t>
-      </w:r>
-      <w:r>
-        <w:t xml:space="preserve"> </w:t>
-      </w:r>
-      <w:r>
-        <w:rPr>
-          <w:rFonts w:hint="eastAsia"/>
-        </w:rPr>
-        <w:t xml:space="preserve">in which </w:t>
-      </w:r>
-      <w:r>
-        <w:rPr>
-          <w:rFonts w:hint="eastAsia"/>
-        </w:rPr>
-        <w:t xml:space="preserve">the </w:t>
-      </w:r>
-      <w:r>
-        <w:t>exact</w:t>
-      </w:r>
-      <w:r>
-        <w:rPr>
-          <w:rFonts w:hint="eastAsia"/>
-        </w:rPr>
-        <w:t xml:space="preserve"> start dat</w:t>
-      </w:r>
-      <w:r>
-        <w:rPr>
-          <w:rFonts w:hint="eastAsia"/>
-        </w:rPr>
-        <w:t>e</w:t>
-      </w:r>
-      <w:r>
-        <w:rPr>
-          <w:rFonts w:hint="eastAsia"/>
-        </w:rPr>
-        <w:t xml:space="preserve"> may be uncertain</w:t>
-      </w:r>
-      <w:r>
-        <w:rPr>
-          <w:rFonts w:hint="eastAsia"/>
-        </w:rPr>
-        <w:t xml:space="preserve"> </w:t>
-      </w:r>
-      <w:r>
-        <w:rPr>
-          <w:rFonts w:hint="eastAsia"/>
-        </w:rPr>
-        <w:t xml:space="preserve">(e.g., because of poor surveillance) </w:t>
-      </w:r>
-      <w:r>
-        <w:rPr>
-          <w:rFonts w:hint="eastAsia"/>
-        </w:rPr>
-        <w:t xml:space="preserve">and an ORI is triggered only after some </w:t>
-      </w:r>
-      <w:r>
-        <w:rPr>
-          <w:rFonts w:hint="eastAsia"/>
-        </w:rPr>
-        <w:t>threshold</w:t>
-      </w:r>
-      <w:r>
-        <w:rPr>
-          <w:rFonts w:hint="eastAsia"/>
-        </w:rPr>
-        <w:t xml:space="preserve"> number </w:t>
-      </w:r>
-      <w:r>
-        <w:rPr>
-          <w:rFonts w:hint="eastAsia"/>
-        </w:rPr>
-        <w:t xml:space="preserve">of cases </w:t>
-      </w:r>
-      <w:r>
-        <w:rPr>
-          <w:rFonts w:hint="eastAsia"/>
-        </w:rPr>
-        <w:t xml:space="preserve">is reached. </w:t>
-      </w:r>
-      <w:r>
-        <w:rPr>
-          <w:rFonts w:hint="eastAsia"/>
-        </w:rPr>
-        <w:t xml:space="preserve">Under the case-triggered approach, </w:t>
-      </w:r>
-      <w:r>
-        <w:rPr>
-          <w:rFonts w:hint="eastAsia"/>
-        </w:rPr>
-        <w:t>the same cumulative</w:t>
-      </w:r>
-      <w:r>
-        <w:rPr>
-          <w:rFonts w:hint="eastAsia"/>
-        </w:rPr>
-        <w:t>-</w:t>
-      </w:r>
-      <w:r>
-        <w:rPr>
-          <w:rFonts w:hint="eastAsia"/>
-        </w:rPr>
-        <w:t>case</w:t>
-      </w:r>
-      <w:r>
-        <w:rPr>
-          <w:rFonts w:hint="eastAsia"/>
-        </w:rPr>
-        <w:t xml:space="preserve"> threshold could trigger </w:t>
-      </w:r>
-      <w:r>
-        <w:rPr>
-          <w:rFonts w:hint="eastAsia"/>
-        </w:rPr>
-        <w:t>ORIs</w:t>
-      </w:r>
-      <w:r>
-        <w:rPr>
-          <w:rFonts w:hint="eastAsia"/>
-        </w:rPr>
-        <w:t xml:space="preserve"> earlier</w:t>
-      </w:r>
-      <w:r>
-        <w:rPr>
-          <w:rFonts w:hint="eastAsia"/>
-        </w:rPr>
-        <w:t xml:space="preserve"> </w:t>
-      </w:r>
-      <w:r>
-        <w:rPr>
-          <w:rFonts w:hint="eastAsia"/>
-        </w:rPr>
-        <w:t>in</w:t>
-      </w:r>
-      <w:r>
-        <w:rPr>
-          <w:rFonts w:hint="eastAsia"/>
-        </w:rPr>
-        <w:t xml:space="preserve"> </w:t>
-      </w:r>
-      <w:r>
-        <w:rPr>
-          <w:rFonts w:hint="eastAsia"/>
-        </w:rPr>
-        <w:t xml:space="preserve">more rapidly growing </w:t>
-      </w:r>
-      <w:r>
-        <w:rPr>
-          <w:rFonts w:hint="eastAsia"/>
-        </w:rPr>
-        <w:t xml:space="preserve">outbreaks </w:t>
-      </w:r>
-      <w:r>
-        <w:rPr>
-          <w:rFonts w:hint="eastAsia"/>
-        </w:rPr>
-        <w:t>and later</w:t>
-      </w:r>
-      <w:r>
-        <w:rPr>
-          <w:rFonts w:hint="eastAsia"/>
-        </w:rPr>
-        <w:t xml:space="preserve"> </w:t>
-      </w:r>
-      <w:r>
-        <w:rPr>
-          <w:rFonts w:hint="eastAsia"/>
-        </w:rPr>
-        <w:t xml:space="preserve">in </w:t>
-      </w:r>
-      <w:r>
-        <w:rPr>
-          <w:rFonts w:hint="eastAsia"/>
-        </w:rPr>
-        <w:t xml:space="preserve">more slowly growing </w:t>
-      </w:r>
-      <w:r>
-        <w:rPr>
-          <w:rFonts w:hint="eastAsia"/>
-        </w:rPr>
-        <w:t>outbreaks</w:t>
-      </w:r>
-      <w:r>
-        <w:t xml:space="preserve">. </w:t>
+        <w:t>Under this scenario, identical case thresholds may trigger earlier responses in rapidly growing outbreaks and later responses in slower ones.</w:t>
+      </w:r>
+      <w:r>
+        <w:t xml:space="preserve"> </w:t>
       </w:r>
     </w:p>
     <w:p/>
@@ -9993,130 +9716,40 @@
         <w:rPr>
           <w:rFonts w:hint="eastAsia"/>
         </w:rPr>
-        <w:t xml:space="preserve"> levels</w:t>
-      </w:r>
-      <w:r>
-        <w:t xml:space="preserve"> were</w:t>
-      </w:r>
-      <w:r>
-        <w:rPr>
-          <w:rFonts w:hint="eastAsia"/>
-        </w:rPr>
-        <w:t xml:space="preserve"> varied from</w:t>
-      </w:r>
-      <w:r>
-        <w:t xml:space="preserve"> 60</w:t>
-      </w:r>
-      <w:r>
-        <w:rPr>
-          <w:rFonts w:hint="eastAsia"/>
-        </w:rPr>
-        <w:t>%</w:t>
-      </w:r>
-      <w:r>
-        <w:t xml:space="preserve"> to 9</w:t>
-      </w:r>
-      <w:r>
-        <w:rPr>
-          <w:rFonts w:hint="eastAsia"/>
-        </w:rPr>
-        <w:t>0</w:t>
-      </w:r>
-      <w:r>
-        <w:rPr>
-          <w:rFonts w:hint="eastAsia"/>
-        </w:rPr>
-        <w:t>%</w:t>
-      </w:r>
-      <w:r>
-        <w:t xml:space="preserve"> of the </w:t>
-      </w:r>
-      <w:r>
-        <w:rPr>
-          <w:rFonts w:hint="eastAsia"/>
-        </w:rPr>
-        <w:t xml:space="preserve">affected </w:t>
-      </w:r>
-      <w:r>
-        <w:t>population</w:t>
-      </w:r>
-      <w:r>
-        <w:t>—</w:t>
-      </w:r>
-      <w:r>
-        <w:rPr>
-          <w:rFonts w:hint="eastAsia"/>
-        </w:rPr>
-        <w:t>an a</w:t>
-      </w:r>
-      <w:r>
-        <w:t>dministrative unit</w:t>
-      </w:r>
-      <w:r>
-        <w:rPr>
-          <w:rFonts w:hint="eastAsia"/>
-        </w:rPr>
-        <w:t xml:space="preserve"> </w:t>
-      </w:r>
-      <w:r>
-        <w:rPr>
-          <w:rFonts w:hint="eastAsia"/>
-        </w:rPr>
-        <w:t>where</w:t>
-      </w:r>
-      <w:r>
-        <w:rPr>
-          <w:rFonts w:hint="eastAsia"/>
-        </w:rPr>
-        <w:t xml:space="preserve"> </w:t>
-      </w:r>
-      <w:r>
-        <w:t xml:space="preserve">the outbreak </w:t>
-      </w:r>
-      <w:r>
-        <w:rPr>
-          <w:rFonts w:hint="eastAsia"/>
-        </w:rPr>
-        <w:t xml:space="preserve">was </w:t>
-      </w:r>
-      <w:r>
-        <w:rPr>
-          <w:rFonts w:hint="eastAsia"/>
-        </w:rPr>
-        <w:t>reported</w:t>
-      </w:r>
-      <w:r>
-        <w:t>. The vaccine coverage</w:t>
-      </w:r>
-      <w:r>
-        <w:t>s</w:t>
-      </w:r>
-      <w:r>
-        <w:t xml:space="preserve"> </w:t>
-      </w:r>
-      <w:r>
-        <w:t xml:space="preserve">were </w:t>
-      </w:r>
-      <w:r>
-        <w:rPr>
-          <w:rFonts w:hint="eastAsia"/>
-        </w:rPr>
-        <w:t xml:space="preserve">chosen </w:t>
-      </w:r>
-      <w:r>
-        <w:rPr>
-          <w:rFonts w:hint="eastAsia"/>
-        </w:rPr>
-        <w:t xml:space="preserve">based on trends </w:t>
-      </w:r>
-      <w:r>
-        <w:t>observ</w:t>
-      </w:r>
-      <w:r>
-        <w:rPr>
-          <w:rFonts w:hint="eastAsia"/>
-        </w:rPr>
-        <w:t>ed in</w:t>
+        <w:t xml:space="preserve"> </w:t>
+      </w:r>
+      <w:r>
+        <w:rPr>
+          <w:rFonts w:hint="eastAsia"/>
+        </w:rPr>
+        <w:t>was</w:t>
+      </w:r>
+      <w:r>
+        <w:rPr>
+          <w:rFonts w:hint="eastAsia"/>
+        </w:rPr>
+        <w:t xml:space="preserve"> varied </w:t>
+      </w:r>
+      <w:r>
+        <w:rPr>
+          <w:rFonts w:hint="eastAsia"/>
+        </w:rPr>
+        <w:t>a</w:t>
+      </w:r>
+      <w:r>
+        <w:t>cross 60 %, 75 %, and 90 % of the affected administrative unit’s population</w:t>
+      </w:r>
+      <w:r>
+        <w:rPr>
+          <w:rFonts w:hint="eastAsia"/>
+        </w:rPr>
+        <w:t xml:space="preserve">, consistent with ranges observed </w:t>
+      </w:r>
+      <w:r>
+        <w:rPr>
+          <w:rFonts w:hint="eastAsia"/>
+        </w:rPr>
+        <w:t>in</w:t>
       </w:r>
       <w:r>
         <w:t xml:space="preserve"> global OCV campaigns </w:t>
@@ -10230,61 +9863,47 @@
         <w:t xml:space="preserve"> 75% </w:t>
       </w:r>
       <w:r>
-        <w:t xml:space="preserve">coverage </w:t>
-      </w:r>
-      <w:r>
-        <w:rPr>
-          <w:rFonts w:hint="eastAsia"/>
-        </w:rPr>
-        <w:t>as a</w:t>
-      </w:r>
-      <w:r>
-        <w:t xml:space="preserve"> representative value for a single-dose regimen </w:t>
-      </w:r>
-      <w:r>
-        <w:rPr>
-          <w:rFonts w:hint="eastAsia"/>
-        </w:rPr>
-        <w:t xml:space="preserve">, reflecting </w:t>
-      </w:r>
-      <w:r>
-        <w:rPr>
-          <w:rFonts w:hint="eastAsia"/>
-        </w:rPr>
-        <w:t xml:space="preserve">estimated </w:t>
-      </w:r>
-      <w:r>
-        <w:t>coverage</w:t>
-      </w:r>
-      <w:r>
-        <w:rPr>
-          <w:rFonts w:hint="eastAsia"/>
-        </w:rPr>
-        <w:t xml:space="preserve"> level</w:t>
-      </w:r>
-      <w:r>
-        <w:t>s</w:t>
-      </w:r>
-      <w:r>
-        <w:t xml:space="preserve"> </w:t>
-      </w:r>
-      <w:r>
-        <w:rPr>
-          <w:rFonts w:hint="eastAsia"/>
-        </w:rPr>
-        <w:t xml:space="preserve">typically observed </w:t>
-      </w:r>
-      <w:r>
-        <w:t xml:space="preserve">during OCV </w:t>
-      </w:r>
-      <w:r>
-        <w:rPr>
-          <w:rFonts w:hint="eastAsia"/>
-        </w:rPr>
-        <w:t>responses in</w:t>
-      </w:r>
-      <w:r>
-        <w:t xml:space="preserve"> humanitarian crises or outbreaks (</w:t>
+        <w:rPr>
+          <w:rFonts w:hint="eastAsia"/>
+        </w:rPr>
+        <w:t xml:space="preserve">as </w:t>
+      </w:r>
+      <w:r>
+        <w:rPr>
+          <w:rFonts w:hint="eastAsia"/>
+        </w:rPr>
+        <w:t xml:space="preserve">the </w:t>
+      </w:r>
+      <w:r>
+        <w:t xml:space="preserve">representative single-dose </w:t>
+      </w:r>
+      <w:r>
+        <w:rPr>
+          <w:rFonts w:hint="eastAsia"/>
+        </w:rPr>
+        <w:t>coverage,</w:t>
+      </w:r>
+      <w:r>
+        <w:rPr>
+          <w:rFonts w:hint="eastAsia"/>
+        </w:rPr>
+        <w:t xml:space="preserve"> </w:t>
+      </w:r>
+      <w:r>
+        <w:t>reflecting levels typically achieved in</w:t>
+      </w:r>
+      <w:r>
+        <w:rPr>
+          <w:rFonts w:hint="eastAsia"/>
+        </w:rPr>
+        <w:t xml:space="preserve"> </w:t>
+      </w:r>
+      <w:r>
+        <w:t xml:space="preserve">humanitarian crises or outbreaks </w:t>
+      </w:r>
+      <w:r>
+        <w:lastRenderedPageBreak/>
+        <w:t>(</w:t>
       </w:r>
       <w:r>
         <w:t xml:space="preserve">Supplementary Information </w:t>
@@ -10315,28 +9934,64 @@
         <w:t xml:space="preserve"> T</w:t>
       </w:r>
       <w:r>
-        <w:t>he delay in protective immunity post-vaccination</w:t>
-      </w:r>
-      <w:r>
-        <w:rPr>
-          <w:rFonts w:hint="eastAsia"/>
-        </w:rPr>
-        <w:t xml:space="preserve"> was </w:t>
-      </w:r>
-      <w:r>
-        <w:rPr>
-          <w:rFonts w:hint="eastAsia"/>
-        </w:rPr>
-        <w:t xml:space="preserve">chosen </w:t>
-      </w:r>
-      <w:r>
-        <w:t>reflecting the time required for seroconversion</w:t>
-      </w:r>
-      <w:r>
-        <w:rPr>
-          <w:rFonts w:hint="eastAsia"/>
-        </w:rPr>
-        <w:t xml:space="preserve"> as a proxy</w:t>
+        <w:t xml:space="preserve">he delay </w:t>
+      </w:r>
+      <w:r>
+        <w:rPr>
+          <w:rFonts w:hint="eastAsia"/>
+        </w:rPr>
+        <w:t xml:space="preserve">between vaccination and the onset of </w:t>
+      </w:r>
+      <w:r>
+        <w:t>protecti</w:t>
+      </w:r>
+      <w:r>
+        <w:rPr>
+          <w:rFonts w:hint="eastAsia"/>
+        </w:rPr>
+        <w:t>on</w:t>
+      </w:r>
+      <w:r>
+        <w:t xml:space="preserve"> </w:t>
+      </w:r>
+      <w:r>
+        <w:rPr>
+          <w:rFonts w:hint="eastAsia"/>
+        </w:rPr>
+        <w:t xml:space="preserve">was </w:t>
+      </w:r>
+      <w:r>
+        <w:rPr>
+          <w:rFonts w:hint="eastAsia"/>
+        </w:rPr>
+        <w:t>based on observed</w:t>
+      </w:r>
+      <w:r>
+        <w:t xml:space="preserve"> seroconversion</w:t>
+      </w:r>
+      <w:r>
+        <w:rPr>
+          <w:rFonts w:hint="eastAsia"/>
+        </w:rPr>
+        <w:t xml:space="preserve"> </w:t>
+      </w:r>
+      <w:r>
+        <w:rPr>
+          <w:rFonts w:hint="eastAsia"/>
+        </w:rPr>
+        <w:t>times (</w:t>
+      </w:r>
+      <w:r>
+        <w:rPr>
+          <w:rFonts w:hint="eastAsia"/>
+        </w:rPr>
+        <w:t>proxy</w:t>
+      </w:r>
+      <w:r>
+        <w:rPr>
+          <w:rFonts w:hint="eastAsia"/>
+        </w:rPr>
+        <w:t xml:space="preserve"> for immune response),</w:t>
       </w:r>
       <w:r>
         <w:rPr>
@@ -10465,19 +10120,19 @@
         <w:fldChar w:fldCharType="end"/>
       </w:r>
       <w:r>
-        <w:t xml:space="preserve"> </w:t>
-      </w:r>
-      <w:r>
-        <w:rPr>
-          <w:rFonts w:hint="eastAsia"/>
-        </w:rPr>
-        <w:t xml:space="preserve">, which </w:t>
-      </w:r>
-      <w:r>
-        <w:t>occur between</w:t>
-      </w:r>
-      <w:r>
-        <w:t xml:space="preserve"> 3 to 28 days</w:t>
+        <w:rPr>
+          <w:rFonts w:hint="eastAsia"/>
+        </w:rPr>
+        <w:t xml:space="preserve"> </w:t>
+      </w:r>
+      <w:r>
+        <w:rPr>
+          <w:rFonts w:hint="eastAsia"/>
+        </w:rPr>
+        <w:t xml:space="preserve">ranging from </w:t>
+      </w:r>
+      <w:r>
+        <w:t>3 to 28 days</w:t>
       </w:r>
       <w:r>
         <w:rPr>
@@ -10492,10 +10147,31 @@
         <w:rPr>
           <w:rFonts w:hint="eastAsia"/>
         </w:rPr>
-        <w:t xml:space="preserve">) following the first </w:t>
-      </w:r>
-      <w:r>
-        <w:t xml:space="preserve">dose in a two-dose </w:t>
+        <w:t xml:space="preserve">) </w:t>
+      </w:r>
+      <w:r>
+        <w:rPr>
+          <w:rFonts w:hint="eastAsia"/>
+        </w:rPr>
+        <w:t xml:space="preserve">after </w:t>
+      </w:r>
+      <w:r>
+        <w:rPr>
+          <w:rFonts w:hint="eastAsia"/>
+        </w:rPr>
+        <w:t xml:space="preserve">the first </w:t>
+      </w:r>
+      <w:r>
+        <w:t xml:space="preserve">dose </w:t>
+      </w:r>
+      <w:r>
+        <w:rPr>
+          <w:rFonts w:hint="eastAsia"/>
+        </w:rPr>
+        <w:t>of</w:t>
+      </w:r>
+      <w:r>
+        <w:t xml:space="preserve"> a two-dose </w:t>
       </w:r>
       <w:r>
         <w:t>regimen</w:t>
@@ -10618,7 +10294,7 @@
           <w:b/>
           <w:bCs/>
         </w:rPr>
-        <w:t>7</w:t>
+        <w:t>4</w:t>
       </w:r>
       <w:r>
         <w:t>)</w:t>
@@ -10760,7 +10436,52 @@
               <w:spacing w:line="240" w:lineRule="auto"/>
             </w:pPr>
             <w:r>
-              <w:t>Targeted the entire population of the affected administrative area. Coverage ranged from 60% to 90% in 5% increments. Main text presents results for 60%, 75%, and 90%.</w:t>
+              <w:t>Target</w:t>
+            </w:r>
+            <w:r>
+              <w:rPr>
+                <w:rFonts w:hint="eastAsia"/>
+              </w:rPr>
+              <w:t xml:space="preserve"> population included the entire</w:t>
+            </w:r>
+            <w:r>
+              <w:t xml:space="preserve"> population of the affected administrative </w:t>
+            </w:r>
+            <w:r>
+              <w:rPr>
+                <w:rFonts w:hint="eastAsia"/>
+              </w:rPr>
+              <w:t>unit</w:t>
+            </w:r>
+            <w:r>
+              <w:t xml:space="preserve">. </w:t>
+            </w:r>
+            <w:r>
+              <w:rPr>
+                <w:rFonts w:hint="eastAsia"/>
+              </w:rPr>
+              <w:t>Three c</w:t>
+            </w:r>
+            <w:r>
+              <w:t xml:space="preserve">overage </w:t>
+            </w:r>
+            <w:r>
+              <w:rPr>
+                <w:rFonts w:hint="eastAsia"/>
+              </w:rPr>
+              <w:t xml:space="preserve">levels were modeled: </w:t>
+            </w:r>
+            <w:r>
+              <w:t xml:space="preserve">60%, 75%, </w:t>
+            </w:r>
+            <w:r>
+              <w:rPr>
+                <w:rFonts w:hint="eastAsia"/>
+              </w:rPr>
+              <w:t>and</w:t>
+            </w:r>
+            <w:r>
+              <w:t xml:space="preserve"> 90%.</w:t>
             </w:r>
           </w:p>
         </w:tc>
@@ -10787,7 +10508,6 @@
               </w:rPr>
             </w:pPr>
             <w:r>
-              <w:lastRenderedPageBreak/>
               <w:t>Campaign triggers</w:t>
             </w:r>
           </w:p>
@@ -10813,7 +10533,43 @@
               <w:t xml:space="preserve">(i) </w:t>
             </w:r>
             <w:r>
-              <w:t>Outbreak onset–triggered: Initiated 1–20 weeks after outbreak onset, in 1-week increments; implementation set at the midpoint of the specified week.</w:t>
+              <w:t xml:space="preserve">Outbreak onset–triggered: </w:t>
+            </w:r>
+            <w:r>
+              <w:rPr>
+                <w:rFonts w:hint="eastAsia"/>
+              </w:rPr>
+              <w:t>ORI i</w:t>
+            </w:r>
+            <w:r>
+              <w:t xml:space="preserve">nitiated </w:t>
+            </w:r>
+            <w:r>
+              <w:rPr>
+                <w:rFonts w:hint="eastAsia"/>
+              </w:rPr>
+              <w:t xml:space="preserve">in </w:t>
+            </w:r>
+            <w:r>
+              <w:t>1</w:t>
+            </w:r>
+            <w:r>
+              <w:rPr>
+                <w:rFonts w:hint="eastAsia"/>
+              </w:rPr>
+              <w:t>-15</w:t>
+            </w:r>
+            <w:r>
+              <w:t xml:space="preserve"> weeks </w:t>
+            </w:r>
+            <w:r>
+              <w:rPr>
+                <w:rFonts w:hint="eastAsia"/>
+              </w:rPr>
+              <w:t>after outbreak onset</w:t>
+            </w:r>
+            <w:r>
+              <w:t>, in 1-week increments; implementation set at the midpoint of the specified week.</w:t>
             </w:r>
           </w:p>
           <w:p>
@@ -10830,7 +10586,88 @@
               <w:t xml:space="preserve">(ii) </w:t>
             </w:r>
             <w:r>
-              <w:t>Case-triggered: Initiated once cumulative cases reached a predefined threshold (1, 10, 20, …, 100, 200, …, 1,000), followed by an additional 1–20 week implementation delay.</w:t>
+              <w:t xml:space="preserve">Case-triggered: </w:t>
+            </w:r>
+            <w:r>
+              <w:rPr>
+                <w:rFonts w:hint="eastAsia"/>
+              </w:rPr>
+              <w:t>ORI i</w:t>
+            </w:r>
+            <w:r>
+              <w:t xml:space="preserve">nitiated once cumulative cases reached a predefined threshold (1, </w:t>
+            </w:r>
+            <w:r>
+              <w:rPr>
+                <w:rFonts w:hint="eastAsia"/>
+              </w:rPr>
+              <w:t xml:space="preserve">5, </w:t>
+            </w:r>
+            <w:r>
+              <w:t xml:space="preserve">10, </w:t>
+            </w:r>
+            <w:r>
+              <w:rPr>
+                <w:rFonts w:hint="eastAsia"/>
+              </w:rPr>
+              <w:t>30</w:t>
+            </w:r>
+            <w:r>
+              <w:t xml:space="preserve">, </w:t>
+            </w:r>
+            <w:r>
+              <w:rPr>
+                <w:rFonts w:hint="eastAsia"/>
+              </w:rPr>
+              <w:t>50, 70</w:t>
+            </w:r>
+            <w:r>
+              <w:t>,</w:t>
+            </w:r>
+            <w:r>
+              <w:rPr>
+                <w:rFonts w:hint="eastAsia"/>
+              </w:rPr>
+              <w:t xml:space="preserve"> 90</w:t>
+            </w:r>
+            <w:r>
+              <w:t xml:space="preserve">, </w:t>
+            </w:r>
+            <w:r>
+              <w:rPr>
+                <w:rFonts w:hint="eastAsia"/>
+              </w:rPr>
+              <w:t xml:space="preserve">140, 190, 240, </w:t>
+            </w:r>
+            <w:r>
+              <w:t>2</w:t>
+            </w:r>
+            <w:r>
+              <w:rPr>
+                <w:rFonts w:hint="eastAsia"/>
+              </w:rPr>
+              <w:t>9</w:t>
+            </w:r>
+            <w:r>
+              <w:t>0</w:t>
+            </w:r>
+            <w:r>
+              <w:rPr>
+                <w:rFonts w:hint="eastAsia"/>
+              </w:rPr>
+              <w:t xml:space="preserve"> cases</w:t>
+            </w:r>
+            <w:r>
+              <w:t>), followed by an additional 1–</w:t>
+            </w:r>
+            <w:r>
+              <w:rPr>
+                <w:rFonts w:hint="eastAsia"/>
+              </w:rPr>
+              <w:t>15</w:t>
+            </w:r>
+            <w:r>
+              <w:t xml:space="preserve"> week implementation delay.</w:t>
             </w:r>
           </w:p>
         </w:tc>
@@ -10877,17 +10714,38 @@
           <w:p>
             <w:pPr>
               <w:spacing w:line="240" w:lineRule="auto"/>
+              <w:rPr>
+                <w:rFonts w:hint="eastAsia"/>
+              </w:rPr>
             </w:pPr>
             <w:r>
               <w:rPr>
                 <w:rFonts w:hint="eastAsia"/>
               </w:rPr>
-              <w:t>One round of vaccination per campa</w:t>
+              <w:t>Single-roun</w:t>
             </w:r>
             <w:r>
               <w:rPr>
                 <w:rFonts w:hint="eastAsia"/>
               </w:rPr>
+              <w:t>d vaccination</w:t>
+            </w:r>
+            <w:r>
+              <w:rPr>
+                <w:rFonts w:hint="eastAsia"/>
+              </w:rPr>
+              <w:t xml:space="preserve"> </w:t>
+            </w:r>
+            <w:r>
+              <w:rPr>
+                <w:rFonts w:hint="eastAsia"/>
+              </w:rPr>
+              <w:t>campa</w:t>
+            </w:r>
+            <w:r>
+              <w:rPr>
+                <w:rFonts w:hint="eastAsia"/>
+              </w:rPr>
               <w:t>ig</w:t>
             </w:r>
             <w:r>
@@ -10895,6 +10753,12 @@
                 <w:rFonts w:hint="eastAsia"/>
               </w:rPr>
               <w:t>n</w:t>
+            </w:r>
+            <w:r>
+              <w:rPr>
+                <w:rFonts w:hint="eastAsia"/>
+              </w:rPr>
+              <w:t xml:space="preserve"> per outbreak</w:t>
             </w:r>
           </w:p>
         </w:tc>
@@ -10938,9 +10802,12 @@
           <w:p>
             <w:pPr>
               <w:spacing w:line="240" w:lineRule="auto"/>
+              <w:rPr>
+                <w:rFonts w:hint="eastAsia"/>
+              </w:rPr>
             </w:pPr>
             <w:r>
-              <w:t>Analyses were performed across all reconstructed outbreaks and in subsets reflecting OCV stockpile deployments during 2013–2020.</w:t>
+              <w:t>Analyses performed at both the individual-outbreak level and in aggregated subsets selected by outbreak characteristics, including attack rate, duration, size, and case-fatality ratio.</w:t>
             </w:r>
           </w:p>
         </w:tc>
@@ -10960,24 +10827,53 @@
     </w:p>
     <w:p>
       <w:r>
-        <w:t xml:space="preserve">We evaluated cost-effectiveness by calculating the cost per case, death, and DALY averted. </w:t>
-      </w:r>
-      <w:r>
-        <w:rPr>
-          <w:rFonts w:hint="eastAsia"/>
-        </w:rPr>
-        <w:t xml:space="preserve">Following </w:t>
-      </w:r>
-      <w:r>
-        <w:t>a literature review</w:t>
-      </w:r>
-      <w:r>
-        <w:rPr>
-          <w:rFonts w:hint="eastAsia"/>
-        </w:rPr>
-        <w:t xml:space="preserve"> </w:t>
-      </w:r>
-      <w:r>
+        <w:rPr>
+          <w:rFonts w:hint="eastAsia"/>
+        </w:rPr>
+        <w:t>C</w:t>
+      </w:r>
+      <w:r>
+        <w:t xml:space="preserve">ost-effectiveness </w:t>
+      </w:r>
+      <w:r>
+        <w:rPr>
+          <w:rFonts w:hint="eastAsia"/>
+        </w:rPr>
+        <w:t xml:space="preserve">was assessed </w:t>
+      </w:r>
+      <w:r>
+        <w:rPr>
+          <w:rFonts w:hint="eastAsia"/>
+        </w:rPr>
+        <w:t xml:space="preserve">as </w:t>
+      </w:r>
+      <w:r>
+        <w:t xml:space="preserve">the cost per case, death, and DALY averted. </w:t>
+      </w:r>
+      <w:r>
+        <w:rPr>
+          <w:rFonts w:hint="eastAsia"/>
+          <w:highlight w:val="yellow"/>
+        </w:rPr>
+        <w:t xml:space="preserve">Cost estimates were based on a </w:t>
+      </w:r>
+      <w:r>
+        <w:rPr>
+          <w:highlight w:val="yellow"/>
+        </w:rPr>
+        <w:t>literature review</w:t>
+      </w:r>
+      <w:r>
+        <w:rPr>
+          <w:rFonts w:hint="eastAsia"/>
+          <w:highlight w:val="yellow"/>
+        </w:rPr>
+        <w:t xml:space="preserve"> </w:t>
+      </w:r>
+      <w:r>
+        <w:rPr>
+          <w:highlight w:val="yellow"/>
+        </w:rPr>
         <w:t>(</w:t>
       </w:r>
       <w:r>
@@ -10985,22 +10881,28 @@
           <w:rFonts w:hint="eastAsia"/>
           <w:b/>
           <w:bCs/>
+          <w:highlight w:val="yellow"/>
         </w:rPr>
         <w:t>Table 1</w:t>
       </w:r>
       <w:r>
         <w:rPr>
           <w:rFonts w:hint="eastAsia"/>
+          <w:highlight w:val="yellow"/>
         </w:rPr>
         <w:t xml:space="preserve"> and</w:t>
       </w:r>
       <w:r>
+        <w:rPr>
+          <w:highlight w:val="yellow"/>
+        </w:rPr>
         <w:t xml:space="preserve"> Supplementary Material </w:t>
       </w:r>
       <w:r>
         <w:rPr>
           <w:b/>
           <w:bCs/>
+          <w:highlight w:val="yellow"/>
         </w:rPr>
         <w:t>S</w:t>
       </w:r>
@@ -11009,41 +10911,54 @@
           <w:rFonts w:hint="eastAsia"/>
           <w:b/>
           <w:bCs/>
+          <w:highlight w:val="yellow"/>
         </w:rPr>
         <w:t>8</w:t>
       </w:r>
       <w:r>
+        <w:rPr>
+          <w:highlight w:val="yellow"/>
+        </w:rPr>
+        <w:t>).</w:t>
+      </w:r>
+      <w:r>
+        <w:t xml:space="preserve"> </w:t>
+      </w:r>
+      <w:r>
+        <w:rPr>
+          <w:rFonts w:hint="eastAsia"/>
+        </w:rPr>
+        <w:t>W</w:t>
+      </w:r>
+      <w:r>
+        <w:t>e adopted a societal perspective</w:t>
+      </w:r>
+      <w:r>
+        <w:rPr>
+          <w:rFonts w:hint="eastAsia"/>
+        </w:rPr>
+        <w:t xml:space="preserve">, including both </w:t>
+      </w:r>
+      <w:r>
+        <w:t>direct costs</w:t>
+      </w:r>
+      <w:r>
+        <w:rPr>
+          <w:rFonts w:hint="eastAsia"/>
+        </w:rPr>
+        <w:t xml:space="preserve"> (e.g., </w:t>
+      </w:r>
+      <w:r>
+        <w:t>vaccine procurement and healthcare utilization</w:t>
+      </w:r>
+      <w:r>
+        <w:rPr>
+          <w:rFonts w:hint="eastAsia"/>
+        </w:rPr>
         <w:t>)</w:t>
       </w:r>
       <w:r>
-        <w:rPr>
-          <w:rFonts w:hint="eastAsia"/>
-        </w:rPr>
-        <w:t xml:space="preserve">, we selected </w:t>
-      </w:r>
-      <w:r>
-        <w:t>recent, high-quality cost estimates representative of our modeling data.</w:t>
-      </w:r>
-      <w:r>
-        <w:t xml:space="preserve"> To </w:t>
-      </w:r>
-      <w:r>
-        <w:rPr>
-          <w:rFonts w:hint="eastAsia"/>
-        </w:rPr>
-        <w:t xml:space="preserve">be </w:t>
-      </w:r>
-      <w:r>
-        <w:t>comprehensive, we adopted a societal perspective</w:t>
-      </w:r>
-      <w:r>
-        <w:rPr>
-          <w:rFonts w:hint="eastAsia"/>
-        </w:rPr>
-        <w:t xml:space="preserve"> that includes </w:t>
-      </w:r>
-      <w:r>
-        <w:t>direct costs</w:t>
+        <w:t xml:space="preserve"> and indirect costs</w:t>
       </w:r>
       <w:r>
         <w:rPr>
@@ -11052,7 +10967,7 @@
         <w:t xml:space="preserve"> (e.g., </w:t>
       </w:r>
       <w:r>
-        <w:t>vaccine procurement and healthcare utilization</w:t>
+        <w:t>productivity losses</w:t>
       </w:r>
       <w:r>
         <w:rPr>
@@ -11061,42 +10976,6 @@
         <w:t>)</w:t>
       </w:r>
       <w:r>
-        <w:t xml:space="preserve"> and indirect costs</w:t>
-      </w:r>
-      <w:r>
-        <w:rPr>
-          <w:rFonts w:hint="eastAsia"/>
-        </w:rPr>
-        <w:t xml:space="preserve"> (e.g., </w:t>
-      </w:r>
-      <w:r>
-        <w:t>productivity losses</w:t>
-      </w:r>
-      <w:r>
-        <w:rPr>
-          <w:rFonts w:hint="eastAsia"/>
-        </w:rPr>
-        <w:t>)</w:t>
-      </w:r>
-      <w:r>
-        <w:t xml:space="preserve">. This perspective provides a holistic </w:t>
-      </w:r>
-      <w:r>
-        <w:rPr>
-          <w:rFonts w:hint="eastAsia"/>
-        </w:rPr>
-        <w:t xml:space="preserve">view of </w:t>
-      </w:r>
-      <w:r>
-        <w:t>ORI intervention</w:t>
-      </w:r>
-      <w:r>
-        <w:rPr>
-          <w:rFonts w:hint="eastAsia"/>
-        </w:rPr>
-        <w:t>s</w:t>
-      </w:r>
-      <w:r>
         <w:t>.</w:t>
       </w:r>
       <w:r>
@@ -11115,37 +10994,10 @@
         <w:rPr>
           <w:rFonts w:hint="eastAsia"/>
         </w:rPr>
-        <w:t>$</w:t>
-      </w:r>
-      <w:r>
-        <w:t xml:space="preserve"> equivalents by </w:t>
-      </w:r>
-      <w:r>
-        <w:rPr>
-          <w:rFonts w:hint="eastAsia"/>
-        </w:rPr>
-        <w:t xml:space="preserve">inflating </w:t>
-      </w:r>
-      <w:r>
-        <w:t xml:space="preserve">the costs from the </w:t>
-      </w:r>
-      <w:r>
-        <w:rPr>
-          <w:rFonts w:hint="eastAsia"/>
-        </w:rPr>
-        <w:t xml:space="preserve">original </w:t>
-      </w:r>
-      <w:r>
-        <w:t xml:space="preserve">reporting year </w:t>
-      </w:r>
-      <w:r>
-        <w:rPr>
-          <w:rFonts w:hint="eastAsia"/>
-        </w:rPr>
-        <w:t>b</w:t>
-      </w:r>
-      <w:r>
-        <w:t>ased on annual consumer price index change</w:t>
+        <w:t xml:space="preserve"> dollars, adjusting for inflation using </w:t>
+      </w:r>
+      <w:r>
+        <w:t>annual consumer price index change</w:t>
       </w:r>
       <w:r>
         <w:rPr>
@@ -11196,6 +11048,7 @@
       <w:bookmarkStart w:id="26" w:name="_Toc184909204"/>
       <w:bookmarkEnd w:id="25"/>
       <w:r>
+        <w:lastRenderedPageBreak/>
         <w:t>Result</w:t>
       </w:r>
       <w:r>
@@ -11454,7 +11307,6 @@
         <w:rPr>
           <w:rFonts w:hint="eastAsia"/>
         </w:rPr>
-        <w:lastRenderedPageBreak/>
         <w:t>geographic scales, such as at the country level</w:t>
       </w:r>
       <w:r>
@@ -12231,7 +12083,11 @@
         <w:t xml:space="preserve"> </w:t>
       </w:r>
       <w:r>
-        <w:t>Higher vaccine coverage consistently yielded greater benefit</w:t>
+        <w:t xml:space="preserve">Higher vaccine </w:t>
+      </w:r>
+      <w:r>
+        <w:lastRenderedPageBreak/>
+        <w:t>coverage consistently yielded greater benefit</w:t>
       </w:r>
       <w:r>
         <w:rPr>
@@ -12619,14 +12475,7 @@
         <w:rPr>
           <w:lang w:val="en-US"/>
         </w:rPr>
-        <w:t xml:space="preserve">Delay also causes some outbreaks to be missed entirely because </w:t>
-      </w:r>
-      <w:r>
-        <w:rPr>
-          <w:lang w:val="en-US"/>
-        </w:rPr>
-        <w:lastRenderedPageBreak/>
-        <w:t>vaccination would not occur before the outbreak ends (</w:t>
+        <w:t>Delay also causes some outbreaks to be missed entirely because vaccination would not occur before the outbreak ends (</w:t>
       </w:r>
       <w:r>
         <w:rPr>
@@ -13147,6 +12996,7 @@
         <w:t xml:space="preserve"> </w:t>
       </w:r>
       <w:r>
+        <w:lastRenderedPageBreak/>
         <w:t xml:space="preserve">cases averted </w:t>
       </w:r>
       <w:r>
@@ -13457,11 +13307,7 @@
         <w:t xml:space="preserve">, </w:t>
       </w:r>
       <w:r>
-        <w:t xml:space="preserve">initiated in </w:t>
-      </w:r>
-      <w:r>
-        <w:lastRenderedPageBreak/>
-        <w:t xml:space="preserve">the first week, </w:t>
+        <w:t xml:space="preserve">initiated in the first week, </w:t>
       </w:r>
       <w:r>
         <w:rPr>
@@ -13954,7 +13800,11 @@
         <w:t>, death,</w:t>
       </w:r>
       <w:r>
-        <w:t xml:space="preserve"> and DALY averted </w:t>
+        <w:t xml:space="preserve"> and </w:t>
+      </w:r>
+      <w:r>
+        <w:lastRenderedPageBreak/>
+        <w:t xml:space="preserve">DALY averted </w:t>
       </w:r>
       <w:r>
         <w:rPr>
@@ -14046,11 +13896,7 @@
     </w:p>
     <w:p>
       <w:r>
-        <w:t xml:space="preserve">Assuming 100,000 to 200 million OCV doses, the number of outbreaks eligible for ORI ranged from 1 to &gt;530 when targeted at random. Because outbreaks differ in population affected, the number of outbreaks targeted decreased when prioritizing larger outbreaks (approximately 480 outbreaks) and increased when prioritizing high-attack-rate (AR) </w:t>
-      </w:r>
-      <w:r>
-        <w:lastRenderedPageBreak/>
-        <w:t>outbreaks (≈ 800 outbreaks)</w:t>
+        <w:t>Assuming 100,000 to 200 million OCV doses, the number of outbreaks eligible for ORI ranged from 1 to &gt;530 when targeted at random. Because outbreaks differ in population affected, the number of outbreaks targeted decreased when prioritizing larger outbreaks (approximately 480 outbreaks) and increased when prioritizing high-attack-rate (AR) outbreaks (≈ 800 outbreaks)</w:t>
       </w:r>
       <w:r>
         <w:rPr>
@@ -14184,7 +14030,11 @@
         <w:t xml:space="preserve">). As the number of doses increased, targeting high-AR outbreaks consistently produced the </w:t>
       </w:r>
       <w:r>
-        <w:t>highest efficiency, exceeding 2 cases averted per 1,000 doses with a 1-week delay and about 1 case per 1,000 doses with a 9-week delay, while other strategies remained lower. The pattern for DALYs averted per 1,000 doses mirrored that of cases averted but with smaller magnitude—approximately 0.6 for high-AR targeting at a 1-week delay and 0.3–0.4 for other strategies (</w:t>
+        <w:t xml:space="preserve">highest efficiency, exceeding 2 cases averted per 1,000 doses with a 1-week delay and about 1 case per 1,000 doses with a 9-week delay, while other strategies remained lower. The pattern for DALYs averted per 1,000 doses mirrored that of cases averted but with </w:t>
+      </w:r>
+      <w:r>
+        <w:lastRenderedPageBreak/>
+        <w:t>smaller magnitude—approximately 0.6 for high-AR targeting at a 1-week delay and 0.3–0.4 for other strategies (</w:t>
       </w:r>
       <w:r>
         <w:rPr>
@@ -14799,7 +14649,11 @@
         <w:t xml:space="preserve"> contrast with the lower median impact observed when vaccination scenarios were evaluated at the level of individual outbreaks—e.g., </w:t>
       </w:r>
       <w:r>
-        <w:t>12.3 [IQR: 1.7 - 34.2]</w:t>
+        <w:t xml:space="preserve">12.3 [IQR: </w:t>
+      </w:r>
+      <w:r>
+        <w:lastRenderedPageBreak/>
+        <w:t>1.7 - 34.2]</w:t>
       </w:r>
       <w:r>
         <w:rPr>
@@ -15296,15 +15150,7 @@
           <w:rFonts w:hint="eastAsia"/>
           <w:lang w:val="en-US"/>
         </w:rPr>
-        <w:t xml:space="preserve">as previously </w:t>
-      </w:r>
-      <w:r>
-        <w:rPr>
-          <w:rFonts w:hint="eastAsia"/>
-          <w:lang w:val="en-US"/>
-        </w:rPr>
-        <w:lastRenderedPageBreak/>
-        <w:t xml:space="preserve">shown in </w:t>
+        <w:t xml:space="preserve">as previously shown in </w:t>
       </w:r>
       <w:r>
         <w:rPr>
@@ -15682,7 +15528,11 @@
         <w:t xml:space="preserve"> weeks.</w:t>
       </w:r>
       <w:r>
-        <w:t xml:space="preserve"> Vaccine efficiency showed a similar decline, dropping from roughly 0.7 to 0.1 cases averted per 1,000 vaccinated persons over the same delay interval.</w:t>
+        <w:t xml:space="preserve"> Vaccine efficiency </w:t>
+      </w:r>
+      <w:r>
+        <w:lastRenderedPageBreak/>
+        <w:t>showed a similar decline, dropping from roughly 0.7 to 0.1 cases averted per 1,000 vaccinated persons over the same delay interval.</w:t>
       </w:r>
       <w:r>
         <w:rPr>
@@ -15841,11 +15691,7 @@
         <w:t xml:space="preserve"> or duration</w:t>
       </w:r>
       <w:r>
-        <w:t xml:space="preserve"> at the time of response, such prediction may be partially feasible using known risk factors—such as environmental indicators, </w:t>
-      </w:r>
-      <w:r>
-        <w:lastRenderedPageBreak/>
-        <w:t>socioeconomic conditions (e.g., poverty, literacy, healthcare access), and WASH infrastructure.</w:t>
+        <w:t xml:space="preserve"> at the time of response, such prediction may be partially feasible using known risk factors—such as environmental indicators, socioeconomic conditions (e.g., poverty, literacy, healthcare access), and WASH infrastructure.</w:t>
       </w:r>
       <w:r>
         <w:fldChar w:fldCharType="begin"/>
@@ -16041,7 +15887,14 @@
         <w:rPr>
           <w:rFonts w:hint="eastAsia"/>
         </w:rPr>
-        <w:t xml:space="preserve"> as large uncertainty intervals in plots presented throughout. As an illustration, percent case averted can vary from zero to close to 100 % regardless of delays in ORIs implementation. Similarly, OCV efficiency could vary from 0 to </w:t>
+        <w:t xml:space="preserve"> as large uncertainty intervals in plots presented throughout. As an illustration, percent case averted can vary from zero to close to 100 % regardless of delays in ORIs implementation. </w:t>
+      </w:r>
+      <w:r>
+        <w:rPr>
+          <w:rFonts w:hint="eastAsia"/>
+        </w:rPr>
+        <w:lastRenderedPageBreak/>
+        <w:t xml:space="preserve">Similarly, OCV efficiency could vary from 0 to </w:t>
       </w:r>
       <w:r>
         <w:rPr>
@@ -16187,7 +16040,6 @@
         <w:rPr>
           <w:rFonts w:hint="eastAsia"/>
         </w:rPr>
-        <w:lastRenderedPageBreak/>
         <w:t>While estimates from previous studies are quite diverse, o</w:t>
       </w:r>
       <w:r>
@@ -16598,7 +16450,11 @@
         <w:t xml:space="preserve"> </w:t>
       </w:r>
       <w:r>
-        <w:t>up to 68%, 90%, and 36%</w:t>
+        <w:t xml:space="preserve">up to 68%, </w:t>
+      </w:r>
+      <w:r>
+        <w:lastRenderedPageBreak/>
+        <w:t>90%, and 36%</w:t>
       </w:r>
       <w:r>
         <w:rPr>
@@ -16847,11 +16703,7 @@
         <w:t>with some selective geographical targeting provides estimates varied from</w:t>
       </w:r>
       <w:r>
-        <w:t xml:space="preserve"> 2.6 (95% PI </w:t>
-      </w:r>
-      <w:r>
-        <w:lastRenderedPageBreak/>
-        <w:t>2.4–2.9)</w:t>
+        <w:t xml:space="preserve"> 2.6 (95% PI 2.4–2.9)</w:t>
       </w:r>
       <w:r>
         <w:rPr>
@@ -17012,6 +16864,7 @@
         <w:rPr>
           <w:rFonts w:hint="eastAsia"/>
         </w:rPr>
+        <w:lastRenderedPageBreak/>
         <w:t xml:space="preserve">And most studies do not account for the delays in vaccination response as we incorporated in our </w:t>
       </w:r>
     </w:p>
@@ -17376,11 +17229,7 @@
         <w:t xml:space="preserve"> </w:t>
       </w:r>
       <w:r>
-        <w:t xml:space="preserve">This static approach, </w:t>
-      </w:r>
-      <w:r>
-        <w:lastRenderedPageBreak/>
-        <w:t>grounded in empirical observations, may offer a practical alternative for modeling ORI impact in settings with limited data.</w:t>
+        <w:t>This static approach, grounded in empirical observations, may offer a practical alternative for modeling ORI impact in settings with limited data.</w:t>
       </w:r>
       <w:r>
         <w:t xml:space="preserve"> </w:t>
@@ -17752,7 +17601,11 @@
         <w:t xml:space="preserve">two weeks </w:t>
       </w:r>
       <w:r>
-        <w:t>before the ORI was initiated. However, in real-world settings, it is often difficult to determine in real time whether an outbreak has concluded</w:t>
+        <w:t xml:space="preserve">before the ORI was initiated. However, in real-world settings, it is </w:t>
+      </w:r>
+      <w:r>
+        <w:lastRenderedPageBreak/>
+        <w:t>often difficult to determine in real time whether an outbreak has concluded</w:t>
       </w:r>
       <w:r>
         <w:rPr>
@@ -17865,14 +17718,7 @@
         <w:rPr>
           <w:rFonts w:hint="eastAsia"/>
         </w:rPr>
-        <w:t xml:space="preserve">Finally (or Seventh), the overall impact, efficiency, </w:t>
-      </w:r>
-      <w:r>
-        <w:rPr>
-          <w:rFonts w:hint="eastAsia"/>
-        </w:rPr>
-        <w:lastRenderedPageBreak/>
-        <w:t xml:space="preserve">and cost effectiveness derived from our simulation of OCV deployment from stockpile requires careful interpretation. Our simulation </w:t>
+        <w:t xml:space="preserve">Finally (or Seventh), the overall impact, efficiency, and cost effectiveness derived from our simulation of OCV deployment from stockpile requires careful interpretation. Our simulation </w:t>
       </w:r>
       <w:r>
         <w:rPr>
@@ -17935,7 +17781,11 @@
     </w:p>
     <w:p>
       <w:r>
-        <w:t>This study provides important insights into the effectiveness of outbreak response immunizations (ORIs) across a broad range of cholera outbreak scenarios in sub-Saharan Africa. Our findings underscore the critical importance of timely intervention and strategic outbreak prioritization to maximize vaccine impact. Looking ahead, advances in predictive modeling, the integration of real-time surveillance data, and the development of more flexible and targeted vaccine deployment strategies will be essential</w:t>
+        <w:t xml:space="preserve">This study provides important insights into the effectiveness of outbreak response immunizations (ORIs) across a broad range of cholera outbreak scenarios in sub-Saharan </w:t>
+      </w:r>
+      <w:r>
+        <w:lastRenderedPageBreak/>
+        <w:t>Africa. Our findings underscore the critical importance of timely intervention and strategic outbreak prioritization to maximize vaccine impact. Looking ahead, advances in predictive modeling, the integration of real-time surveillance data, and the development of more flexible and targeted vaccine deployment strategies will be essential</w:t>
       </w:r>
       <w:r>
         <w:rPr>
@@ -17973,7 +17823,6 @@
         <w:rPr>
           <w:rFonts w:hint="eastAsia"/>
         </w:rPr>
-        <w:lastRenderedPageBreak/>
         <w:t xml:space="preserve">Author contributions </w:t>
       </w:r>
     </w:p>
@@ -18185,6 +18034,7 @@
         <w:pStyle w:val="Bibliography"/>
       </w:pPr>
       <w:r>
+        <w:lastRenderedPageBreak/>
         <w:t xml:space="preserve">2. </w:t>
       </w:r>
       <w:r>
@@ -18257,7 +18107,6 @@
         <w:pStyle w:val="Bibliography"/>
       </w:pPr>
       <w:r>
-        <w:lastRenderedPageBreak/>
         <w:t xml:space="preserve">8. </w:t>
       </w:r>
       <w:r>
@@ -18318,6 +18167,7 @@
         <w:pStyle w:val="Bibliography"/>
       </w:pPr>
       <w:r>
+        <w:lastRenderedPageBreak/>
         <w:t xml:space="preserve">13. </w:t>
       </w:r>
       <w:r>
@@ -18420,7 +18270,6 @@
         <w:pStyle w:val="Bibliography"/>
       </w:pPr>
       <w:r>
-        <w:lastRenderedPageBreak/>
         <w:t xml:space="preserve">20. </w:t>
       </w:r>
       <w:r>
@@ -18493,6 +18342,7 @@
         <w:pStyle w:val="Bibliography"/>
       </w:pPr>
       <w:r>
+        <w:lastRenderedPageBreak/>
         <w:t xml:space="preserve">26. </w:t>
       </w:r>
       <w:r>
@@ -18577,7 +18427,6 @@
         <w:pStyle w:val="Bibliography"/>
       </w:pPr>
       <w:r>
-        <w:lastRenderedPageBreak/>
         <w:t xml:space="preserve">33. </w:t>
       </w:r>
       <w:r>
@@ -18668,6 +18517,7 @@
         <w:pStyle w:val="Bibliography"/>
       </w:pPr>
       <w:r>
+        <w:lastRenderedPageBreak/>
         <w:t xml:space="preserve">39. </w:t>
       </w:r>
       <w:r>
@@ -18749,7 +18599,6 @@
         <w:pStyle w:val="Bibliography"/>
       </w:pPr>
       <w:r>
-        <w:lastRenderedPageBreak/>
         <w:t xml:space="preserve">45. </w:t>
       </w:r>
       <w:r>
@@ -18802,7 +18651,11 @@
       </w:r>
       <w:r>
         <w:tab/>
-        <w:t xml:space="preserve">Mbewe N, Imamura T, Sivile S, Sinkala A, Zulu P, Chanda C, et al. Clinical Characteristics of 6578 Adult Patients With Cholera Admitted to Community and Referral Cholera Treatment Centers in Lusaka, Zambia, October 2023 to April 2024. Open Forum Infect Dis. 2025 Jun 1;12(6):ofaf277. </w:t>
+        <w:t xml:space="preserve">Mbewe N, Imamura T, Sivile S, Sinkala A, Zulu P, Chanda C, et al. Clinical Characteristics of 6578 Adult Patients With Cholera Admitted to Community and </w:t>
+      </w:r>
+      <w:r>
+        <w:lastRenderedPageBreak/>
+        <w:t xml:space="preserve">Referral Cholera Treatment Centers in Lusaka, Zambia, October 2023 to April 2024. Open Forum Infect Dis. 2025 Jun 1;12(6):ofaf277. </w:t>
       </w:r>
     </w:p>
     <w:p>
@@ -18882,7 +18735,6 @@
         <w:pStyle w:val="Bibliography"/>
       </w:pPr>
       <w:r>
-        <w:lastRenderedPageBreak/>
         <w:t xml:space="preserve">56. </w:t>
       </w:r>
       <w:r>
@@ -18949,6 +18801,7 @@
         <w:pStyle w:val="Bibliography"/>
       </w:pPr>
       <w:r>
+        <w:lastRenderedPageBreak/>
         <w:t xml:space="preserve">60. </w:t>
       </w:r>
       <w:r>
@@ -19048,7 +18901,6 @@
         <w:rPr>
           <w:lang w:val="de-DE"/>
         </w:rPr>
-        <w:lastRenderedPageBreak/>
         <w:t xml:space="preserve">68. </w:t>
       </w:r>
       <w:r>
@@ -19103,6 +18955,7 @@
         <w:pStyle w:val="Bibliography"/>
       </w:pPr>
       <w:r>
+        <w:lastRenderedPageBreak/>
         <w:t xml:space="preserve">72. </w:t>
       </w:r>
       <w:r>
@@ -19205,7 +19058,6 @@
         <w:pStyle w:val="Bibliography"/>
       </w:pPr>
       <w:r>
-        <w:lastRenderedPageBreak/>
         <w:t xml:space="preserve">79. </w:t>
       </w:r>
       <w:r>
@@ -19293,6 +19145,7 @@
         </w:rPr>
       </w:pPr>
       <w:r>
+        <w:lastRenderedPageBreak/>
         <w:t xml:space="preserve">83. </w:t>
       </w:r>
       <w:r>

</xml_diff>

<commit_message>
tables 3 and s1 and summary values in the text
</commit_message>
<xml_diff>
--- a/papers/Maintext_cholera_outbreak_modeling_31Oct2025.docx
+++ b/papers/Maintext_cholera_outbreak_modeling_31Oct2025.docx
@@ -12493,7 +12493,13 @@
         <w:rPr>
           <w:rFonts w:hint="eastAsia"/>
         </w:rPr>
-        <w:t xml:space="preserve">instantaneous reduction rate </w:t>
+        <w:t>exponential decay rate</w:t>
+      </w:r>
+      <w:r>
+        <w:rPr>
+          <w:rFonts w:hint="eastAsia"/>
+        </w:rPr>
+        <w:t xml:space="preserve"> </w:t>
       </w:r>
       <w:r>
         <w:rPr>
@@ -12548,17 +12554,9 @@
       </w:r>
       <w:r>
         <w:rPr>
-          <w:rFonts w:hint="eastAsia"/>
-          <w:lang w:val="en-US"/>
-        </w:rPr>
-        <w:t xml:space="preserve">implying </w:t>
-      </w:r>
-      <w:r>
-        <w:rPr>
-          <w:rFonts w:hint="eastAsia"/>
-          <w:lang w:val="en-US"/>
-        </w:rPr>
-        <w:t xml:space="preserve">a </w:t>
+          <w:lang w:val="en-US"/>
+        </w:rPr>
+        <w:t xml:space="preserve">corresponding to an average </w:t>
       </w:r>
       <w:r>
         <w:rPr>
@@ -12569,10 +12567,23 @@
       </w:r>
       <w:r>
         <w:rPr>
-          <w:rFonts w:hint="eastAsia"/>
-          <w:lang w:val="en-US"/>
-        </w:rPr>
-        <w:t xml:space="preserve"> decline of </w:t>
+          <w:lang w:val="en-US"/>
+        </w:rPr>
+        <w:t xml:space="preserve"> decline of 15.3%</w:t>
+      </w:r>
+      <w:r>
+        <w:rPr>
+          <w:rFonts w:hint="eastAsia"/>
+          <w:lang w:val="en-US"/>
+        </w:rPr>
+        <w:t xml:space="preserve"> o</w:t>
+      </w:r>
+      <w:r>
+        <w:rPr>
+          <w:rFonts w:hint="eastAsia"/>
+          <w:lang w:val="en-US"/>
+        </w:rPr>
+        <w:t xml:space="preserve">f </w:t>
       </w:r>
       <w:r>
         <w:rPr>
@@ -12848,658 +12859,89 @@
           <w:rFonts w:hint="eastAsia"/>
           <w:lang w:val="en-US"/>
         </w:rPr>
-        <w:t xml:space="preserve"> </w:t>
-      </w:r>
-    </w:p>
-    <w:p>
-      <w:pPr>
-        <w:rPr>
-          <w:lang w:val="en-US"/>
-        </w:rPr>
-      </w:pPr>
-    </w:p>
-    <w:p>
-      <w:r>
-        <w:rPr>
-          <w:rFonts w:hint="eastAsia"/>
-        </w:rPr>
-        <w:t xml:space="preserve">Impact of </w:t>
-      </w:r>
-      <w:r>
-        <w:rPr>
-          <w:rFonts w:hint="eastAsia"/>
-        </w:rPr>
-        <w:t>ORI</w:t>
-      </w:r>
-      <w:r>
-        <w:rPr>
-          <w:rFonts w:hint="eastAsia"/>
-        </w:rPr>
-        <w:t xml:space="preserve"> vari</w:t>
-      </w:r>
-      <w:r>
-        <w:t>ed</w:t>
-      </w:r>
-      <w:r>
-        <w:rPr>
-          <w:rFonts w:hint="eastAsia"/>
-        </w:rPr>
-        <w:t xml:space="preserve"> by epidemiological characteristics of outbreaks</w:t>
-      </w:r>
-      <w:r>
-        <w:rPr>
-          <w:rFonts w:hint="eastAsia"/>
-        </w:rPr>
-        <w:t>,</w:t>
-      </w:r>
-      <w:r>
-        <w:t xml:space="preserve"> and different metrics </w:t>
-      </w:r>
-      <w:r>
-        <w:rPr>
-          <w:rFonts w:hint="eastAsia"/>
-        </w:rPr>
-        <w:t>responded to prioritization in distinct ways</w:t>
-      </w:r>
-      <w:r>
-        <w:t xml:space="preserve">. </w:t>
-      </w:r>
-      <w:r>
-        <w:t xml:space="preserve">Prioritizing larger outbreaks produced the </w:t>
-      </w:r>
-      <w:r>
-        <w:rPr>
-          <w:rFonts w:hint="eastAsia"/>
-        </w:rPr>
-        <w:t>greatest</w:t>
-      </w:r>
-      <w:r>
-        <w:t xml:space="preserve"> </w:t>
-      </w:r>
-      <w:r>
-        <w:rPr>
-          <w:rFonts w:hint="eastAsia"/>
-        </w:rPr>
-        <w:t>absolute case reduction</w:t>
-      </w:r>
-      <w:r>
-        <w:rPr>
-          <w:rFonts w:hint="eastAsia"/>
-        </w:rPr>
-        <w:t xml:space="preserve"> </w:t>
-      </w:r>
-      <w:r>
-        <w:t>(</w:t>
-      </w:r>
-      <w:r>
-        <w:rPr>
-          <w:b/>
-          <w:bCs/>
-        </w:rPr>
-        <w:t>Figure 3D; Figure S</w:t>
-      </w:r>
-      <w:r>
-        <w:rPr>
-          <w:rFonts w:hint="eastAsia"/>
-          <w:b/>
-          <w:bCs/>
-        </w:rPr>
-        <w:t>3</w:t>
-      </w:r>
-      <w:r>
-        <w:rPr>
-          <w:b/>
-          <w:bCs/>
-        </w:rPr>
-        <w:t xml:space="preserve"> </w:t>
-      </w:r>
-      <w:r>
-        <w:t xml:space="preserve">in the </w:t>
-      </w:r>
-      <w:r>
-        <w:t>Supplement</w:t>
-      </w:r>
-      <w:r>
-        <w:t>)</w:t>
-      </w:r>
-      <w:r>
-        <w:t xml:space="preserve"> whereas prioritizing high</w:t>
-      </w:r>
-      <w:r>
-        <w:rPr>
-          <w:rFonts w:hint="eastAsia"/>
-        </w:rPr>
-        <w:t>-</w:t>
-      </w:r>
-      <w:r>
-        <w:t>attack</w:t>
-      </w:r>
-      <w:r>
-        <w:rPr>
-          <w:rFonts w:hint="eastAsia"/>
-        </w:rPr>
-        <w:t>-</w:t>
-      </w:r>
-      <w:r>
-        <w:t xml:space="preserve">rate outbreaks </w:t>
-      </w:r>
-      <w:r>
-        <w:rPr>
-          <w:rFonts w:hint="eastAsia"/>
-        </w:rPr>
-        <w:t>maximized</w:t>
-      </w:r>
-      <w:r>
-        <w:t xml:space="preserve"> efficiency—measured as cases</w:t>
-      </w:r>
-      <w:r>
-        <w:t xml:space="preserve"> or DALYs</w:t>
-      </w:r>
-      <w:r>
-        <w:t xml:space="preserve"> averted per 1,000 OCV dose</w:t>
-      </w:r>
-      <w:r>
-        <w:t>s</w:t>
-      </w:r>
-      <w:r>
-        <w:rPr>
-          <w:rFonts w:hint="eastAsia"/>
-        </w:rPr>
-        <w:t xml:space="preserve"> </w:t>
-      </w:r>
-      <w:r>
-        <w:rPr>
-          <w:rFonts w:hint="eastAsia"/>
-        </w:rPr>
-        <w:t>(</w:t>
-      </w:r>
-      <w:r>
-        <w:rPr>
-          <w:rFonts w:hint="eastAsia"/>
-        </w:rPr>
-        <w:t xml:space="preserve">or </w:t>
-      </w:r>
-      <w:r>
-        <w:rPr>
-          <w:rFonts w:hint="eastAsia"/>
-        </w:rPr>
-        <w:t>vaccine recipients</w:t>
-      </w:r>
-      <w:r>
-        <w:rPr>
-          <w:rFonts w:hint="eastAsia"/>
-        </w:rPr>
-        <w:t>)</w:t>
-      </w:r>
-      <w:r>
-        <w:t xml:space="preserve"> </w:t>
-      </w:r>
-      <w:r>
-        <w:t>(</w:t>
-      </w:r>
-      <w:r>
-        <w:rPr>
-          <w:b/>
-          <w:bCs/>
-        </w:rPr>
-        <w:t>Figure</w:t>
-      </w:r>
-      <w:r>
-        <w:rPr>
-          <w:rFonts w:hint="eastAsia"/>
-          <w:b/>
-          <w:bCs/>
-        </w:rPr>
-        <w:t>s</w:t>
-      </w:r>
-      <w:r>
-        <w:rPr>
-          <w:b/>
-          <w:bCs/>
-        </w:rPr>
-        <w:t xml:space="preserve"> 3</w:t>
-      </w:r>
-      <w:r>
-        <w:rPr>
-          <w:b/>
-          <w:bCs/>
-        </w:rPr>
-        <w:t>E</w:t>
-      </w:r>
-      <w:r>
-        <w:rPr>
-          <w:b/>
-          <w:bCs/>
-        </w:rPr>
-        <w:t>–F</w:t>
-      </w:r>
-      <w:r>
-        <w:t>).</w:t>
-      </w:r>
-      <w:r>
         <w:t xml:space="preserve"> </w:t>
       </w:r>
     </w:p>
     <w:p/>
     <w:p>
       <w:r>
-        <w:t>Targeting</w:t>
-      </w:r>
-      <w:r>
-        <w:rPr>
-          <w:rFonts w:hint="eastAsia"/>
-        </w:rPr>
-        <w:t xml:space="preserve"> </w:t>
-      </w:r>
-      <w:r>
-        <w:t>top 10% of outbreaks</w:t>
-      </w:r>
-      <w:r>
-        <w:rPr>
-          <w:rFonts w:hint="eastAsia"/>
-        </w:rPr>
-        <w:t xml:space="preserve"> by size increased the median </w:t>
-      </w:r>
-      <w:r>
-        <w:rPr>
-          <w:rFonts w:hint="eastAsia"/>
-        </w:rPr>
-        <w:t xml:space="preserve">to </w:t>
-      </w:r>
-      <w:r>
-        <w:rPr>
-          <w:rFonts w:hint="eastAsia"/>
-          <w:lang w:val="en-US"/>
-        </w:rPr>
-        <w:t>6</w:t>
-      </w:r>
-      <w:r>
-        <w:rPr>
-          <w:rFonts w:hint="eastAsia"/>
-          <w:lang w:val="en-US"/>
-        </w:rPr>
-        <w:t>82</w:t>
-      </w:r>
-      <w:r>
-        <w:rPr>
-          <w:rFonts w:hint="eastAsia"/>
-          <w:lang w:val="en-US"/>
-        </w:rPr>
-        <w:t xml:space="preserve"> </w:t>
-      </w:r>
-      <w:proofErr w:type="gramStart"/>
-      <w:r>
-        <w:rPr>
-          <w:rFonts w:hint="eastAsia"/>
-          <w:lang w:val="en-US"/>
-        </w:rPr>
-        <w:t>case</w:t>
-      </w:r>
-      <w:proofErr w:type="gramEnd"/>
-      <w:r>
-        <w:rPr>
-          <w:rFonts w:hint="eastAsia"/>
-          <w:lang w:val="en-US"/>
-        </w:rPr>
-        <w:t xml:space="preserve"> </w:t>
-      </w:r>
-      <w:r>
-        <w:rPr>
-          <w:rFonts w:hint="eastAsia"/>
-          <w:lang w:val="en-US"/>
-        </w:rPr>
-        <w:t xml:space="preserve">(vs </w:t>
-      </w:r>
-      <w:r>
-        <w:rPr>
-          <w:rFonts w:hint="eastAsia"/>
-          <w:lang w:val="en-US"/>
-        </w:rPr>
-        <w:t>16</w:t>
-      </w:r>
-      <w:r>
-        <w:rPr>
-          <w:rFonts w:hint="eastAsia"/>
-          <w:lang w:val="en-US"/>
-        </w:rPr>
-        <w:t xml:space="preserve"> cases </w:t>
-      </w:r>
-      <w:r>
-        <w:rPr>
-          <w:rFonts w:hint="eastAsia"/>
-          <w:lang w:val="en-US"/>
-        </w:rPr>
-        <w:t>under random targeting) for ORIs</w:t>
-      </w:r>
-      <w:r>
-        <w:rPr>
-          <w:rFonts w:hint="eastAsia"/>
-          <w:lang w:val="en-US"/>
-        </w:rPr>
-        <w:t xml:space="preserve"> i</w:t>
-      </w:r>
-      <w:r>
-        <w:rPr>
-          <w:rFonts w:hint="eastAsia"/>
-          <w:lang w:val="en-US"/>
-        </w:rPr>
-        <w:t xml:space="preserve">nitiated </w:t>
-      </w:r>
-      <w:r>
-        <w:rPr>
-          <w:rFonts w:hint="eastAsia"/>
-          <w:lang w:val="en-US"/>
-        </w:rPr>
-        <w:t>in</w:t>
-      </w:r>
-      <w:r>
-        <w:rPr>
-          <w:rFonts w:hint="eastAsia"/>
-          <w:lang w:val="en-US"/>
-        </w:rPr>
-        <w:t xml:space="preserve"> week 9</w:t>
-      </w:r>
-      <w:r>
-        <w:rPr>
-          <w:rFonts w:hint="eastAsia"/>
-          <w:lang w:val="en-US"/>
-        </w:rPr>
-        <w:t xml:space="preserve">, and to </w:t>
-      </w:r>
-      <w:r>
-        <w:rPr>
-          <w:lang w:val="en-US"/>
-        </w:rPr>
-        <w:t>1</w:t>
-      </w:r>
-      <w:r>
-        <w:rPr>
-          <w:rFonts w:hint="eastAsia"/>
-          <w:lang w:val="en-US"/>
+        <w:rPr>
+          <w:rFonts w:hint="eastAsia"/>
+        </w:rPr>
+        <w:t xml:space="preserve">Impact of </w:t>
+      </w:r>
+      <w:r>
+        <w:rPr>
+          <w:rFonts w:hint="eastAsia"/>
+        </w:rPr>
+        <w:t>ORI</w:t>
+      </w:r>
+      <w:r>
+        <w:rPr>
+          <w:rFonts w:hint="eastAsia"/>
+        </w:rPr>
+        <w:t xml:space="preserve"> vari</w:t>
+      </w:r>
+      <w:r>
+        <w:t>ed</w:t>
+      </w:r>
+      <w:r>
+        <w:rPr>
+          <w:rFonts w:hint="eastAsia"/>
+        </w:rPr>
+        <w:t xml:space="preserve"> by epidemiological characteristics of outbreaks</w:t>
+      </w:r>
+      <w:r>
+        <w:rPr>
+          <w:rFonts w:hint="eastAsia"/>
         </w:rPr>
         <w:t>,</w:t>
       </w:r>
       <w:r>
-        <w:rPr>
-          <w:lang w:val="en-US"/>
-        </w:rPr>
-        <w:t>725</w:t>
-      </w:r>
-      <w:r>
-        <w:rPr>
-          <w:rFonts w:hint="eastAsia"/>
-          <w:lang w:val="en-US"/>
-        </w:rPr>
-        <w:t xml:space="preserve"> cases if </w:t>
-      </w:r>
-      <w:r>
-        <w:rPr>
-          <w:rFonts w:hint="eastAsia"/>
-          <w:lang w:val="en-US"/>
-        </w:rPr>
-        <w:t xml:space="preserve">initiated </w:t>
-      </w:r>
-      <w:r>
-        <w:rPr>
-          <w:rFonts w:hint="eastAsia"/>
-          <w:lang w:val="en-US"/>
-        </w:rPr>
-        <w:t xml:space="preserve">in </w:t>
-      </w:r>
-      <w:r>
-        <w:rPr>
-          <w:rFonts w:hint="eastAsia"/>
-          <w:lang w:val="en-US"/>
-        </w:rPr>
-        <w:t>week 1</w:t>
-      </w:r>
-      <w:r>
-        <w:rPr>
-          <w:rFonts w:hint="eastAsia"/>
-          <w:lang w:val="en-US"/>
-        </w:rPr>
+        <w:t xml:space="preserve"> and different metrics </w:t>
+      </w:r>
+      <w:r>
+        <w:rPr>
+          <w:rFonts w:hint="eastAsia"/>
+        </w:rPr>
+        <w:t>responded to prioritization in distinct ways</w:t>
+      </w:r>
+      <w:r>
         <w:t xml:space="preserve">. </w:t>
       </w:r>
       <w:r>
-        <w:t xml:space="preserve">Prioritizing </w:t>
-      </w:r>
-      <w:r>
-        <w:rPr>
-          <w:rFonts w:hint="eastAsia"/>
-        </w:rPr>
-        <w:t xml:space="preserve">the </w:t>
-      </w:r>
-      <w:r>
-        <w:rPr>
-          <w:rFonts w:hint="eastAsia"/>
-        </w:rPr>
-        <w:t xml:space="preserve">top 10 % </w:t>
-      </w:r>
-      <w:r>
-        <w:rPr>
-          <w:rFonts w:hint="eastAsia"/>
-        </w:rPr>
-        <w:t>by</w:t>
-      </w:r>
-      <w:r>
-        <w:rPr>
-          <w:rFonts w:hint="eastAsia"/>
-        </w:rPr>
-        <w:t xml:space="preserve"> </w:t>
-      </w:r>
-      <w:r>
-        <w:t>attack</w:t>
-      </w:r>
-      <w:r>
-        <w:rPr>
-          <w:rFonts w:hint="eastAsia"/>
-        </w:rPr>
-        <w:t xml:space="preserve"> </w:t>
-      </w:r>
-      <w:r>
-        <w:t xml:space="preserve">rate </w:t>
-      </w:r>
-      <w:r>
-        <w:rPr>
-          <w:rFonts w:hint="eastAsia"/>
-        </w:rPr>
-        <w:t xml:space="preserve">increased </w:t>
-      </w:r>
-      <w:r>
-        <w:rPr>
-          <w:rFonts w:hint="eastAsia"/>
-        </w:rPr>
-        <w:t xml:space="preserve">the </w:t>
-      </w:r>
-      <w:r>
-        <w:rPr>
-          <w:rFonts w:hint="eastAsia"/>
-        </w:rPr>
-        <w:t>ORI</w:t>
-      </w:r>
-      <w:r>
-        <w:rPr>
-          <w:rFonts w:hint="eastAsia"/>
-        </w:rPr>
-        <w:t xml:space="preserve"> efficiency </w:t>
-      </w:r>
-      <w:r>
-        <w:rPr>
-          <w:rFonts w:hint="eastAsia"/>
-        </w:rPr>
-        <w:t>approximately</w:t>
-      </w:r>
-      <w:r>
-        <w:rPr>
-          <w:rFonts w:hint="eastAsia"/>
-        </w:rPr>
-        <w:t xml:space="preserve"> to</w:t>
-      </w:r>
-      <w:r>
-        <w:rPr>
-          <w:rFonts w:hint="eastAsia"/>
-        </w:rPr>
-        <w:t xml:space="preserve"> </w:t>
-      </w:r>
-      <w:r>
-        <w:rPr>
-          <w:rFonts w:hint="eastAsia"/>
-        </w:rPr>
-        <w:t>2</w:t>
-      </w:r>
-      <w:r>
-        <w:rPr>
-          <w:rFonts w:hint="eastAsia"/>
-        </w:rPr>
-        <w:t>.</w:t>
-      </w:r>
-      <w:r>
-        <w:rPr>
-          <w:rFonts w:hint="eastAsia"/>
-        </w:rPr>
-        <w:t>39</w:t>
-      </w:r>
-      <w:r>
-        <w:rPr>
-          <w:rFonts w:hint="eastAsia"/>
-        </w:rPr>
-        <w:t xml:space="preserve"> </w:t>
-      </w:r>
-      <w:r>
-        <w:rPr>
-          <w:rFonts w:hint="eastAsia"/>
-        </w:rPr>
-        <w:t>(or 0.0</w:t>
-      </w:r>
-      <w:r>
-        <w:rPr>
-          <w:rFonts w:hint="eastAsia"/>
-        </w:rPr>
-        <w:t>6</w:t>
-      </w:r>
-      <w:r>
-        <w:rPr>
-          <w:rFonts w:hint="eastAsia"/>
-        </w:rPr>
-        <w:t xml:space="preserve"> DALYs) </w:t>
-      </w:r>
-      <w:r>
-        <w:rPr>
-          <w:rFonts w:hint="eastAsia"/>
-        </w:rPr>
-        <w:t>and 9.</w:t>
-      </w:r>
-      <w:r>
-        <w:rPr>
-          <w:rFonts w:hint="eastAsia"/>
-        </w:rPr>
-        <w:t>58</w:t>
-      </w:r>
-      <w:r>
-        <w:t xml:space="preserve"> </w:t>
-      </w:r>
-      <w:r>
-        <w:rPr>
-          <w:rFonts w:hint="eastAsia"/>
-        </w:rPr>
-        <w:t>cases</w:t>
-      </w:r>
-      <w:r>
-        <w:rPr>
-          <w:rFonts w:hint="eastAsia"/>
-        </w:rPr>
-        <w:t xml:space="preserve"> (1.</w:t>
-      </w:r>
-      <w:r>
-        <w:rPr>
-          <w:rFonts w:hint="eastAsia"/>
-        </w:rPr>
-        <w:t>28</w:t>
-      </w:r>
-      <w:r>
-        <w:rPr>
-          <w:rFonts w:hint="eastAsia"/>
-        </w:rPr>
-        <w:t xml:space="preserve"> DALYs)</w:t>
-      </w:r>
-      <w:r>
-        <w:rPr>
-          <w:rFonts w:hint="eastAsia"/>
-        </w:rPr>
-        <w:t xml:space="preserve"> </w:t>
-      </w:r>
-      <w:r>
-        <w:t xml:space="preserve">averted per 1,000 doses </w:t>
-      </w:r>
-      <w:r>
-        <w:rPr>
-          <w:rFonts w:hint="eastAsia"/>
-        </w:rPr>
-        <w:t>for</w:t>
-      </w:r>
-      <w:r>
-        <w:rPr>
-          <w:rFonts w:hint="eastAsia"/>
-        </w:rPr>
-        <w:t xml:space="preserve"> ORIs </w:t>
-      </w:r>
-      <w:r>
-        <w:rPr>
-          <w:rFonts w:hint="eastAsia"/>
-        </w:rPr>
-        <w:t>i</w:t>
-      </w:r>
-      <w:r>
-        <w:rPr>
-          <w:rFonts w:hint="eastAsia"/>
-        </w:rPr>
-        <w:t xml:space="preserve">nitiated </w:t>
-      </w:r>
-      <w:r>
-        <w:rPr>
-          <w:rFonts w:hint="eastAsia"/>
-        </w:rPr>
-        <w:t>in</w:t>
-      </w:r>
-      <w:r>
-        <w:rPr>
-          <w:rFonts w:hint="eastAsia"/>
-        </w:rPr>
-        <w:t xml:space="preserve"> week 9 and 1, respectively</w:t>
-      </w:r>
-      <w:r>
-        <w:t>.</w:t>
-      </w:r>
-      <w:r>
-        <w:rPr>
-          <w:rFonts w:hint="eastAsia"/>
-        </w:rPr>
-        <w:t xml:space="preserve"> </w:t>
-      </w:r>
-      <w:r>
-        <w:rPr>
-          <w:rFonts w:hint="eastAsia"/>
-        </w:rPr>
-        <w:t xml:space="preserve">Prioritizing </w:t>
-      </w:r>
-      <w:r>
-        <w:t>by size or duration also improved efficiency</w:t>
-      </w:r>
-      <w:r>
-        <w:rPr>
-          <w:rFonts w:hint="eastAsia"/>
-        </w:rPr>
-        <w:t xml:space="preserve"> but to a lesser extent</w:t>
-      </w:r>
-      <w:r>
-        <w:t xml:space="preserve"> (</w:t>
+        <w:t xml:space="preserve">Prioritizing larger outbreaks produced the </w:t>
+      </w:r>
+      <w:r>
+        <w:rPr>
+          <w:rFonts w:hint="eastAsia"/>
+        </w:rPr>
+        <w:t>greatest</w:t>
+      </w:r>
+      <w:r>
+        <w:t xml:space="preserve"> </w:t>
+      </w:r>
+      <w:r>
+        <w:rPr>
+          <w:rFonts w:hint="eastAsia"/>
+        </w:rPr>
+        <w:t>absolute case reduction</w:t>
+      </w:r>
+      <w:r>
+        <w:rPr>
+          <w:rFonts w:hint="eastAsia"/>
+        </w:rPr>
+        <w:t xml:space="preserve"> </w:t>
+      </w:r>
+      <w:r>
+        <w:t>(</w:t>
       </w:r>
       <w:r>
         <w:rPr>
           <w:b/>
           <w:bCs/>
         </w:rPr>
-        <w:t xml:space="preserve">Figure </w:t>
+        <w:t>Figure 3D; Figure S</w:t>
       </w:r>
       <w:r>
         <w:rPr>
@@ -13507,177 +12949,738 @@
           <w:b/>
           <w:bCs/>
         </w:rPr>
-        <w:t>S3</w:t>
-      </w:r>
-      <w:r>
-        <w:rPr>
-          <w:rFonts w:hint="eastAsia"/>
-        </w:rPr>
-        <w:t xml:space="preserve"> in the Supplement</w:t>
-      </w:r>
-      <w:r>
-        <w:t xml:space="preserve">). In contrast, percent cases averted (not normalized by doses) was most sensitive to </w:t>
-      </w:r>
-      <w:r>
-        <w:rPr>
-          <w:rFonts w:hint="eastAsia"/>
-        </w:rPr>
-        <w:t xml:space="preserve">outbreak </w:t>
-      </w:r>
-      <w:r>
-        <w:t xml:space="preserve">duration. </w:t>
-      </w:r>
-      <w:r>
-        <w:rPr>
-          <w:rFonts w:hint="eastAsia"/>
-        </w:rPr>
-        <w:t>For</w:t>
-      </w:r>
-      <w:r>
-        <w:t xml:space="preserve"> ORIs </w:t>
-      </w:r>
-      <w:r>
-        <w:rPr>
-          <w:rFonts w:hint="eastAsia"/>
-        </w:rPr>
-        <w:t xml:space="preserve">initiated </w:t>
-      </w:r>
-      <w:r>
-        <w:t xml:space="preserve">in week 1, the median </w:t>
-      </w:r>
-      <w:proofErr w:type="gramStart"/>
-      <w:r>
-        <w:t>percent</w:t>
-      </w:r>
-      <w:proofErr w:type="gramEnd"/>
-      <w:r>
-        <w:rPr>
-          <w:rFonts w:hint="eastAsia"/>
-        </w:rPr>
-        <w:t xml:space="preserve"> </w:t>
-      </w:r>
-      <w:r>
-        <w:t xml:space="preserve">cases averted </w:t>
-      </w:r>
-      <w:r>
-        <w:rPr>
-          <w:rFonts w:hint="eastAsia"/>
-        </w:rPr>
-        <w:t xml:space="preserve">were </w:t>
-      </w:r>
-      <w:r>
-        <w:t>83</w:t>
-      </w:r>
-      <w:r>
-        <w:rPr>
-          <w:rFonts w:hint="eastAsia"/>
-        </w:rPr>
-        <w:t>.8</w:t>
-      </w:r>
-      <w:r>
-        <w:t>%, 82%, and 80</w:t>
-      </w:r>
-      <w:r>
-        <w:rPr>
-          <w:rFonts w:hint="eastAsia"/>
-        </w:rPr>
-        <w:t>.1</w:t>
-      </w:r>
-      <w:r>
-        <w:t>% for outbreaks in the top decile of duration, size, and attack rate, respectively</w:t>
-      </w:r>
-      <w:r>
-        <w:rPr>
-          <w:rFonts w:hint="eastAsia"/>
-        </w:rPr>
-        <w:t xml:space="preserve">, declining to </w:t>
-      </w:r>
-      <w:r>
-        <w:t>55.2</w:t>
-      </w:r>
-      <w:r>
-        <w:rPr>
-          <w:rFonts w:hint="eastAsia"/>
-        </w:rPr>
-        <w:t>%,</w:t>
-      </w:r>
-      <w:r>
-        <w:t xml:space="preserve"> 2</w:t>
-      </w:r>
-      <w:r>
-        <w:rPr>
-          <w:rFonts w:hint="eastAsia"/>
-        </w:rPr>
-        <w:t>6</w:t>
-      </w:r>
-      <w:r>
-        <w:t>.</w:t>
-      </w:r>
-      <w:r>
-        <w:rPr>
-          <w:rFonts w:hint="eastAsia"/>
-        </w:rPr>
-        <w:t>7</w:t>
-      </w:r>
-      <w:r>
-        <w:rPr>
-          <w:rFonts w:hint="eastAsia"/>
-        </w:rPr>
-        <w:t>%,</w:t>
-      </w:r>
-      <w:r>
-        <w:t xml:space="preserve"> </w:t>
-      </w:r>
-      <w:r>
-        <w:rPr>
-          <w:rFonts w:hint="eastAsia"/>
-        </w:rPr>
-        <w:t xml:space="preserve">and </w:t>
-      </w:r>
-      <w:r>
-        <w:rPr>
-          <w:lang w:val="en-US"/>
-        </w:rPr>
-        <w:t>1</w:t>
-      </w:r>
-      <w:r>
-        <w:rPr>
-          <w:rFonts w:hint="eastAsia"/>
-          <w:lang w:val="en-US"/>
-        </w:rPr>
-        <w:t>7</w:t>
-      </w:r>
-      <w:r>
-        <w:rPr>
-          <w:lang w:val="en-US"/>
-        </w:rPr>
-        <w:t>.</w:t>
-      </w:r>
-      <w:r>
-        <w:rPr>
-          <w:rFonts w:hint="eastAsia"/>
-          <w:lang w:val="en-US"/>
-        </w:rPr>
-        <w:t>1</w:t>
-      </w:r>
-      <w:r>
-        <w:rPr>
-          <w:rFonts w:hint="eastAsia"/>
-          <w:lang w:val="en-US"/>
-        </w:rPr>
-        <w:t>% by week 9</w:t>
-      </w:r>
-      <w:r>
-        <w:t>.</w:t>
+        <w:t>3</w:t>
+      </w:r>
+      <w:r>
+        <w:rPr>
+          <w:b/>
+          <w:bCs/>
+        </w:rPr>
+        <w:t xml:space="preserve"> </w:t>
+      </w:r>
+      <w:r>
+        <w:t xml:space="preserve">in the </w:t>
+      </w:r>
+      <w:r>
+        <w:t>Supplement</w:t>
+      </w:r>
+      <w:r>
+        <w:t>)</w:t>
+      </w:r>
+      <w:r>
+        <w:t xml:space="preserve"> whereas prioritizing high</w:t>
+      </w:r>
+      <w:r>
+        <w:rPr>
+          <w:rFonts w:hint="eastAsia"/>
+        </w:rPr>
+        <w:t>-</w:t>
+      </w:r>
+      <w:r>
+        <w:t>attack</w:t>
+      </w:r>
+      <w:r>
+        <w:rPr>
+          <w:rFonts w:hint="eastAsia"/>
+        </w:rPr>
+        <w:t>-</w:t>
+      </w:r>
+      <w:r>
+        <w:t xml:space="preserve">rate outbreaks </w:t>
+      </w:r>
+      <w:r>
+        <w:rPr>
+          <w:rFonts w:hint="eastAsia"/>
+        </w:rPr>
+        <w:t>maximized</w:t>
+      </w:r>
+      <w:r>
+        <w:t xml:space="preserve"> efficiency—measured as cases</w:t>
+      </w:r>
+      <w:r>
+        <w:t xml:space="preserve"> or DALYs</w:t>
+      </w:r>
+      <w:r>
+        <w:t xml:space="preserve"> averted per 1,000 OCV dose</w:t>
+      </w:r>
+      <w:r>
+        <w:t>s</w:t>
+      </w:r>
+      <w:r>
+        <w:rPr>
+          <w:rFonts w:hint="eastAsia"/>
+        </w:rPr>
+        <w:t xml:space="preserve"> </w:t>
+      </w:r>
+      <w:r>
+        <w:rPr>
+          <w:rFonts w:hint="eastAsia"/>
+        </w:rPr>
+        <w:t>(</w:t>
+      </w:r>
+      <w:r>
+        <w:rPr>
+          <w:rFonts w:hint="eastAsia"/>
+        </w:rPr>
+        <w:t xml:space="preserve">or </w:t>
+      </w:r>
+      <w:r>
+        <w:rPr>
+          <w:rFonts w:hint="eastAsia"/>
+        </w:rPr>
+        <w:t>vaccine recipients</w:t>
+      </w:r>
+      <w:r>
+        <w:rPr>
+          <w:rFonts w:hint="eastAsia"/>
+        </w:rPr>
+        <w:t>)</w:t>
+      </w:r>
+      <w:r>
+        <w:t xml:space="preserve"> </w:t>
+      </w:r>
+      <w:r>
+        <w:t>(</w:t>
+      </w:r>
+      <w:r>
+        <w:rPr>
+          <w:b/>
+          <w:bCs/>
+        </w:rPr>
+        <w:t>Figure</w:t>
+      </w:r>
+      <w:r>
+        <w:rPr>
+          <w:rFonts w:hint="eastAsia"/>
+          <w:b/>
+          <w:bCs/>
+        </w:rPr>
+        <w:t>s</w:t>
+      </w:r>
+      <w:r>
+        <w:rPr>
+          <w:b/>
+          <w:bCs/>
+        </w:rPr>
+        <w:t xml:space="preserve"> 3</w:t>
+      </w:r>
+      <w:r>
+        <w:rPr>
+          <w:b/>
+          <w:bCs/>
+        </w:rPr>
+        <w:t>E</w:t>
+      </w:r>
+      <w:r>
+        <w:rPr>
+          <w:b/>
+          <w:bCs/>
+        </w:rPr>
+        <w:t>–F</w:t>
+      </w:r>
+      <w:r>
+        <w:t>).</w:t>
+      </w:r>
+      <w:r>
+        <w:t xml:space="preserve"> </w:t>
       </w:r>
     </w:p>
     <w:p/>
     <w:p>
       <w:r>
+        <w:t>Targeting</w:t>
+      </w:r>
+      <w:r>
+        <w:rPr>
+          <w:rFonts w:hint="eastAsia"/>
+        </w:rPr>
+        <w:t xml:space="preserve"> </w:t>
+      </w:r>
+      <w:r>
+        <w:t>top 10% of outbreaks</w:t>
+      </w:r>
+      <w:r>
+        <w:rPr>
+          <w:rFonts w:hint="eastAsia"/>
+        </w:rPr>
+        <w:t xml:space="preserve"> by size increased the median </w:t>
+      </w:r>
+      <w:r>
+        <w:rPr>
+          <w:rFonts w:hint="eastAsia"/>
+        </w:rPr>
+        <w:t xml:space="preserve">to </w:t>
+      </w:r>
+      <w:r>
+        <w:rPr>
+          <w:rFonts w:hint="eastAsia"/>
+          <w:lang w:val="en-US"/>
+        </w:rPr>
+        <w:t>6</w:t>
+      </w:r>
+      <w:r>
+        <w:rPr>
+          <w:rFonts w:hint="eastAsia"/>
+          <w:lang w:val="en-US"/>
+        </w:rPr>
+        <w:t>82</w:t>
+      </w:r>
+      <w:r>
+        <w:rPr>
+          <w:rFonts w:hint="eastAsia"/>
+          <w:lang w:val="en-US"/>
+        </w:rPr>
+        <w:t xml:space="preserve"> case</w:t>
+      </w:r>
+      <w:r>
+        <w:rPr>
+          <w:rFonts w:hint="eastAsia"/>
+          <w:lang w:val="en-US"/>
+        </w:rPr>
+        <w:t>s</w:t>
+      </w:r>
+      <w:r>
+        <w:rPr>
+          <w:rFonts w:hint="eastAsia"/>
+          <w:lang w:val="en-US"/>
+        </w:rPr>
+        <w:t xml:space="preserve"> </w:t>
+      </w:r>
+      <w:r>
+        <w:rPr>
+          <w:rFonts w:hint="eastAsia"/>
+          <w:lang w:val="en-US"/>
+        </w:rPr>
+        <w:t xml:space="preserve">(vs </w:t>
+      </w:r>
+      <w:r>
+        <w:rPr>
+          <w:rFonts w:hint="eastAsia"/>
+          <w:lang w:val="en-US"/>
+        </w:rPr>
+        <w:t>16</w:t>
+      </w:r>
+      <w:r>
+        <w:rPr>
+          <w:rFonts w:hint="eastAsia"/>
+          <w:lang w:val="en-US"/>
+        </w:rPr>
+        <w:t xml:space="preserve"> cases </w:t>
+      </w:r>
+      <w:r>
+        <w:rPr>
+          <w:rFonts w:hint="eastAsia"/>
+          <w:lang w:val="en-US"/>
+        </w:rPr>
+        <w:t>under random targeting) for ORIs</w:t>
+      </w:r>
+      <w:r>
+        <w:rPr>
+          <w:rFonts w:hint="eastAsia"/>
+          <w:lang w:val="en-US"/>
+        </w:rPr>
+        <w:t xml:space="preserve"> i</w:t>
+      </w:r>
+      <w:r>
+        <w:rPr>
+          <w:rFonts w:hint="eastAsia"/>
+          <w:lang w:val="en-US"/>
+        </w:rPr>
+        <w:t xml:space="preserve">nitiated </w:t>
+      </w:r>
+      <w:r>
+        <w:rPr>
+          <w:rFonts w:hint="eastAsia"/>
+          <w:lang w:val="en-US"/>
+        </w:rPr>
+        <w:t>in</w:t>
+      </w:r>
+      <w:r>
+        <w:rPr>
+          <w:rFonts w:hint="eastAsia"/>
+          <w:lang w:val="en-US"/>
+        </w:rPr>
+        <w:t xml:space="preserve"> week 9</w:t>
+      </w:r>
+      <w:r>
+        <w:rPr>
+          <w:rFonts w:hint="eastAsia"/>
+          <w:lang w:val="en-US"/>
+        </w:rPr>
+        <w:t xml:space="preserve">, and to </w:t>
+      </w:r>
+      <w:r>
+        <w:rPr>
+          <w:lang w:val="en-US"/>
+        </w:rPr>
+        <w:t>1</w:t>
+      </w:r>
+      <w:r>
+        <w:rPr>
+          <w:rFonts w:hint="eastAsia"/>
+          <w:lang w:val="en-US"/>
+        </w:rPr>
+        <w:t>,</w:t>
+      </w:r>
+      <w:r>
+        <w:rPr>
+          <w:lang w:val="en-US"/>
+        </w:rPr>
+        <w:t>725</w:t>
+      </w:r>
+      <w:r>
+        <w:rPr>
+          <w:rFonts w:hint="eastAsia"/>
+          <w:lang w:val="en-US"/>
+        </w:rPr>
+        <w:t xml:space="preserve"> cases if </w:t>
+      </w:r>
+      <w:r>
+        <w:rPr>
+          <w:rFonts w:hint="eastAsia"/>
+          <w:lang w:val="en-US"/>
+        </w:rPr>
+        <w:t xml:space="preserve">initiated </w:t>
+      </w:r>
+      <w:r>
+        <w:rPr>
+          <w:rFonts w:hint="eastAsia"/>
+          <w:lang w:val="en-US"/>
+        </w:rPr>
+        <w:t xml:space="preserve">in </w:t>
+      </w:r>
+      <w:r>
+        <w:rPr>
+          <w:rFonts w:hint="eastAsia"/>
+          <w:lang w:val="en-US"/>
+        </w:rPr>
+        <w:t>week 1</w:t>
+      </w:r>
+      <w:r>
+        <w:rPr>
+          <w:rFonts w:hint="eastAsia"/>
+          <w:lang w:val="en-US"/>
+        </w:rPr>
+        <w:t xml:space="preserve">. </w:t>
+      </w:r>
+      <w:r>
+        <w:t xml:space="preserve">Prioritizing </w:t>
+      </w:r>
+      <w:r>
+        <w:rPr>
+          <w:rFonts w:hint="eastAsia"/>
+        </w:rPr>
+        <w:t xml:space="preserve">the </w:t>
+      </w:r>
+      <w:r>
+        <w:rPr>
+          <w:rFonts w:hint="eastAsia"/>
+        </w:rPr>
+        <w:t xml:space="preserve">top 10 % </w:t>
+      </w:r>
+      <w:r>
+        <w:rPr>
+          <w:rFonts w:hint="eastAsia"/>
+        </w:rPr>
+        <w:t>by</w:t>
+      </w:r>
+      <w:r>
+        <w:rPr>
+          <w:rFonts w:hint="eastAsia"/>
+        </w:rPr>
+        <w:t xml:space="preserve"> </w:t>
+      </w:r>
+      <w:r>
+        <w:t>attack</w:t>
+      </w:r>
+      <w:r>
+        <w:rPr>
+          <w:rFonts w:hint="eastAsia"/>
+        </w:rPr>
+        <w:t xml:space="preserve"> </w:t>
+      </w:r>
+      <w:r>
+        <w:t xml:space="preserve">rate </w:t>
+      </w:r>
+      <w:r>
+        <w:rPr>
+          <w:rFonts w:hint="eastAsia"/>
+        </w:rPr>
+        <w:t xml:space="preserve">increased </w:t>
+      </w:r>
+      <w:r>
+        <w:rPr>
+          <w:rFonts w:hint="eastAsia"/>
+        </w:rPr>
+        <w:t xml:space="preserve">the </w:t>
+      </w:r>
+      <w:r>
+        <w:rPr>
+          <w:rFonts w:hint="eastAsia"/>
+        </w:rPr>
+        <w:t>ORI</w:t>
+      </w:r>
+      <w:r>
+        <w:rPr>
+          <w:rFonts w:hint="eastAsia"/>
+        </w:rPr>
+        <w:t xml:space="preserve"> efficiency </w:t>
+      </w:r>
+      <w:r>
+        <w:rPr>
+          <w:rFonts w:hint="eastAsia"/>
+        </w:rPr>
+        <w:t>approximately</w:t>
+      </w:r>
+      <w:r>
+        <w:rPr>
+          <w:rFonts w:hint="eastAsia"/>
+        </w:rPr>
+        <w:t xml:space="preserve"> to</w:t>
+      </w:r>
+      <w:r>
+        <w:rPr>
+          <w:rFonts w:hint="eastAsia"/>
+        </w:rPr>
+        <w:t xml:space="preserve"> </w:t>
+      </w:r>
+      <w:r>
+        <w:rPr>
+          <w:rFonts w:hint="eastAsia"/>
+        </w:rPr>
+        <w:t>2</w:t>
+      </w:r>
+      <w:r>
+        <w:rPr>
+          <w:rFonts w:hint="eastAsia"/>
+        </w:rPr>
+        <w:t>.</w:t>
+      </w:r>
+      <w:r>
+        <w:rPr>
+          <w:rFonts w:hint="eastAsia"/>
+        </w:rPr>
+        <w:t>39</w:t>
+      </w:r>
+      <w:r>
+        <w:rPr>
+          <w:rFonts w:hint="eastAsia"/>
+        </w:rPr>
+        <w:t xml:space="preserve"> </w:t>
+      </w:r>
+      <w:r>
+        <w:rPr>
+          <w:rFonts w:hint="eastAsia"/>
+        </w:rPr>
+        <w:t>(or 0.0</w:t>
+      </w:r>
+      <w:r>
+        <w:rPr>
+          <w:rFonts w:hint="eastAsia"/>
+        </w:rPr>
+        <w:t>6</w:t>
+      </w:r>
+      <w:r>
+        <w:rPr>
+          <w:rFonts w:hint="eastAsia"/>
+        </w:rPr>
+        <w:t xml:space="preserve"> DALYs) </w:t>
+      </w:r>
+      <w:r>
+        <w:rPr>
+          <w:rFonts w:hint="eastAsia"/>
+        </w:rPr>
+        <w:t>and 9.</w:t>
+      </w:r>
+      <w:r>
+        <w:rPr>
+          <w:rFonts w:hint="eastAsia"/>
+        </w:rPr>
+        <w:t>58</w:t>
+      </w:r>
+      <w:r>
+        <w:t xml:space="preserve"> </w:t>
+      </w:r>
+      <w:r>
+        <w:rPr>
+          <w:rFonts w:hint="eastAsia"/>
+        </w:rPr>
+        <w:t>cases</w:t>
+      </w:r>
+      <w:r>
+        <w:rPr>
+          <w:rFonts w:hint="eastAsia"/>
+        </w:rPr>
+        <w:t xml:space="preserve"> (1.</w:t>
+      </w:r>
+      <w:r>
+        <w:rPr>
+          <w:rFonts w:hint="eastAsia"/>
+        </w:rPr>
+        <w:t>28</w:t>
+      </w:r>
+      <w:r>
+        <w:rPr>
+          <w:rFonts w:hint="eastAsia"/>
+        </w:rPr>
+        <w:t xml:space="preserve"> DALYs)</w:t>
+      </w:r>
+      <w:r>
+        <w:rPr>
+          <w:rFonts w:hint="eastAsia"/>
+        </w:rPr>
+        <w:t xml:space="preserve"> </w:t>
+      </w:r>
+      <w:r>
+        <w:t xml:space="preserve">averted per 1,000 doses </w:t>
+      </w:r>
+      <w:r>
+        <w:rPr>
+          <w:rFonts w:hint="eastAsia"/>
+        </w:rPr>
+        <w:t>for</w:t>
+      </w:r>
+      <w:r>
+        <w:rPr>
+          <w:rFonts w:hint="eastAsia"/>
+        </w:rPr>
+        <w:t xml:space="preserve"> ORIs </w:t>
+      </w:r>
+      <w:r>
+        <w:rPr>
+          <w:rFonts w:hint="eastAsia"/>
+        </w:rPr>
+        <w:t>i</w:t>
+      </w:r>
+      <w:r>
+        <w:rPr>
+          <w:rFonts w:hint="eastAsia"/>
+        </w:rPr>
+        <w:t xml:space="preserve">nitiated </w:t>
+      </w:r>
+      <w:r>
+        <w:rPr>
+          <w:rFonts w:hint="eastAsia"/>
+        </w:rPr>
+        <w:t>in</w:t>
+      </w:r>
+      <w:r>
+        <w:rPr>
+          <w:rFonts w:hint="eastAsia"/>
+        </w:rPr>
+        <w:t xml:space="preserve"> week 9 and 1, respectively</w:t>
+      </w:r>
+      <w:r>
+        <w:t>.</w:t>
+      </w:r>
+      <w:r>
+        <w:rPr>
+          <w:rFonts w:hint="eastAsia"/>
+        </w:rPr>
+        <w:t xml:space="preserve"> </w:t>
+      </w:r>
+      <w:r>
+        <w:rPr>
+          <w:rFonts w:hint="eastAsia"/>
+        </w:rPr>
+        <w:t xml:space="preserve">Prioritizing </w:t>
+      </w:r>
+      <w:r>
+        <w:t>by size or duration also improved efficiency</w:t>
+      </w:r>
+      <w:r>
+        <w:rPr>
+          <w:rFonts w:hint="eastAsia"/>
+        </w:rPr>
+        <w:t xml:space="preserve"> but to a lesser extent</w:t>
+      </w:r>
+      <w:r>
+        <w:t xml:space="preserve"> (</w:t>
+      </w:r>
+      <w:r>
         <w:rPr>
           <w:b/>
           <w:bCs/>
         </w:rPr>
+        <w:t xml:space="preserve">Figure </w:t>
+      </w:r>
+      <w:r>
+        <w:rPr>
+          <w:rFonts w:hint="eastAsia"/>
+          <w:b/>
+          <w:bCs/>
+        </w:rPr>
+        <w:t>S3</w:t>
+      </w:r>
+      <w:r>
+        <w:rPr>
+          <w:rFonts w:hint="eastAsia"/>
+        </w:rPr>
+        <w:t xml:space="preserve"> in the Supplement</w:t>
+      </w:r>
+      <w:r>
+        <w:t xml:space="preserve">). In contrast, percent cases averted (not normalized by doses) was most sensitive to </w:t>
+      </w:r>
+      <w:r>
+        <w:rPr>
+          <w:rFonts w:hint="eastAsia"/>
+        </w:rPr>
+        <w:t xml:space="preserve">outbreak </w:t>
+      </w:r>
+      <w:r>
+        <w:t xml:space="preserve">duration. </w:t>
+      </w:r>
+      <w:r>
+        <w:rPr>
+          <w:rFonts w:hint="eastAsia"/>
+        </w:rPr>
+        <w:t>For</w:t>
+      </w:r>
+      <w:r>
+        <w:t xml:space="preserve"> ORIs </w:t>
+      </w:r>
+      <w:r>
+        <w:rPr>
+          <w:rFonts w:hint="eastAsia"/>
+        </w:rPr>
+        <w:t xml:space="preserve">initiated </w:t>
+      </w:r>
+      <w:r>
+        <w:t xml:space="preserve">in week 1, the median </w:t>
+      </w:r>
+      <w:proofErr w:type="gramStart"/>
+      <w:r>
+        <w:t>percent</w:t>
+      </w:r>
+      <w:proofErr w:type="gramEnd"/>
+      <w:r>
+        <w:rPr>
+          <w:rFonts w:hint="eastAsia"/>
+        </w:rPr>
+        <w:t xml:space="preserve"> </w:t>
+      </w:r>
+      <w:r>
+        <w:t xml:space="preserve">cases averted </w:t>
+      </w:r>
+      <w:r>
+        <w:rPr>
+          <w:rFonts w:hint="eastAsia"/>
+        </w:rPr>
+        <w:t xml:space="preserve">were </w:t>
+      </w:r>
+      <w:r>
+        <w:t>83</w:t>
+      </w:r>
+      <w:r>
+        <w:rPr>
+          <w:rFonts w:hint="eastAsia"/>
+        </w:rPr>
+        <w:t>.8</w:t>
+      </w:r>
+      <w:r>
+        <w:t>%, 82%, and 80</w:t>
+      </w:r>
+      <w:r>
+        <w:rPr>
+          <w:rFonts w:hint="eastAsia"/>
+        </w:rPr>
+        <w:t>.1</w:t>
+      </w:r>
+      <w:r>
+        <w:t>% for outbreaks in the top decile of duration, size, and attack rate, respectively</w:t>
+      </w:r>
+      <w:r>
+        <w:rPr>
+          <w:rFonts w:hint="eastAsia"/>
+        </w:rPr>
+        <w:t xml:space="preserve">, declining to </w:t>
+      </w:r>
+      <w:r>
+        <w:t>55.2</w:t>
+      </w:r>
+      <w:r>
+        <w:rPr>
+          <w:rFonts w:hint="eastAsia"/>
+        </w:rPr>
+        <w:t>%,</w:t>
+      </w:r>
+      <w:r>
+        <w:t xml:space="preserve"> 2</w:t>
+      </w:r>
+      <w:r>
+        <w:rPr>
+          <w:rFonts w:hint="eastAsia"/>
+        </w:rPr>
+        <w:t>6</w:t>
+      </w:r>
+      <w:r>
+        <w:t>.</w:t>
+      </w:r>
+      <w:r>
+        <w:rPr>
+          <w:rFonts w:hint="eastAsia"/>
+        </w:rPr>
+        <w:t>7</w:t>
+      </w:r>
+      <w:r>
+        <w:rPr>
+          <w:rFonts w:hint="eastAsia"/>
+        </w:rPr>
+        <w:t>%,</w:t>
+      </w:r>
+      <w:r>
+        <w:t xml:space="preserve"> </w:t>
+      </w:r>
+      <w:r>
+        <w:rPr>
+          <w:rFonts w:hint="eastAsia"/>
+        </w:rPr>
+        <w:t xml:space="preserve">and </w:t>
+      </w:r>
+      <w:r>
+        <w:rPr>
+          <w:lang w:val="en-US"/>
+        </w:rPr>
+        <w:t>1</w:t>
+      </w:r>
+      <w:r>
+        <w:rPr>
+          <w:rFonts w:hint="eastAsia"/>
+          <w:lang w:val="en-US"/>
+        </w:rPr>
+        <w:t>7</w:t>
+      </w:r>
+      <w:r>
+        <w:rPr>
+          <w:lang w:val="en-US"/>
+        </w:rPr>
+        <w:t>.</w:t>
+      </w:r>
+      <w:r>
+        <w:rPr>
+          <w:rFonts w:hint="eastAsia"/>
+          <w:lang w:val="en-US"/>
+        </w:rPr>
+        <w:t>1</w:t>
+      </w:r>
+      <w:r>
+        <w:rPr>
+          <w:rFonts w:hint="eastAsia"/>
+          <w:lang w:val="en-US"/>
+        </w:rPr>
+        <w:t>% by week 9</w:t>
+      </w:r>
+      <w:r>
+        <w:t>.</w:t>
+      </w:r>
+    </w:p>
+    <w:p/>
+    <w:p>
+      <w:r>
+        <w:rPr>
+          <w:b/>
+          <w:bCs/>
+        </w:rPr>
         <w:lastRenderedPageBreak/>
         <w:t>Table 3</w:t>
       </w:r>
@@ -14061,16 +14064,28 @@
         <w:rPr>
           <w:rFonts w:hint="eastAsia"/>
         </w:rPr>
-        <w:t xml:space="preserve">much higher than </w:t>
-      </w:r>
-      <w:r>
-        <w:rPr>
-          <w:rFonts w:hint="eastAsia"/>
-        </w:rPr>
-        <w:t xml:space="preserve">approximate </w:t>
-      </w:r>
-      <w:r>
-        <w:t>GDP per capita in sub-Saharan Africa (≈$1,636</w:t>
+        <w:t>much higher than</w:t>
+      </w:r>
+      <w:r>
+        <w:rPr>
+          <w:rFonts w:hint="eastAsia"/>
+        </w:rPr>
+        <w:t xml:space="preserve"> the median</w:t>
+      </w:r>
+      <w:r>
+        <w:rPr>
+          <w:rFonts w:hint="eastAsia"/>
+        </w:rPr>
+        <w:t xml:space="preserve"> </w:t>
+      </w:r>
+      <w:r>
+        <w:t>GDP per capita in sub-Saharan Africa ($1,6</w:t>
+      </w:r>
+      <w:r>
+        <w:rPr>
+          <w:rFonts w:hint="eastAsia"/>
+        </w:rPr>
+        <w:t>65</w:t>
       </w:r>
       <w:r>
         <w:rPr>
@@ -14144,13 +14159,13 @@
         <w:t xml:space="preserve">also shows that </w:t>
       </w:r>
       <w:r>
-        <w:t>ORI impact</w:t>
-      </w:r>
-      <w:r>
-        <w:rPr>
-          <w:rFonts w:hint="eastAsia"/>
-        </w:rPr>
-        <w:t>, OCV efficiency, and cost effectiveness</w:t>
+        <w:t>impact</w:t>
+      </w:r>
+      <w:r>
+        <w:rPr>
+          <w:rFonts w:hint="eastAsia"/>
+        </w:rPr>
+        <w:t>, efficiency, and cost effectiveness</w:t>
       </w:r>
       <w:r>
         <w:t xml:space="preserve"> w</w:t>
@@ -14216,20 +14231,7 @@
         <w:t xml:space="preserve">and </w:t>
       </w:r>
       <w:r>
-        <w:t>24.6</w:t>
-      </w:r>
-      <w:r>
-        <w:rPr>
-          <w:rFonts w:hint="eastAsia"/>
-          <w:lang w:val="en-US"/>
-        </w:rPr>
-        <w:t>%</w:t>
-      </w:r>
-      <w:r>
-        <w:rPr>
-          <w:lang w:val="en-US"/>
-        </w:rPr>
-        <w:t xml:space="preserve"> </w:t>
+        <w:t xml:space="preserve">41.3% </w:t>
       </w:r>
       <w:r>
         <w:rPr>
@@ -14239,7 +14241,14 @@
         <w:t>[IQR:</w:t>
       </w:r>
       <w:r>
-        <w:t>12.9 - 44.1</w:t>
+        <w:rPr>
+          <w:rFonts w:hint="eastAsia"/>
+          <w:lang w:val="en-US"/>
+        </w:rPr>
+        <w:t xml:space="preserve"> </w:t>
+      </w:r>
+      <w:r>
+        <w:t>25.6 - 57.4</w:t>
       </w:r>
       <w:r>
         <w:rPr>
@@ -14258,7 +14267,142 @@
         <w:t xml:space="preserve"> and</w:t>
       </w:r>
       <w:r>
-        <w:t xml:space="preserve"> week 1</w:t>
+        <w:t xml:space="preserve"> week </w:t>
+      </w:r>
+      <w:r>
+        <w:rPr>
+          <w:rFonts w:hint="eastAsia"/>
+        </w:rPr>
+        <w:t>9</w:t>
+      </w:r>
+      <w:r>
+        <w:rPr>
+          <w:rFonts w:hint="eastAsia"/>
+        </w:rPr>
+        <w:t>, respectively</w:t>
+      </w:r>
+      <w:r>
+        <w:t>.</w:t>
+      </w:r>
+      <w:r>
+        <w:rPr>
+          <w:rFonts w:hint="eastAsia"/>
+        </w:rPr>
+        <w:t xml:space="preserve"> OCV efficiency and cost effectiveness were </w:t>
+      </w:r>
+      <w:r>
+        <w:rPr>
+          <w:rFonts w:hint="eastAsia"/>
+        </w:rPr>
+        <w:t xml:space="preserve">more </w:t>
+      </w:r>
+      <w:r>
+        <w:rPr>
+          <w:rFonts w:hint="eastAsia"/>
+        </w:rPr>
+        <w:t xml:space="preserve">pronounced </w:t>
+      </w:r>
+      <w:r>
+        <w:rPr>
+          <w:rFonts w:hint="eastAsia"/>
+        </w:rPr>
+        <w:t xml:space="preserve">in the top quartile of outbreaks by attack rate. </w:t>
+      </w:r>
+      <w:r>
+        <w:rPr>
+          <w:rFonts w:hint="eastAsia"/>
+        </w:rPr>
+        <w:t xml:space="preserve">Focusing on outbreaks of top quartile of </w:t>
+      </w:r>
+      <w:r>
+        <w:rPr>
+          <w:rFonts w:hint="eastAsia"/>
+        </w:rPr>
+        <w:t>attach rate</w:t>
+      </w:r>
+      <w:r>
+        <w:rPr>
+          <w:rFonts w:hint="eastAsia"/>
+        </w:rPr>
+        <w:t xml:space="preserve"> can achieve </w:t>
+      </w:r>
+      <w:r>
+        <w:rPr>
+          <w:rFonts w:hint="eastAsia"/>
+        </w:rPr>
+        <w:t xml:space="preserve">US$ </w:t>
+      </w:r>
+      <w:r>
+        <w:t xml:space="preserve">2,967 </w:t>
+      </w:r>
+      <w:r>
+        <w:rPr>
+          <w:rFonts w:hint="eastAsia"/>
+        </w:rPr>
+        <w:t xml:space="preserve">[IQR: </w:t>
+      </w:r>
+      <w:r>
+        <w:t>-37 - 45,357</w:t>
+      </w:r>
+      <w:r>
+        <w:rPr>
+          <w:rFonts w:hint="eastAsia"/>
+        </w:rPr>
+        <w:t xml:space="preserve">] and </w:t>
+      </w:r>
+      <w:r>
+        <w:rPr>
+          <w:rFonts w:hint="eastAsia"/>
+        </w:rPr>
+        <w:t xml:space="preserve">US$ </w:t>
+      </w:r>
+      <w:r>
+        <w:t xml:space="preserve">20,433 </w:t>
+      </w:r>
+      <w:r>
+        <w:rPr>
+          <w:rFonts w:hint="eastAsia"/>
+        </w:rPr>
+        <w:t xml:space="preserve">[IQR: </w:t>
+      </w:r>
+      <w:r>
+        <w:t>3,475 - 2,777,567</w:t>
+      </w:r>
+      <w:r>
+        <w:rPr>
+          <w:rFonts w:hint="eastAsia"/>
+        </w:rPr>
+        <w:t>]</w:t>
+      </w:r>
+      <w:r>
+        <w:rPr>
+          <w:rFonts w:hint="eastAsia"/>
+        </w:rPr>
+        <w:t xml:space="preserve"> per DLAY averted</w:t>
+      </w:r>
+      <w:r>
+        <w:rPr>
+          <w:rFonts w:hint="eastAsia"/>
+        </w:rPr>
+        <w:t xml:space="preserve"> for ORIs implemented in week 1 and 9, respectively. </w:t>
+      </w:r>
+      <w:r>
+        <w:rPr>
+          <w:rFonts w:hint="eastAsia"/>
+        </w:rPr>
+        <w:t xml:space="preserve">The median values were comparable to approximately 1.8 and </w:t>
+      </w:r>
+      <w:r>
+        <w:rPr>
+          <w:rFonts w:hint="eastAsia"/>
+        </w:rPr>
+        <w:t>12</w:t>
+      </w:r>
+      <w:r>
+        <w:rPr>
+          <w:rFonts w:hint="eastAsia"/>
+        </w:rPr>
+        <w:t>.</w:t>
       </w:r>
       <w:r>
         <w:rPr>
@@ -14270,125 +14414,45 @@
         <w:rPr>
           <w:rFonts w:hint="eastAsia"/>
         </w:rPr>
-        <w:t>, respectively</w:t>
-      </w:r>
-      <w:r>
-        <w:t>.</w:t>
-      </w:r>
-      <w:r>
-        <w:rPr>
-          <w:rFonts w:hint="eastAsia"/>
-        </w:rPr>
-        <w:t xml:space="preserve"> OCV efficiency and cost effectiveness were </w:t>
-      </w:r>
-      <w:r>
-        <w:rPr>
-          <w:rFonts w:hint="eastAsia"/>
-        </w:rPr>
-        <w:t xml:space="preserve">more </w:t>
-      </w:r>
-      <w:r>
-        <w:rPr>
-          <w:rFonts w:hint="eastAsia"/>
-        </w:rPr>
-        <w:t xml:space="preserve">pronounced </w:t>
-      </w:r>
-      <w:r>
-        <w:rPr>
-          <w:rFonts w:hint="eastAsia"/>
-        </w:rPr>
-        <w:t xml:space="preserve">in the top quartile of outbreaks by attack rate. </w:t>
-      </w:r>
-      <w:r>
-        <w:rPr>
-          <w:rFonts w:hint="eastAsia"/>
-        </w:rPr>
-        <w:t xml:space="preserve">Focusing on outbreaks of top quartile of </w:t>
-      </w:r>
-      <w:r>
-        <w:rPr>
-          <w:rFonts w:hint="eastAsia"/>
-        </w:rPr>
-        <w:t>attach rate</w:t>
-      </w:r>
-      <w:r>
-        <w:rPr>
-          <w:rFonts w:hint="eastAsia"/>
-        </w:rPr>
-        <w:t xml:space="preserve"> can achieve </w:t>
-      </w:r>
-      <w:r>
-        <w:t xml:space="preserve">2,967 </w:t>
-      </w:r>
-      <w:r>
-        <w:rPr>
-          <w:rFonts w:hint="eastAsia"/>
-        </w:rPr>
-        <w:t xml:space="preserve">[IQR: </w:t>
-      </w:r>
-      <w:r>
-        <w:t>-37 - 45,357</w:t>
-      </w:r>
-      <w:r>
-        <w:rPr>
-          <w:rFonts w:hint="eastAsia"/>
-        </w:rPr>
-        <w:t xml:space="preserve">] and </w:t>
-      </w:r>
-      <w:r>
-        <w:t>8,53</w:t>
-      </w:r>
-      <w:r>
-        <w:rPr>
-          <w:rFonts w:hint="eastAsia"/>
-        </w:rPr>
-        <w:t>3</w:t>
-      </w:r>
-      <w:r>
-        <w:t xml:space="preserve"> </w:t>
-      </w:r>
-      <w:r>
-        <w:rPr>
-          <w:rFonts w:hint="eastAsia"/>
-        </w:rPr>
-        <w:t xml:space="preserve">[IQR: </w:t>
-      </w:r>
-      <w:r>
-        <w:t>1,292 - 1,186,542</w:t>
-      </w:r>
-      <w:r>
-        <w:rPr>
-          <w:rFonts w:hint="eastAsia"/>
-        </w:rPr>
-        <w:t xml:space="preserve">] for ORIs implemented in week 1 and 9, respectively. </w:t>
-      </w:r>
-      <w:r>
-        <w:rPr>
-          <w:rFonts w:hint="eastAsia"/>
-        </w:rPr>
-        <w:t>The median values were comparable to approximately 1.8 and 5.2 times the GDP per capita values. Fo</w:t>
-      </w:r>
-      <w:r>
-        <w:rPr>
-          <w:rFonts w:hint="eastAsia"/>
+        <w:t xml:space="preserve"> times the GDP per capita values. </w:t>
+      </w:r>
+      <w:r>
+        <w:rPr>
+          <w:rFonts w:hint="eastAsia"/>
+          <w:highlight w:val="yellow"/>
+        </w:rPr>
+        <w:t>Fo</w:t>
+      </w:r>
+      <w:r>
+        <w:rPr>
+          <w:rFonts w:hint="eastAsia"/>
+          <w:highlight w:val="yellow"/>
         </w:rPr>
         <w:t xml:space="preserve">r the case-triggered scenario, </w:t>
       </w:r>
       <w:r>
+        <w:rPr>
+          <w:highlight w:val="yellow"/>
+        </w:rPr>
         <w:t xml:space="preserve">the impact of ORI </w:t>
       </w:r>
       <w:r>
         <w:rPr>
           <w:rFonts w:hint="eastAsia"/>
+          <w:highlight w:val="yellow"/>
         </w:rPr>
         <w:t>declined</w:t>
       </w:r>
       <w:r>
+        <w:rPr>
+          <w:highlight w:val="yellow"/>
+        </w:rPr>
         <w:t xml:space="preserve"> with longer delays</w:t>
       </w:r>
       <w:r>
         <w:rPr>
           <w:rFonts w:hint="eastAsia"/>
+          <w:highlight w:val="yellow"/>
         </w:rPr>
         <w:t xml:space="preserve"> after the trigger and higher thresholds (</w:t>
       </w:r>
@@ -14397,70 +14461,99 @@
           <w:rFonts w:hint="eastAsia"/>
           <w:b/>
           <w:bCs/>
+          <w:highlight w:val="yellow"/>
         </w:rPr>
         <w:t>Table S2</w:t>
       </w:r>
       <w:r>
         <w:rPr>
           <w:rFonts w:hint="eastAsia"/>
+          <w:highlight w:val="yellow"/>
         </w:rPr>
         <w:t xml:space="preserve">). </w:t>
       </w:r>
       <w:r>
+        <w:rPr>
+          <w:highlight w:val="yellow"/>
+        </w:rPr>
         <w:t>Efficiency also decreased with higher thresholds and longer delays</w:t>
       </w:r>
       <w:r>
         <w:rPr>
           <w:rFonts w:hint="eastAsia"/>
+          <w:highlight w:val="yellow"/>
         </w:rPr>
         <w:t xml:space="preserve">. </w:t>
       </w:r>
       <w:r>
+        <w:rPr>
+          <w:highlight w:val="yellow"/>
+        </w:rPr>
         <w:t>Accordingly, the median cost per case</w:t>
       </w:r>
       <w:r>
         <w:rPr>
           <w:rFonts w:hint="eastAsia"/>
+          <w:highlight w:val="yellow"/>
         </w:rPr>
         <w:t>, death,</w:t>
       </w:r>
       <w:r>
+        <w:rPr>
+          <w:highlight w:val="yellow"/>
+        </w:rPr>
         <w:t xml:space="preserve"> and DALY averted </w:t>
       </w:r>
       <w:r>
         <w:rPr>
           <w:rFonts w:hint="eastAsia"/>
+          <w:highlight w:val="yellow"/>
         </w:rPr>
         <w:t>rose with higher</w:t>
       </w:r>
       <w:r>
+        <w:rPr>
+          <w:highlight w:val="yellow"/>
+        </w:rPr>
         <w:t xml:space="preserve"> thresholds</w:t>
       </w:r>
       <w:r>
         <w:rPr>
           <w:rFonts w:hint="eastAsia"/>
+          <w:highlight w:val="yellow"/>
         </w:rPr>
         <w:t xml:space="preserve"> and longer delays, </w:t>
       </w:r>
       <w:r>
+        <w:rPr>
+          <w:highlight w:val="yellow"/>
+        </w:rPr>
         <w:t xml:space="preserve">remaining below </w:t>
       </w:r>
       <w:r>
         <w:rPr>
           <w:rFonts w:hint="eastAsia"/>
+          <w:highlight w:val="yellow"/>
         </w:rPr>
         <w:t xml:space="preserve">conventional </w:t>
       </w:r>
       <w:r>
+        <w:rPr>
+          <w:highlight w:val="yellow"/>
+        </w:rPr>
         <w:t xml:space="preserve">cost-effectiveness </w:t>
       </w:r>
       <w:r>
         <w:rPr>
           <w:rFonts w:hint="eastAsia"/>
+          <w:highlight w:val="yellow"/>
         </w:rPr>
         <w:t>benchmark</w:t>
       </w:r>
       <w:r>
+        <w:rPr>
+          <w:highlight w:val="yellow"/>
+        </w:rPr>
         <w:t>s</w:t>
       </w:r>
       <w:r>
@@ -14722,36 +14815,54 @@
     <w:p/>
     <w:p>
       <w:r>
+        <w:rPr>
+          <w:highlight w:val="lightGray"/>
+        </w:rPr>
         <w:t>When the impact</w:t>
       </w:r>
       <w:r>
         <w:rPr>
           <w:rFonts w:hint="eastAsia"/>
+          <w:highlight w:val="lightGray"/>
         </w:rPr>
         <w:t xml:space="preserve"> and efficiency</w:t>
       </w:r>
       <w:r>
+        <w:rPr>
+          <w:highlight w:val="lightGray"/>
+        </w:rPr>
         <w:t xml:space="preserve"> of ORI campaigns with 75% vaccine coverage was evaluated across aggregated sets of outbreaks</w:t>
       </w:r>
       <w:r>
         <w:rPr>
           <w:rFonts w:hint="eastAsia"/>
+          <w:highlight w:val="lightGray"/>
         </w:rPr>
         <w:t>,</w:t>
       </w:r>
       <w:r>
+        <w:rPr>
+          <w:highlight w:val="lightGray"/>
+        </w:rPr>
         <w:t xml:space="preserve"> median effectiveness</w:t>
       </w:r>
       <w:r>
         <w:rPr>
           <w:rFonts w:hint="eastAsia"/>
+          <w:highlight w:val="lightGray"/>
         </w:rPr>
         <w:t xml:space="preserve"> and efficiency</w:t>
       </w:r>
       <w:r>
+        <w:rPr>
+          <w:highlight w:val="lightGray"/>
+        </w:rPr>
         <w:t xml:space="preserve"> increased with the number of outbreaks included in the sample </w:t>
       </w:r>
       <w:r>
+        <w:rPr>
+          <w:highlight w:val="lightGray"/>
+        </w:rPr>
         <w:t>(</w:t>
       </w:r>
       <w:r>
@@ -14759,6 +14870,7 @@
           <w:rFonts w:hint="eastAsia"/>
           <w:b/>
           <w:bCs/>
+          <w:highlight w:val="lightGray"/>
         </w:rPr>
         <w:t xml:space="preserve">Figure </w:t>
       </w:r>
@@ -14767,18 +14879,26 @@
           <w:rFonts w:hint="eastAsia"/>
           <w:b/>
           <w:bCs/>
+          <w:highlight w:val="lightGray"/>
         </w:rPr>
         <w:t>S4</w:t>
       </w:r>
       <w:r>
+        <w:rPr>
+          <w:highlight w:val="lightGray"/>
+        </w:rPr>
         <w:t>)</w:t>
       </w:r>
       <w:r>
+        <w:rPr>
+          <w:highlight w:val="lightGray"/>
+        </w:rPr>
         <w:t>.</w:t>
       </w:r>
       <w:r>
         <w:rPr>
           <w:rFonts w:hint="eastAsia"/>
+          <w:highlight w:val="lightGray"/>
         </w:rPr>
         <w:t xml:space="preserve"> </w:t>
       </w:r>
@@ -14786,72 +14906,84 @@
       <w:r>
         <w:rPr>
           <w:rFonts w:hint="eastAsia"/>
+          <w:highlight w:val="lightGray"/>
         </w:rPr>
         <w:t>As such s</w:t>
       </w:r>
       <w:r>
         <w:rPr>
           <w:rFonts w:hint="eastAsia"/>
+          <w:highlight w:val="lightGray"/>
         </w:rPr>
         <w:t>ubstantial impact w</w:t>
       </w:r>
       <w:r>
         <w:rPr>
           <w:rFonts w:hint="eastAsia"/>
+          <w:highlight w:val="lightGray"/>
         </w:rPr>
         <w:t>as</w:t>
       </w:r>
       <w:r>
         <w:rPr>
           <w:rFonts w:hint="eastAsia"/>
+          <w:highlight w:val="lightGray"/>
         </w:rPr>
         <w:t xml:space="preserve"> observed when the outbreaks were </w:t>
       </w:r>
       <w:r>
         <w:rPr>
           <w:rFonts w:hint="eastAsia"/>
+          <w:highlight w:val="lightGray"/>
         </w:rPr>
         <w:t>aggregated</w:t>
       </w:r>
       <w:r>
         <w:rPr>
           <w:rFonts w:hint="eastAsia"/>
-        </w:rPr>
-        <w:t xml:space="preserve"> </w:t>
-      </w:r>
-      <w:r>
-        <w:rPr>
-          <w:rFonts w:hint="eastAsia"/>
+          <w:highlight w:val="lightGray"/>
+        </w:rPr>
+        <w:t xml:space="preserve"> </w:t>
+      </w:r>
+      <w:r>
+        <w:rPr>
+          <w:rFonts w:hint="eastAsia"/>
+          <w:highlight w:val="lightGray"/>
         </w:rPr>
         <w:t xml:space="preserve">to reflect </w:t>
       </w:r>
       <w:r>
         <w:rPr>
           <w:rFonts w:hint="eastAsia"/>
+          <w:highlight w:val="lightGray"/>
         </w:rPr>
         <w:t xml:space="preserve">the </w:t>
       </w:r>
       <w:r>
         <w:rPr>
           <w:rFonts w:hint="eastAsia"/>
+          <w:highlight w:val="lightGray"/>
         </w:rPr>
         <w:t xml:space="preserve">volume </w:t>
       </w:r>
       <w:r>
         <w:rPr>
           <w:rFonts w:hint="eastAsia"/>
+          <w:highlight w:val="lightGray"/>
         </w:rPr>
         <w:t xml:space="preserve">of OCVs deployed </w:t>
       </w:r>
       <w:r>
         <w:rPr>
           <w:rFonts w:hint="eastAsia"/>
+          <w:highlight w:val="lightGray"/>
         </w:rPr>
         <w:t>t</w:t>
       </w:r>
       <w:r>
         <w:rPr>
           <w:rFonts w:hint="eastAsia"/>
+          <w:highlight w:val="lightGray"/>
         </w:rPr>
         <w:t xml:space="preserve">hrough the global stockpile </w:t>
       </w:r>
@@ -14859,6 +14991,7 @@
       <w:r>
         <w:rPr>
           <w:rFonts w:hint="eastAsia"/>
+          <w:highlight w:val="lightGray"/>
         </w:rPr>
         <w:t>(</w:t>
       </w:r>
@@ -14867,6 +15000,7 @@
           <w:rFonts w:hint="eastAsia"/>
           <w:b/>
           <w:bCs/>
+          <w:highlight w:val="lightGray"/>
         </w:rPr>
         <w:t xml:space="preserve">Figure </w:t>
       </w:r>
@@ -14875,6 +15009,7 @@
           <w:rFonts w:hint="eastAsia"/>
           <w:b/>
           <w:bCs/>
+          <w:highlight w:val="lightGray"/>
         </w:rPr>
         <w:t>4</w:t>
       </w:r>
@@ -14883,12 +15018,14 @@
           <w:rFonts w:hint="eastAsia"/>
           <w:b/>
           <w:bCs/>
+          <w:highlight w:val="lightGray"/>
         </w:rPr>
         <w:t>;</w:t>
       </w:r>
       <w:r>
         <w:rPr>
           <w:rFonts w:hint="eastAsia"/>
+          <w:highlight w:val="lightGray"/>
         </w:rPr>
         <w:t xml:space="preserve"> more details in </w:t>
       </w:r>
@@ -14897,95 +15034,121 @@
           <w:rFonts w:hint="eastAsia"/>
           <w:b/>
           <w:bCs/>
+          <w:highlight w:val="lightGray"/>
         </w:rPr>
         <w:t>Table S3</w:t>
       </w:r>
       <w:r>
         <w:rPr>
           <w:rFonts w:hint="eastAsia"/>
+          <w:highlight w:val="lightGray"/>
         </w:rPr>
         <w:t>). Over time</w:t>
       </w:r>
       <w:r>
         <w:rPr>
           <w:rFonts w:hint="eastAsia"/>
+          <w:highlight w:val="lightGray"/>
         </w:rPr>
         <w:t xml:space="preserve">, </w:t>
       </w:r>
       <w:r>
+        <w:rPr>
+          <w:highlight w:val="lightGray"/>
+        </w:rPr>
         <w:t>the</w:t>
       </w:r>
       <w:r>
         <w:rPr>
           <w:rFonts w:hint="eastAsia"/>
-        </w:rPr>
-        <w:t xml:space="preserve"> </w:t>
-      </w:r>
-      <w:r>
-        <w:rPr>
-          <w:rFonts w:hint="eastAsia"/>
+          <w:highlight w:val="lightGray"/>
+        </w:rPr>
+        <w:t xml:space="preserve"> </w:t>
+      </w:r>
+      <w:r>
+        <w:rPr>
+          <w:rFonts w:hint="eastAsia"/>
+          <w:highlight w:val="lightGray"/>
         </w:rPr>
         <w:t xml:space="preserve">aggregated </w:t>
       </w:r>
       <w:r>
         <w:rPr>
           <w:rFonts w:hint="eastAsia"/>
+          <w:highlight w:val="lightGray"/>
         </w:rPr>
         <w:t xml:space="preserve">number of </w:t>
       </w:r>
       <w:r>
         <w:rPr>
           <w:rFonts w:hint="eastAsia"/>
+          <w:highlight w:val="lightGray"/>
         </w:rPr>
         <w:t>case</w:t>
       </w:r>
       <w:r>
         <w:rPr>
           <w:rFonts w:hint="eastAsia"/>
+          <w:highlight w:val="lightGray"/>
         </w:rPr>
         <w:t>s</w:t>
       </w:r>
       <w:r>
         <w:rPr>
           <w:rFonts w:hint="eastAsia"/>
+          <w:highlight w:val="lightGray"/>
         </w:rPr>
         <w:t xml:space="preserve"> a</w:t>
       </w:r>
       <w:r>
+        <w:rPr>
+          <w:highlight w:val="lightGray"/>
+        </w:rPr>
         <w:t>verted by these campaigns increased</w:t>
       </w:r>
       <w:r>
         <w:rPr>
           <w:rFonts w:hint="eastAsia"/>
+          <w:highlight w:val="lightGray"/>
         </w:rPr>
         <w:t>,</w:t>
       </w:r>
       <w:r>
         <w:rPr>
           <w:rFonts w:hint="eastAsia"/>
-        </w:rPr>
-        <w:t xml:space="preserve"> </w:t>
-      </w:r>
-      <w:r>
+          <w:highlight w:val="lightGray"/>
+        </w:rPr>
+        <w:t xml:space="preserve"> </w:t>
+      </w:r>
+      <w:r>
+        <w:rPr>
+          <w:highlight w:val="lightGray"/>
+        </w:rPr>
         <w:t>reach</w:t>
       </w:r>
       <w:r>
         <w:rPr>
           <w:rFonts w:hint="eastAsia"/>
+          <w:highlight w:val="lightGray"/>
         </w:rPr>
         <w:t>ing</w:t>
       </w:r>
       <w:r>
-        <w:t xml:space="preserve"> </w:t>
-      </w:r>
-      <w:r>
-        <w:rPr>
-          <w:rFonts w:hint="eastAsia"/>
+        <w:rPr>
+          <w:highlight w:val="lightGray"/>
+        </w:rPr>
+        <w:t xml:space="preserve"> </w:t>
+      </w:r>
+      <w:r>
+        <w:rPr>
+          <w:rFonts w:hint="eastAsia"/>
+          <w:highlight w:val="lightGray"/>
         </w:rPr>
         <w:t>4,028</w:t>
       </w:r>
       <w:r>
         <w:rPr>
+          <w:highlight w:val="lightGray"/>
           <w:lang w:val="en-US"/>
         </w:rPr>
         <w:t xml:space="preserve"> [IQR: </w:t>
@@ -14993,12 +15156,14 @@
       <w:r>
         <w:rPr>
           <w:rFonts w:hint="eastAsia"/>
+          <w:highlight w:val="lightGray"/>
           <w:lang w:val="en-US"/>
         </w:rPr>
         <w:t>3</w:t>
       </w:r>
       <w:r>
         <w:rPr>
+          <w:highlight w:val="lightGray"/>
           <w:lang w:val="en-US"/>
         </w:rPr>
         <w:t>,</w:t>
@@ -15006,12 +15171,14 @@
       <w:r>
         <w:rPr>
           <w:rFonts w:hint="eastAsia"/>
+          <w:highlight w:val="lightGray"/>
           <w:lang w:val="en-US"/>
         </w:rPr>
         <w:t>679</w:t>
       </w:r>
       <w:r>
         <w:rPr>
+          <w:highlight w:val="lightGray"/>
           <w:lang w:val="en-US"/>
         </w:rPr>
         <w:t xml:space="preserve"> - </w:t>
@@ -15019,12 +15186,14 @@
       <w:r>
         <w:rPr>
           <w:rFonts w:hint="eastAsia"/>
+          <w:highlight w:val="lightGray"/>
           <w:lang w:val="en-US"/>
         </w:rPr>
         <w:t>4</w:t>
       </w:r>
       <w:r>
         <w:rPr>
+          <w:highlight w:val="lightGray"/>
           <w:lang w:val="en-US"/>
         </w:rPr>
         <w:t>,</w:t>
@@ -15032,12 +15201,14 @@
       <w:r>
         <w:rPr>
           <w:rFonts w:hint="eastAsia"/>
+          <w:highlight w:val="lightGray"/>
           <w:lang w:val="en-US"/>
         </w:rPr>
         <w:t>376</w:t>
       </w:r>
       <w:r>
         <w:rPr>
+          <w:highlight w:val="lightGray"/>
           <w:lang w:val="en-US"/>
         </w:rPr>
         <w:t>]</w:t>
@@ -15045,88 +15216,105 @@
       <w:r>
         <w:rPr>
           <w:rFonts w:hint="eastAsia"/>
-          <w:lang w:val="en-US"/>
-        </w:rPr>
-        <w:t xml:space="preserve"> </w:t>
-      </w:r>
-      <w:r>
-        <w:rPr>
-          <w:rFonts w:hint="eastAsia"/>
+          <w:highlight w:val="lightGray"/>
+          <w:lang w:val="en-US"/>
+        </w:rPr>
+        <w:t xml:space="preserve"> </w:t>
+      </w:r>
+      <w:r>
+        <w:rPr>
+          <w:rFonts w:hint="eastAsia"/>
+          <w:highlight w:val="lightGray"/>
         </w:rPr>
         <w:t>by</w:t>
       </w:r>
       <w:r>
         <w:rPr>
           <w:rFonts w:hint="eastAsia"/>
+          <w:highlight w:val="lightGray"/>
         </w:rPr>
         <w:t xml:space="preserve"> 202</w:t>
       </w:r>
       <w:r>
         <w:rPr>
           <w:rFonts w:hint="eastAsia"/>
+          <w:highlight w:val="lightGray"/>
         </w:rPr>
         <w:t>0</w:t>
       </w:r>
       <w:r>
         <w:rPr>
           <w:rFonts w:hint="eastAsia"/>
+          <w:highlight w:val="lightGray"/>
         </w:rPr>
         <w:t>.</w:t>
       </w:r>
       <w:r>
         <w:rPr>
           <w:rFonts w:hint="eastAsia"/>
-        </w:rPr>
-        <w:t xml:space="preserve"> </w:t>
-      </w:r>
-      <w:r>
+          <w:highlight w:val="lightGray"/>
+        </w:rPr>
+        <w:t xml:space="preserve"> </w:t>
+      </w:r>
+      <w:r>
+        <w:rPr>
+          <w:highlight w:val="lightGray"/>
+        </w:rPr>
         <w:t>The percent</w:t>
       </w:r>
       <w:r>
         <w:rPr>
           <w:rFonts w:hint="eastAsia"/>
+          <w:highlight w:val="lightGray"/>
         </w:rPr>
         <w:t>age</w:t>
       </w:r>
       <w:r>
         <w:rPr>
           <w:rFonts w:hint="eastAsia"/>
-        </w:rPr>
-        <w:t xml:space="preserve"> </w:t>
-      </w:r>
-      <w:r>
-        <w:rPr>
-          <w:rFonts w:hint="eastAsia"/>
+          <w:highlight w:val="lightGray"/>
+        </w:rPr>
+        <w:t xml:space="preserve"> </w:t>
+      </w:r>
+      <w:r>
+        <w:rPr>
+          <w:rFonts w:hint="eastAsia"/>
+          <w:highlight w:val="lightGray"/>
         </w:rPr>
         <w:t>cases averted also rose steadily</w:t>
       </w:r>
       <w:r>
         <w:rPr>
           <w:rFonts w:hint="eastAsia"/>
+          <w:highlight w:val="lightGray"/>
         </w:rPr>
         <w:t xml:space="preserve"> to</w:t>
       </w:r>
       <w:r>
         <w:rPr>
           <w:rFonts w:hint="eastAsia"/>
-        </w:rPr>
-        <w:t xml:space="preserve"> </w:t>
-      </w:r>
-      <w:r>
-        <w:rPr>
-          <w:rFonts w:hint="eastAsia"/>
+          <w:highlight w:val="lightGray"/>
+        </w:rPr>
+        <w:t xml:space="preserve"> </w:t>
+      </w:r>
+      <w:r>
+        <w:rPr>
+          <w:rFonts w:hint="eastAsia"/>
+          <w:highlight w:val="lightGray"/>
         </w:rPr>
         <w:t>32.3</w:t>
       </w:r>
       <w:r>
         <w:rPr>
           <w:rFonts w:hint="eastAsia"/>
+          <w:highlight w:val="lightGray"/>
           <w:lang w:val="en-US"/>
         </w:rPr>
         <w:t>%</w:t>
       </w:r>
       <w:r>
         <w:rPr>
+          <w:highlight w:val="lightGray"/>
           <w:lang w:val="en-US"/>
         </w:rPr>
         <w:t xml:space="preserve"> [IQR: </w:t>
@@ -15134,12 +15322,14 @@
       <w:r>
         <w:rPr>
           <w:rFonts w:hint="eastAsia"/>
+          <w:highlight w:val="lightGray"/>
           <w:lang w:val="en-US"/>
         </w:rPr>
         <w:t xml:space="preserve">29.1 - </w:t>
       </w:r>
       <w:r>
         <w:rPr>
+          <w:highlight w:val="lightGray"/>
           <w:lang w:val="en-US"/>
         </w:rPr>
         <w:t>3</w:t>
@@ -15147,12 +15337,14 @@
       <w:r>
         <w:rPr>
           <w:rFonts w:hint="eastAsia"/>
+          <w:highlight w:val="lightGray"/>
           <w:lang w:val="en-US"/>
         </w:rPr>
         <w:t>5.2</w:t>
       </w:r>
       <w:r>
         <w:rPr>
+          <w:highlight w:val="lightGray"/>
           <w:lang w:val="en-US"/>
         </w:rPr>
         <w:t>]</w:t>
@@ -15160,25 +15352,29 @@
       <w:r>
         <w:rPr>
           <w:rFonts w:hint="eastAsia"/>
-          <w:lang w:val="en-US"/>
-        </w:rPr>
-        <w:t xml:space="preserve"> </w:t>
-      </w:r>
-      <w:r>
-        <w:rPr>
-          <w:rFonts w:hint="eastAsia"/>
+          <w:highlight w:val="lightGray"/>
+          <w:lang w:val="en-US"/>
+        </w:rPr>
+        <w:t xml:space="preserve"> </w:t>
+      </w:r>
+      <w:r>
+        <w:rPr>
+          <w:rFonts w:hint="eastAsia"/>
+          <w:highlight w:val="lightGray"/>
         </w:rPr>
         <w:t>in 202</w:t>
       </w:r>
       <w:r>
         <w:rPr>
           <w:rFonts w:hint="eastAsia"/>
+          <w:highlight w:val="lightGray"/>
         </w:rPr>
         <w:t>0</w:t>
       </w:r>
       <w:r>
         <w:rPr>
           <w:rFonts w:hint="eastAsia"/>
+          <w:highlight w:val="lightGray"/>
         </w:rPr>
         <w:t xml:space="preserve">, assuming a 9-week delay </w:t>
       </w:r>
@@ -15186,6 +15382,7 @@
       <w:r>
         <w:rPr>
           <w:rFonts w:hint="eastAsia"/>
+          <w:highlight w:val="lightGray"/>
         </w:rPr>
         <w:t>in ORI</w:t>
       </w:r>
@@ -15193,126 +15390,172 @@
       <w:r>
         <w:rPr>
           <w:rFonts w:hint="eastAsia"/>
+          <w:highlight w:val="lightGray"/>
         </w:rPr>
         <w:t xml:space="preserve"> implementation</w:t>
       </w:r>
       <w:r>
         <w:rPr>
           <w:rFonts w:hint="eastAsia"/>
+          <w:highlight w:val="lightGray"/>
         </w:rPr>
         <w:t xml:space="preserve"> with 75% coverage</w:t>
       </w:r>
       <w:r>
         <w:rPr>
           <w:rFonts w:hint="eastAsia"/>
+          <w:highlight w:val="lightGray"/>
         </w:rPr>
         <w:t>.</w:t>
       </w:r>
       <w:r>
         <w:rPr>
           <w:rFonts w:hint="eastAsia"/>
+          <w:highlight w:val="lightGray"/>
         </w:rPr>
         <w:t xml:space="preserve"> These values increase further if ORIs are prioritized to longer outbreaks. If outbreaks are targeted to top 25% of outbreaks by duration, case averted increased to </w:t>
       </w:r>
       <w:r>
+        <w:rPr>
+          <w:highlight w:val="lightGray"/>
+        </w:rPr>
         <w:t xml:space="preserve">7,805 </w:t>
       </w:r>
       <w:r>
         <w:rPr>
           <w:rFonts w:hint="eastAsia"/>
+          <w:highlight w:val="lightGray"/>
         </w:rPr>
         <w:t xml:space="preserve">[IQR: </w:t>
       </w:r>
       <w:r>
+        <w:rPr>
+          <w:highlight w:val="lightGray"/>
+        </w:rPr>
         <w:t>7,126 - 8,438</w:t>
       </w:r>
       <w:r>
         <w:rPr>
           <w:rFonts w:hint="eastAsia"/>
+          <w:highlight w:val="lightGray"/>
         </w:rPr>
         <w:t xml:space="preserve">], corresponding to </w:t>
       </w:r>
       <w:r>
+        <w:rPr>
+          <w:highlight w:val="lightGray"/>
+        </w:rPr>
         <w:t>41.3</w:t>
       </w:r>
       <w:r>
         <w:rPr>
           <w:rFonts w:hint="eastAsia"/>
+          <w:highlight w:val="lightGray"/>
         </w:rPr>
         <w:t>%</w:t>
       </w:r>
       <w:r>
-        <w:t xml:space="preserve"> </w:t>
-      </w:r>
-      <w:r>
-        <w:rPr>
-          <w:rFonts w:hint="eastAsia"/>
+        <w:rPr>
+          <w:highlight w:val="lightGray"/>
+        </w:rPr>
+        <w:t xml:space="preserve"> </w:t>
+      </w:r>
+      <w:r>
+        <w:rPr>
+          <w:rFonts w:hint="eastAsia"/>
+          <w:highlight w:val="lightGray"/>
         </w:rPr>
         <w:t xml:space="preserve">[IQR: </w:t>
       </w:r>
       <w:r>
+        <w:rPr>
+          <w:highlight w:val="lightGray"/>
+        </w:rPr>
         <w:t>37.6 - 44.8</w:t>
       </w:r>
       <w:r>
         <w:rPr>
           <w:rFonts w:hint="eastAsia"/>
+          <w:highlight w:val="lightGray"/>
         </w:rPr>
         <w:t xml:space="preserve">] under the same conditions of 9-week delay in ORI implementation with 70% coverage. </w:t>
       </w:r>
       <w:r>
+        <w:rPr>
+          <w:highlight w:val="lightGray"/>
+        </w:rPr>
         <w:t xml:space="preserve">These </w:t>
       </w:r>
       <w:r>
         <w:rPr>
           <w:rFonts w:hint="eastAsia"/>
+          <w:highlight w:val="lightGray"/>
         </w:rPr>
         <w:t>e</w:t>
       </w:r>
       <w:r>
+        <w:rPr>
+          <w:highlight w:val="lightGray"/>
+        </w:rPr>
         <w:t>stimates</w:t>
       </w:r>
       <w:r>
         <w:rPr>
           <w:rFonts w:hint="eastAsia"/>
+          <w:highlight w:val="lightGray"/>
         </w:rPr>
         <w:t xml:space="preserve"> across aggregated outbreaks</w:t>
       </w:r>
       <w:r>
+        <w:rPr>
+          <w:highlight w:val="lightGray"/>
+        </w:rPr>
         <w:t xml:space="preserve"> contrast with the lower median impact observed when vaccination scenarios were evaluated at the level of individual outbreaks—e.g., </w:t>
       </w:r>
       <w:r>
+        <w:rPr>
+          <w:highlight w:val="lightGray"/>
+        </w:rPr>
         <w:t>12.3 [IQR: 1.7 - 34.2]</w:t>
       </w:r>
       <w:r>
         <w:rPr>
           <w:rFonts w:hint="eastAsia"/>
-        </w:rPr>
-        <w:t xml:space="preserve"> </w:t>
-      </w:r>
-      <w:r>
+          <w:highlight w:val="lightGray"/>
+        </w:rPr>
+        <w:t xml:space="preserve"> </w:t>
+      </w:r>
+      <w:r>
+        <w:rPr>
+          <w:highlight w:val="lightGray"/>
+        </w:rPr>
         <w:t>under a comparable implementation delay</w:t>
       </w:r>
       <w:r>
         <w:rPr>
           <w:rFonts w:hint="eastAsia"/>
+          <w:highlight w:val="lightGray"/>
         </w:rPr>
         <w:t xml:space="preserve"> (</w:t>
       </w:r>
       <w:r>
         <w:rPr>
           <w:rFonts w:hint="eastAsia"/>
+          <w:highlight w:val="lightGray"/>
         </w:rPr>
         <w:t xml:space="preserve">as </w:t>
       </w:r>
       <w:r>
         <w:rPr>
           <w:rFonts w:hint="eastAsia"/>
+          <w:highlight w:val="lightGray"/>
         </w:rPr>
         <w:t xml:space="preserve">previously </w:t>
       </w:r>
       <w:r>
         <w:rPr>
           <w:rFonts w:hint="eastAsia"/>
+          <w:highlight w:val="lightGray"/>
         </w:rPr>
         <w:t xml:space="preserve">illustrated in </w:t>
       </w:r>
@@ -15321,12 +15564,14 @@
           <w:rFonts w:hint="eastAsia"/>
           <w:b/>
           <w:bCs/>
+          <w:highlight w:val="lightGray"/>
         </w:rPr>
         <w:t>Table2</w:t>
       </w:r>
       <w:r>
         <w:rPr>
           <w:rFonts w:hint="eastAsia"/>
+          <w:highlight w:val="lightGray"/>
         </w:rPr>
         <w:t xml:space="preserve"> and </w:t>
       </w:r>
@@ -15335,32 +15580,48 @@
           <w:rFonts w:hint="eastAsia"/>
           <w:b/>
           <w:bCs/>
+          <w:highlight w:val="lightGray"/>
         </w:rPr>
         <w:t>Figure 3</w:t>
       </w:r>
       <w:r>
         <w:rPr>
           <w:rFonts w:hint="eastAsia"/>
+          <w:highlight w:val="lightGray"/>
         </w:rPr>
         <w:t>)</w:t>
       </w:r>
       <w:r>
         <w:rPr>
           <w:rFonts w:hint="eastAsia"/>
-        </w:rPr>
-        <w:t xml:space="preserve">. </w:t>
+          <w:highlight w:val="lightGray"/>
+        </w:rPr>
+        <w:t>.</w:t>
+      </w:r>
+      <w:r>
+        <w:rPr>
+          <w:rFonts w:hint="eastAsia"/>
+        </w:rPr>
+        <w:t xml:space="preserve"> </w:t>
       </w:r>
     </w:p>
     <w:p>
       <w:pPr>
         <w:pStyle w:val="Heading4"/>
-      </w:pPr>
-      <w:r>
+        <w:rPr>
+          <w:highlight w:val="lightGray"/>
+        </w:rPr>
+      </w:pPr>
+      <w:r>
+        <w:rPr>
+          <w:highlight w:val="lightGray"/>
+        </w:rPr>
         <w:t>Efficiency and cost</w:t>
       </w:r>
       <w:r>
         <w:rPr>
           <w:rFonts w:hint="eastAsia"/>
+          <w:highlight w:val="lightGray"/>
         </w:rPr>
         <w:t xml:space="preserve"> effectiveness</w:t>
       </w:r>
@@ -15374,36 +15635,42 @@
       <w:r>
         <w:rPr>
           <w:rFonts w:hint="eastAsia"/>
+          <w:highlight w:val="lightGray"/>
         </w:rPr>
         <w:t>C</w:t>
       </w:r>
       <w:r>
         <w:rPr>
           <w:rFonts w:hint="eastAsia"/>
+          <w:highlight w:val="lightGray"/>
         </w:rPr>
         <w:t>ase</w:t>
       </w:r>
       <w:r>
         <w:rPr>
           <w:rFonts w:hint="eastAsia"/>
+          <w:highlight w:val="lightGray"/>
         </w:rPr>
         <w:t>s</w:t>
       </w:r>
       <w:r>
         <w:rPr>
           <w:rFonts w:hint="eastAsia"/>
+          <w:highlight w:val="lightGray"/>
         </w:rPr>
         <w:t xml:space="preserve"> averted per </w:t>
       </w:r>
       <w:r>
         <w:rPr>
           <w:rFonts w:hint="eastAsia"/>
+          <w:highlight w:val="lightGray"/>
         </w:rPr>
         <w:t>1,000 OCVs</w:t>
       </w:r>
       <w:r>
         <w:rPr>
           <w:rFonts w:hint="eastAsia"/>
+          <w:highlight w:val="lightGray"/>
         </w:rPr>
         <w:t xml:space="preserve"> (</w:t>
       </w:r>
@@ -15412,6 +15679,7 @@
           <w:rFonts w:hint="eastAsia"/>
           <w:b/>
           <w:bCs/>
+          <w:highlight w:val="lightGray"/>
         </w:rPr>
         <w:t xml:space="preserve">Figure </w:t>
       </w:r>
@@ -15420,6 +15688,7 @@
           <w:rFonts w:hint="eastAsia"/>
           <w:b/>
           <w:bCs/>
+          <w:highlight w:val="lightGray"/>
         </w:rPr>
         <w:t>5</w:t>
       </w:r>
@@ -15428,18 +15697,21 @@
           <w:rFonts w:hint="eastAsia"/>
           <w:b/>
           <w:bCs/>
+          <w:highlight w:val="lightGray"/>
         </w:rPr>
         <w:t>D</w:t>
       </w:r>
       <w:r>
         <w:rPr>
           <w:rFonts w:hint="eastAsia"/>
+          <w:highlight w:val="lightGray"/>
         </w:rPr>
         <w:t>)</w:t>
       </w:r>
       <w:r>
         <w:rPr>
           <w:rFonts w:hint="eastAsia"/>
+          <w:highlight w:val="lightGray"/>
         </w:rPr>
         <w:t xml:space="preserve"> tended to increase while the cost per case averted (</w:t>
       </w:r>
@@ -15448,6 +15720,7 @@
           <w:rFonts w:hint="eastAsia"/>
           <w:b/>
           <w:bCs/>
+          <w:highlight w:val="lightGray"/>
         </w:rPr>
         <w:t xml:space="preserve">Figure </w:t>
       </w:r>
@@ -15456,6 +15729,7 @@
           <w:rFonts w:hint="eastAsia"/>
           <w:b/>
           <w:bCs/>
+          <w:highlight w:val="lightGray"/>
         </w:rPr>
         <w:t>5</w:t>
       </w:r>
@@ -15464,18 +15738,21 @@
           <w:rFonts w:hint="eastAsia"/>
           <w:b/>
           <w:bCs/>
+          <w:highlight w:val="lightGray"/>
         </w:rPr>
         <w:t>E</w:t>
       </w:r>
       <w:r>
         <w:rPr>
           <w:rFonts w:hint="eastAsia"/>
+          <w:highlight w:val="lightGray"/>
         </w:rPr>
         <w:t xml:space="preserve">) and the cost per DALY averted </w:t>
       </w:r>
       <w:r>
         <w:rPr>
           <w:rFonts w:hint="eastAsia"/>
+          <w:highlight w:val="lightGray"/>
         </w:rPr>
         <w:t>(</w:t>
       </w:r>
@@ -15484,6 +15761,7 @@
           <w:rFonts w:hint="eastAsia"/>
           <w:b/>
           <w:bCs/>
+          <w:highlight w:val="lightGray"/>
         </w:rPr>
         <w:t xml:space="preserve">Figure </w:t>
       </w:r>
@@ -15492,6 +15770,7 @@
           <w:rFonts w:hint="eastAsia"/>
           <w:b/>
           <w:bCs/>
+          <w:highlight w:val="lightGray"/>
         </w:rPr>
         <w:t>5</w:t>
       </w:r>
@@ -15500,81 +15779,102 @@
           <w:rFonts w:hint="eastAsia"/>
           <w:b/>
           <w:bCs/>
+          <w:highlight w:val="lightGray"/>
         </w:rPr>
         <w:t>F</w:t>
       </w:r>
       <w:r>
         <w:rPr>
           <w:rFonts w:hint="eastAsia"/>
+          <w:highlight w:val="lightGray"/>
         </w:rPr>
         <w:t xml:space="preserve">) </w:t>
       </w:r>
       <w:r>
         <w:rPr>
           <w:rFonts w:hint="eastAsia"/>
+          <w:highlight w:val="lightGray"/>
         </w:rPr>
         <w:t xml:space="preserve">tended to </w:t>
       </w:r>
       <w:r>
+        <w:rPr>
+          <w:highlight w:val="lightGray"/>
+        </w:rPr>
         <w:t>decrease</w:t>
       </w:r>
       <w:r>
         <w:rPr>
           <w:rFonts w:hint="eastAsia"/>
+          <w:highlight w:val="lightGray"/>
         </w:rPr>
         <w:t xml:space="preserve"> as the years went by and the number of OCV doses used increased. Also, variability</w:t>
       </w:r>
       <w:r>
         <w:rPr>
           <w:rFonts w:hint="eastAsia"/>
+          <w:highlight w:val="lightGray"/>
         </w:rPr>
         <w:t xml:space="preserve"> in these metrics</w:t>
       </w:r>
       <w:r>
         <w:rPr>
           <w:rFonts w:hint="eastAsia"/>
+          <w:highlight w:val="lightGray"/>
         </w:rPr>
         <w:t xml:space="preserve"> decreased</w:t>
       </w:r>
       <w:r>
+        <w:rPr>
+          <w:highlight w:val="lightGray"/>
+        </w:rPr>
         <w:t xml:space="preserve"> as the number of deployed</w:t>
       </w:r>
       <w:r>
         <w:rPr>
           <w:rFonts w:hint="eastAsia"/>
-        </w:rPr>
-        <w:t xml:space="preserve"> </w:t>
-      </w:r>
-      <w:r>
-        <w:rPr>
-          <w:rFonts w:hint="eastAsia"/>
+          <w:highlight w:val="lightGray"/>
+        </w:rPr>
+        <w:t xml:space="preserve"> </w:t>
+      </w:r>
+      <w:r>
+        <w:rPr>
+          <w:rFonts w:hint="eastAsia"/>
+          <w:highlight w:val="lightGray"/>
         </w:rPr>
         <w:t>doses</w:t>
       </w:r>
       <w:r>
+        <w:rPr>
+          <w:highlight w:val="lightGray"/>
+        </w:rPr>
         <w:t xml:space="preserve"> increased.</w:t>
       </w:r>
       <w:r>
         <w:rPr>
           <w:rFonts w:hint="eastAsia"/>
-        </w:rPr>
-        <w:t xml:space="preserve"> </w:t>
-      </w:r>
-      <w:r>
-        <w:rPr>
-          <w:rFonts w:hint="eastAsia"/>
+          <w:highlight w:val="lightGray"/>
+        </w:rPr>
+        <w:t xml:space="preserve"> </w:t>
+      </w:r>
+      <w:r>
+        <w:rPr>
+          <w:rFonts w:hint="eastAsia"/>
+          <w:highlight w:val="lightGray"/>
         </w:rPr>
         <w:t xml:space="preserve">By 2020, </w:t>
       </w:r>
       <w:r>
         <w:rPr>
           <w:rFonts w:hint="eastAsia"/>
+          <w:highlight w:val="lightGray"/>
         </w:rPr>
         <w:t>the estimated c</w:t>
       </w:r>
       <w:r>
         <w:rPr>
           <w:rFonts w:hint="eastAsia"/>
+          <w:highlight w:val="lightGray"/>
         </w:rPr>
         <w:t xml:space="preserve">ase averted per 1,000 OCVs </w:t>
       </w:r>
@@ -15582,6 +15882,7 @@
       <w:r>
         <w:rPr>
           <w:rFonts w:hint="eastAsia"/>
+          <w:highlight w:val="lightGray"/>
         </w:rPr>
         <w:t>were</w:t>
       </w:r>
@@ -15589,11 +15890,13 @@
       <w:r>
         <w:rPr>
           <w:rFonts w:hint="eastAsia"/>
-        </w:rPr>
-        <w:t xml:space="preserve"> </w:t>
-      </w:r>
-      <w:r>
-        <w:rPr>
+          <w:highlight w:val="lightGray"/>
+        </w:rPr>
+        <w:t xml:space="preserve"> </w:t>
+      </w:r>
+      <w:r>
+        <w:rPr>
+          <w:highlight w:val="lightGray"/>
           <w:lang w:val="en-US"/>
         </w:rPr>
         <w:t>0.409 [IQR: 0.374 - 0.451]</w:t>
@@ -15601,38 +15904,47 @@
       <w:r>
         <w:rPr>
           <w:rFonts w:hint="eastAsia"/>
+          <w:highlight w:val="lightGray"/>
         </w:rPr>
         <w:t>,</w:t>
       </w:r>
       <w:r>
         <w:rPr>
           <w:rFonts w:hint="eastAsia"/>
+          <w:highlight w:val="lightGray"/>
         </w:rPr>
         <w:t xml:space="preserve"> which could increase to</w:t>
       </w:r>
       <w:r>
         <w:rPr>
           <w:rFonts w:hint="eastAsia"/>
-        </w:rPr>
-        <w:t xml:space="preserve"> </w:t>
-      </w:r>
-      <w:r>
+          <w:highlight w:val="lightGray"/>
+        </w:rPr>
+        <w:t xml:space="preserve"> </w:t>
+      </w:r>
+      <w:r>
+        <w:rPr>
+          <w:highlight w:val="lightGray"/>
+        </w:rPr>
         <w:t>0.736 [IQR: 0.663 - 0.813]</w:t>
       </w:r>
       <w:r>
         <w:rPr>
           <w:rFonts w:hint="eastAsia"/>
+          <w:highlight w:val="lightGray"/>
         </w:rPr>
         <w:t xml:space="preserve"> if top quartile of outbreaks by duration are prioritized. These median values are substantially higher </w:t>
       </w:r>
       <w:r>
         <w:rPr>
           <w:rFonts w:hint="eastAsia"/>
+          <w:highlight w:val="lightGray"/>
         </w:rPr>
         <w:t xml:space="preserve">than </w:t>
       </w:r>
       <w:r>
         <w:rPr>
+          <w:highlight w:val="lightGray"/>
           <w:lang w:val="en-US"/>
         </w:rPr>
         <w:t>0.151 [IQR: 0.013 - 0.892]</w:t>
@@ -15640,13 +15952,15 @@
       <w:r>
         <w:rPr>
           <w:rFonts w:hint="eastAsia"/>
-          <w:lang w:val="en-US"/>
-        </w:rPr>
-        <w:t xml:space="preserve"> </w:t>
-      </w:r>
-      <w:r>
-        <w:rPr>
-          <w:rFonts w:hint="eastAsia"/>
+          <w:highlight w:val="lightGray"/>
+          <w:lang w:val="en-US"/>
+        </w:rPr>
+        <w:t xml:space="preserve"> </w:t>
+      </w:r>
+      <w:r>
+        <w:rPr>
+          <w:rFonts w:hint="eastAsia"/>
+          <w:highlight w:val="lightGray"/>
           <w:lang w:val="en-US"/>
         </w:rPr>
         <w:t>per 1,000 OCVs</w:t>
@@ -15654,6 +15968,7 @@
       <w:r>
         <w:rPr>
           <w:rFonts w:hint="eastAsia"/>
+          <w:highlight w:val="lightGray"/>
           <w:lang w:val="en-US"/>
         </w:rPr>
         <w:t xml:space="preserve"> when</w:t>
@@ -15661,6 +15976,7 @@
       <w:r>
         <w:rPr>
           <w:rFonts w:hint="eastAsia"/>
+          <w:highlight w:val="lightGray"/>
           <w:lang w:val="en-US"/>
         </w:rPr>
         <w:t xml:space="preserve"> the estimate was </w:t>
@@ -15668,6 +15984,7 @@
       <w:r>
         <w:rPr>
           <w:rFonts w:hint="eastAsia"/>
+          <w:highlight w:val="lightGray"/>
           <w:lang w:val="en-US"/>
         </w:rPr>
         <w:t>e</w:t>
@@ -15675,6 +15992,7 @@
       <w:r>
         <w:rPr>
           <w:rFonts w:hint="eastAsia"/>
+          <w:highlight w:val="lightGray"/>
           <w:lang w:val="en-US"/>
         </w:rPr>
         <w:t xml:space="preserve">valuated at the individual outbreak level. </w:t>
@@ -15682,32 +16000,40 @@
       <w:r>
         <w:rPr>
           <w:rFonts w:hint="eastAsia"/>
+          <w:highlight w:val="lightGray"/>
         </w:rPr>
         <w:t>T</w:t>
       </w:r>
       <w:r>
         <w:rPr>
           <w:rFonts w:hint="eastAsia"/>
+          <w:highlight w:val="lightGray"/>
         </w:rPr>
         <w:t>he c</w:t>
       </w:r>
       <w:r>
         <w:rPr>
           <w:rFonts w:hint="eastAsia"/>
+          <w:highlight w:val="lightGray"/>
         </w:rPr>
         <w:t xml:space="preserve">ost per case averted were </w:t>
       </w:r>
       <w:r>
+        <w:rPr>
+          <w:highlight w:val="lightGray"/>
+        </w:rPr>
         <w:t>US$</w:t>
       </w:r>
       <w:r>
         <w:rPr>
           <w:rFonts w:hint="eastAsia"/>
-        </w:rPr>
-        <w:t xml:space="preserve"> </w:t>
-      </w:r>
-      <w:r>
-        <w:rPr>
+          <w:highlight w:val="lightGray"/>
+        </w:rPr>
+        <w:t xml:space="preserve"> </w:t>
+      </w:r>
+      <w:r>
+        <w:rPr>
+          <w:highlight w:val="lightGray"/>
           <w:lang w:val="en-US"/>
         </w:rPr>
         <w:t>9,035 [IQR: 8,142 - 9,945</w:t>
@@ -15715,6 +16041,7 @@
       <w:proofErr w:type="gramStart"/>
       <w:r>
         <w:rPr>
+          <w:highlight w:val="lightGray"/>
           <w:lang w:val="en-US"/>
         </w:rPr>
         <w:t>]</w:t>
@@ -15722,6 +16049,7 @@
       <w:r>
         <w:rPr>
           <w:rFonts w:hint="eastAsia"/>
+          <w:highlight w:val="lightGray"/>
           <w:lang w:val="en-US"/>
         </w:rPr>
         <w:t>,which</w:t>
@@ -15730,6 +16058,7 @@
       <w:r>
         <w:rPr>
           <w:rFonts w:hint="eastAsia"/>
+          <w:highlight w:val="lightGray"/>
           <w:lang w:val="en-US"/>
         </w:rPr>
         <w:t xml:space="preserve"> could be reduced to</w:t>
@@ -15737,12 +16066,14 @@
       <w:r>
         <w:rPr>
           <w:rFonts w:hint="eastAsia"/>
-          <w:lang w:val="en-US"/>
-        </w:rPr>
-        <w:t xml:space="preserve"> </w:t>
-      </w:r>
-      <w:r>
-        <w:rPr>
+          <w:highlight w:val="lightGray"/>
+          <w:lang w:val="en-US"/>
+        </w:rPr>
+        <w:t xml:space="preserve"> </w:t>
+      </w:r>
+      <w:r>
+        <w:rPr>
+          <w:highlight w:val="lightGray"/>
           <w:lang w:val="en-US"/>
         </w:rPr>
         <w:t>4,498 [IQR: 4,017 - 5,054]</w:t>
@@ -15750,6 +16081,7 @@
       <w:r>
         <w:rPr>
           <w:rFonts w:hint="eastAsia"/>
+          <w:highlight w:val="lightGray"/>
           <w:lang w:val="en-US"/>
         </w:rPr>
         <w:t xml:space="preserve"> if top quartile of outbreaks by duration are prioritized. These values again are </w:t>
@@ -15757,22 +16089,28 @@
       <w:r>
         <w:rPr>
           <w:rFonts w:hint="eastAsia"/>
+          <w:highlight w:val="lightGray"/>
           <w:lang w:val="en-US"/>
         </w:rPr>
         <w:t xml:space="preserve">much lower than </w:t>
       </w:r>
       <w:r>
+        <w:rPr>
+          <w:highlight w:val="lightGray"/>
+        </w:rPr>
         <w:lastRenderedPageBreak/>
         <w:t>US$</w:t>
       </w:r>
       <w:r>
         <w:rPr>
           <w:rFonts w:hint="eastAsia"/>
-        </w:rPr>
-        <w:t xml:space="preserve"> </w:t>
-      </w:r>
-      <w:r>
-        <w:rPr>
+          <w:highlight w:val="lightGray"/>
+        </w:rPr>
+        <w:t xml:space="preserve"> </w:t>
+      </w:r>
+      <w:r>
+        <w:rPr>
+          <w:highlight w:val="lightGray"/>
           <w:lang w:val="en-US"/>
         </w:rPr>
         <w:t>13,045 [IQR: 2,546 - 59,533]</w:t>
@@ -15780,25 +16118,29 @@
       <w:r>
         <w:rPr>
           <w:rFonts w:hint="eastAsia"/>
-          <w:lang w:val="en-US"/>
-        </w:rPr>
-        <w:t xml:space="preserve"> </w:t>
-      </w:r>
-      <w:r>
-        <w:rPr>
+          <w:highlight w:val="lightGray"/>
+          <w:lang w:val="en-US"/>
+        </w:rPr>
+        <w:t xml:space="preserve"> </w:t>
+      </w:r>
+      <w:r>
+        <w:rPr>
+          <w:highlight w:val="lightGray"/>
           <w:lang w:val="en-US"/>
         </w:rPr>
         <w:t>when evaluated for individual outbreaks</w:t>
       </w:r>
       <w:r>
         <w:rPr>
-          <w:lang w:val="en-US"/>
-        </w:rPr>
-        <w:t xml:space="preserve"> </w:t>
-      </w:r>
-      <w:r>
-        <w:rPr>
-          <w:rFonts w:hint="eastAsia"/>
+          <w:highlight w:val="lightGray"/>
+          <w:lang w:val="en-US"/>
+        </w:rPr>
+        <w:t xml:space="preserve"> </w:t>
+      </w:r>
+      <w:r>
+        <w:rPr>
+          <w:rFonts w:hint="eastAsia"/>
+          <w:highlight w:val="lightGray"/>
           <w:lang w:val="en-US"/>
         </w:rPr>
         <w:t>(</w:t>
@@ -15806,6 +16148,7 @@
       <w:r>
         <w:rPr>
           <w:rFonts w:hint="eastAsia"/>
+          <w:highlight w:val="lightGray"/>
           <w:lang w:val="en-US"/>
         </w:rPr>
         <w:t xml:space="preserve">as previously shown in </w:t>
@@ -15815,6 +16158,7 @@
           <w:b/>
           <w:bCs/>
           <w:color w:val="000000"/>
+          <w:highlight w:val="lightGray"/>
         </w:rPr>
         <w:t xml:space="preserve">Table </w:t>
       </w:r>
@@ -15824,12 +16168,14 @@
           <w:b/>
           <w:bCs/>
           <w:color w:val="000000"/>
+          <w:highlight w:val="lightGray"/>
         </w:rPr>
         <w:t>3</w:t>
       </w:r>
       <w:r>
         <w:rPr>
           <w:color w:val="000000"/>
+          <w:highlight w:val="lightGray"/>
         </w:rPr>
         <w:t>).</w:t>
       </w:r>
@@ -15837,21 +16183,27 @@
         <w:rPr>
           <w:rFonts w:hint="eastAsia"/>
           <w:color w:val="000000"/>
+          <w:highlight w:val="lightGray"/>
         </w:rPr>
         <w:t xml:space="preserve"> Similarly, the cost per DALY averted was </w:t>
       </w:r>
       <w:r>
+        <w:rPr>
+          <w:highlight w:val="lightGray"/>
+        </w:rPr>
         <w:t>US$</w:t>
       </w:r>
       <w:r>
         <w:rPr>
           <w:rFonts w:hint="eastAsia"/>
+          <w:highlight w:val="lightGray"/>
         </w:rPr>
         <w:t xml:space="preserve"> </w:t>
       </w:r>
       <w:r>
         <w:rPr>
           <w:color w:val="000000"/>
+          <w:highlight w:val="lightGray"/>
           <w:lang w:val="en-US"/>
         </w:rPr>
         <w:t>27,307 [IQR: 23,727 - 31,423]</w:t>
@@ -15860,6 +16212,7 @@
         <w:rPr>
           <w:rFonts w:hint="eastAsia"/>
           <w:color w:val="000000"/>
+          <w:highlight w:val="lightGray"/>
           <w:lang w:val="en-US"/>
         </w:rPr>
         <w:t xml:space="preserve">, </w:t>
@@ -15868,22 +16221,28 @@
         <w:rPr>
           <w:rFonts w:hint="eastAsia"/>
           <w:color w:val="000000"/>
+          <w:highlight w:val="lightGray"/>
           <w:lang w:val="en-US"/>
         </w:rPr>
         <w:t xml:space="preserve">which could decrease to </w:t>
       </w:r>
       <w:r>
+        <w:rPr>
+          <w:highlight w:val="lightGray"/>
+        </w:rPr>
         <w:t>US$</w:t>
       </w:r>
       <w:r>
         <w:rPr>
           <w:rFonts w:hint="eastAsia"/>
+          <w:highlight w:val="lightGray"/>
         </w:rPr>
         <w:t xml:space="preserve"> </w:t>
       </w:r>
       <w:r>
         <w:rPr>
           <w:color w:val="000000"/>
+          <w:highlight w:val="lightGray"/>
           <w:lang w:val="en-US"/>
         </w:rPr>
         <w:t>10,695 [IQR: 9,807 - 11,761]</w:t>
@@ -15892,6 +16251,7 @@
         <w:rPr>
           <w:rFonts w:hint="eastAsia"/>
           <w:color w:val="000000"/>
+          <w:highlight w:val="lightGray"/>
           <w:lang w:val="en-US"/>
         </w:rPr>
         <w:t xml:space="preserve"> when ORIs were prioritized to the top quartile of outbreak by duration. The median values are again</w:t>
@@ -15900,28 +16260,35 @@
         <w:rPr>
           <w:rFonts w:hint="eastAsia"/>
           <w:color w:val="000000"/>
+          <w:highlight w:val="lightGray"/>
           <w:lang w:val="en-US"/>
         </w:rPr>
         <w:t xml:space="preserve"> much lower than </w:t>
       </w:r>
       <w:r>
+        <w:rPr>
+          <w:highlight w:val="lightGray"/>
+        </w:rPr>
         <w:t>US$</w:t>
       </w:r>
       <w:r>
         <w:rPr>
           <w:rFonts w:hint="eastAsia"/>
+          <w:highlight w:val="lightGray"/>
         </w:rPr>
         <w:t xml:space="preserve"> </w:t>
       </w:r>
       <w:r>
         <w:rPr>
           <w:color w:val="000000"/>
+          <w:highlight w:val="lightGray"/>
           <w:lang w:val="en-US"/>
         </w:rPr>
         <w:t>1,744,390 [IQR: 11,650 - 40,068,121]</w:t>
       </w:r>
       <w:r>
         <w:rPr>
+          <w:highlight w:val="lightGray"/>
           <w:lang w:val="en-US"/>
         </w:rPr>
         <w:t xml:space="preserve"> when evaluated for individual outbreaks</w:t>
@@ -15929,6 +16296,7 @@
       <w:r>
         <w:rPr>
           <w:rFonts w:hint="eastAsia"/>
+          <w:highlight w:val="lightGray"/>
           <w:lang w:val="en-US"/>
         </w:rPr>
         <w:t xml:space="preserve"> (</w:t>
@@ -15936,6 +16304,7 @@
       <w:r>
         <w:rPr>
           <w:rFonts w:hint="eastAsia"/>
+          <w:highlight w:val="lightGray"/>
           <w:lang w:val="en-US"/>
         </w:rPr>
         <w:t xml:space="preserve">as </w:t>
@@ -15943,6 +16312,7 @@
       <w:r>
         <w:rPr>
           <w:rFonts w:hint="eastAsia"/>
+          <w:highlight w:val="lightGray"/>
           <w:lang w:val="en-US"/>
         </w:rPr>
         <w:t xml:space="preserve">previously shown in </w:t>
@@ -15953,6 +16323,7 @@
           <w:b/>
           <w:bCs/>
           <w:color w:val="000000"/>
+          <w:highlight w:val="lightGray"/>
         </w:rPr>
         <w:t>Ta</w:t>
       </w:r>
@@ -15961,6 +16332,7 @@
           <w:b/>
           <w:bCs/>
           <w:color w:val="000000"/>
+          <w:highlight w:val="lightGray"/>
         </w:rPr>
         <w:t xml:space="preserve">ble </w:t>
       </w:r>
@@ -15970,12 +16342,14 @@
           <w:b/>
           <w:bCs/>
           <w:color w:val="000000"/>
+          <w:highlight w:val="lightGray"/>
         </w:rPr>
         <w:t>3</w:t>
       </w:r>
       <w:r>
         <w:rPr>
           <w:color w:val="000000"/>
+          <w:highlight w:val="lightGray"/>
         </w:rPr>
         <w:t>).</w:t>
       </w:r>
@@ -23273,6 +23647,33 @@
 </file>
 
 <file path=customXml/item1.xml><?xml version="1.0" encoding="utf-8"?>
+<b:Sources xmlns:b="http://schemas.openxmlformats.org/officeDocument/2006/bibliography" xmlns="http://schemas.openxmlformats.org/officeDocument/2006/bibliography" SelectedStyle="\APASixthEditionOfficeOnline.xsl" StyleName="APA" Version="6"/>
+</file>
+
+<file path=customXml/item2.xml><?xml version="1.0" encoding="utf-8"?>
+<?mso-contentType ?>
+<FormTemplates xmlns="http://schemas.microsoft.com/sharepoint/v3/contenttype/forms">
+  <Display>DocumentLibraryForm</Display>
+  <Edit>DocumentLibraryForm</Edit>
+  <New>DocumentLibraryForm</New>
+</FormTemplates>
+</file>
+
+<file path=customXml/item3.xml><?xml version="1.0" encoding="utf-8"?>
+<p:properties xmlns:p="http://schemas.microsoft.com/office/2006/metadata/properties" xmlns:xsi="http://www.w3.org/2001/XMLSchema-instance" xmlns:pc="http://schemas.microsoft.com/office/infopath/2007/PartnerControls">
+  <documentManagement>
+    <_activity xmlns="00f5eb7a-3f09-4ccb-9a17-2c4fa8202c3e" xsi:nil="true"/>
+  </documentManagement>
+</p:properties>
+</file>
+
+<file path=customXml/item4.xml><?xml version="1.0" encoding="utf-8"?>
+<go:gDocsCustomXmlDataStorage xmlns:go="http://customooxmlschemas.google.com/" xmlns:r="http://schemas.openxmlformats.org/officeDocument/2006/relationships" uri="GoogleDocsCustomDataVersion2">
+  <go:docsCustomData xmlns:go="http://customooxmlschemas.google.com/" roundtripDataSignature="AMtx7mgdndu53wYGt6HnkXDpKDmMCu/43A==">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</go:docsCustomData>
+</go:gDocsCustomXmlDataStorage>
+</file>
+
+<file path=customXml/item5.xml><?xml version="1.0" encoding="utf-8"?>
 <ct:contentTypeSchema xmlns:ct="http://schemas.microsoft.com/office/2006/metadata/contentType" xmlns:ma="http://schemas.microsoft.com/office/2006/metadata/properties/metaAttributes" ct:_="" ma:_="" ma:contentTypeName="Document" ma:contentTypeID="0x010100A2E3680EE573554D94035A4421814AE7" ma:contentTypeVersion="17" ma:contentTypeDescription="Create a new document." ma:contentTypeScope="" ma:versionID="677f1e42a8347fa1a33a1e5bd082a6f0">
   <xsd:schema xmlns:xsd="http://www.w3.org/2001/XMLSchema" xmlns:xs="http://www.w3.org/2001/XMLSchema" xmlns:p="http://schemas.microsoft.com/office/2006/metadata/properties" xmlns:ns3="00f5eb7a-3f09-4ccb-9a17-2c4fa8202c3e" xmlns:ns4="534d57da-ff16-4cef-a6f3-6603b923fb9d" targetNamespace="http://schemas.microsoft.com/office/2006/metadata/properties" ma:root="true" ma:fieldsID="3152a6d693dc4f03211544ef130251e4" ns3:_="" ns4:_="">
     <xsd:import namespace="00f5eb7a-3f09-4ccb-9a17-2c4fa8202c3e"/>
@@ -23519,34 +23920,42 @@
 </ct:contentTypeSchema>
 </file>
 
-<file path=customXml/item2.xml><?xml version="1.0" encoding="utf-8"?>
-<go:gDocsCustomXmlDataStorage xmlns:go="http://customooxmlschemas.google.com/" xmlns:r="http://schemas.openxmlformats.org/officeDocument/2006/relationships" uri="GoogleDocsCustomDataVersion2">
-  <go:docsCustomData xmlns:go="http://customooxmlschemas.google.com/" roundtripDataSignature="AMtx7mgdndu53wYGt6HnkXDpKDmMCu/43A==">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</go:docsCustomData>
-</go:gDocsCustomXmlDataStorage>
+<file path=customXml/itemProps1.xml><?xml version="1.0" encoding="utf-8"?>
+<ds:datastoreItem xmlns:ds="http://schemas.openxmlformats.org/officeDocument/2006/customXml" ds:itemID="{DF6F51F4-5859-44B7-B20A-7EB4E4161878}">
+  <ds:schemaRefs>
+    <ds:schemaRef ds:uri="http://schemas.openxmlformats.org/officeDocument/2006/bibliography"/>
+  </ds:schemaRefs>
+</ds:datastoreItem>
 </file>
 
-<file path=customXml/item3.xml><?xml version="1.0" encoding="utf-8"?>
-<p:properties xmlns:p="http://schemas.microsoft.com/office/2006/metadata/properties" xmlns:xsi="http://www.w3.org/2001/XMLSchema-instance" xmlns:pc="http://schemas.microsoft.com/office/infopath/2007/PartnerControls">
-  <documentManagement>
-    <_activity xmlns="00f5eb7a-3f09-4ccb-9a17-2c4fa8202c3e" xsi:nil="true"/>
-  </documentManagement>
-</p:properties>
+<file path=customXml/itemProps2.xml><?xml version="1.0" encoding="utf-8"?>
+<ds:datastoreItem xmlns:ds="http://schemas.openxmlformats.org/officeDocument/2006/customXml" ds:itemID="{337A23CE-E10A-4043-BC60-ADD821B08A35}">
+  <ds:schemaRefs>
+    <ds:schemaRef ds:uri="http://schemas.microsoft.com/sharepoint/v3/contenttype/forms"/>
+  </ds:schemaRefs>
+</ds:datastoreItem>
 </file>
 
-<file path=customXml/item4.xml><?xml version="1.0" encoding="utf-8"?>
-<?mso-contentType ?>
-<FormTemplates xmlns="http://schemas.microsoft.com/sharepoint/v3/contenttype/forms">
-  <Display>DocumentLibraryForm</Display>
-  <Edit>DocumentLibraryForm</Edit>
-  <New>DocumentLibraryForm</New>
-</FormTemplates>
+<file path=customXml/itemProps3.xml><?xml version="1.0" encoding="utf-8"?>
+<ds:datastoreItem xmlns:ds="http://schemas.openxmlformats.org/officeDocument/2006/customXml" ds:itemID="{9C00E788-F0BC-46FB-A07D-C58627BA0AFE}">
+  <ds:schemaRefs>
+    <ds:schemaRef ds:uri="http://schemas.microsoft.com/office/2006/metadata/properties"/>
+    <ds:schemaRef ds:uri="http://schemas.microsoft.com/office/infopath/2007/PartnerControls"/>
+    <ds:schemaRef ds:uri="00f5eb7a-3f09-4ccb-9a17-2c4fa8202c3e"/>
+  </ds:schemaRefs>
+</ds:datastoreItem>
 </file>
 
-<file path=customXml/item5.xml><?xml version="1.0" encoding="utf-8"?>
-<b:Sources xmlns:b="http://schemas.openxmlformats.org/officeDocument/2006/bibliography" xmlns="http://schemas.openxmlformats.org/officeDocument/2006/bibliography" SelectedStyle="\APASixthEditionOfficeOnline.xsl" StyleName="APA" Version="6"/>
+<file path=customXml/itemProps4.xml><?xml version="1.0" encoding="utf-8"?>
+<ds:datastoreItem xmlns:ds="http://schemas.openxmlformats.org/officeDocument/2006/customXml" ds:itemID="{11111111-1234-1234-1234-123412341234}">
+  <ds:schemaRefs>
+    <ds:schemaRef ds:uri="http://customooxmlschemas.google.com/"/>
+    <ds:schemaRef ds:uri="http://schemas.openxmlformats.org/officeDocument/2006/relationships"/>
+  </ds:schemaRefs>
+</ds:datastoreItem>
 </file>
 
-<file path=customXml/itemProps1.xml><?xml version="1.0" encoding="utf-8"?>
+<file path=customXml/itemProps5.xml><?xml version="1.0" encoding="utf-8"?>
 <ds:datastoreItem xmlns:ds="http://schemas.openxmlformats.org/officeDocument/2006/customXml" ds:itemID="{84C8490E-D3BA-4C03-B8F3-1DA315608BFD}">
   <ds:schemaRefs>
     <ds:schemaRef ds:uri="http://schemas.microsoft.com/office/2006/metadata/contentType"/>
@@ -23563,39 +23972,4 @@
     <ds:schemaRef ds:uri="http://schemas.microsoft.com/internal/obd"/>
   </ds:schemaRefs>
 </ds:datastoreItem>
-</file>
-
-<file path=customXml/itemProps2.xml><?xml version="1.0" encoding="utf-8"?>
-<ds:datastoreItem xmlns:ds="http://schemas.openxmlformats.org/officeDocument/2006/customXml" ds:itemID="{11111111-1234-1234-1234-123412341234}">
-  <ds:schemaRefs>
-    <ds:schemaRef ds:uri="http://customooxmlschemas.google.com/"/>
-    <ds:schemaRef ds:uri="http://schemas.openxmlformats.org/officeDocument/2006/relationships"/>
-  </ds:schemaRefs>
-</ds:datastoreItem>
-</file>
-
-<file path=customXml/itemProps3.xml><?xml version="1.0" encoding="utf-8"?>
-<ds:datastoreItem xmlns:ds="http://schemas.openxmlformats.org/officeDocument/2006/customXml" ds:itemID="{9C00E788-F0BC-46FB-A07D-C58627BA0AFE}">
-  <ds:schemaRefs>
-    <ds:schemaRef ds:uri="http://schemas.microsoft.com/office/2006/metadata/properties"/>
-    <ds:schemaRef ds:uri="http://schemas.microsoft.com/office/infopath/2007/PartnerControls"/>
-    <ds:schemaRef ds:uri="00f5eb7a-3f09-4ccb-9a17-2c4fa8202c3e"/>
-  </ds:schemaRefs>
-</ds:datastoreItem>
-</file>
-
-<file path=customXml/itemProps4.xml><?xml version="1.0" encoding="utf-8"?>
-<ds:datastoreItem xmlns:ds="http://schemas.openxmlformats.org/officeDocument/2006/customXml" ds:itemID="{337A23CE-E10A-4043-BC60-ADD821B08A35}">
-  <ds:schemaRefs>
-    <ds:schemaRef ds:uri="http://schemas.microsoft.com/sharepoint/v3/contenttype/forms"/>
-  </ds:schemaRefs>
-</ds:datastoreItem>
-</file>
-
-<file path=customXml/itemProps5.xml><?xml version="1.0" encoding="utf-8"?>
-<ds:datastoreItem xmlns:ds="http://schemas.openxmlformats.org/officeDocument/2006/customXml" ds:itemID="{DF6F51F4-5859-44B7-B20A-7EB4E4161878}">
-  <ds:schemaRefs>
-    <ds:schemaRef ds:uri="http://schemas.openxmlformats.org/officeDocument/2006/bibliography"/>
-  </ds:schemaRefs>
-</ds:datastoreItem>
 </file>
</xml_diff>